<commit_message>
docs: generar_datos.py pasa a ser un paso recomendado de la instalación
Con el dump y los usuarios de prueba solo hay 5 empleados y 3 partes, así
que el cuadro de mando aparece casi vacío. README y memoria (apartado 6.4)
lo marcan como recomendado y explican el motivo.

Co-Authored-By: Claude Opus 5.5 <noreply@anthropic.com>
</commit_message>
<xml_diff>
--- a/entrega/Memoria_Proyecto_Dashboard_RRHH_Ramon_Marquez.docx
+++ b/entrega/Memoria_Proyecto_Dashboard_RRHH_Ramon_Marquez.docx
@@ -795,7 +795,7 @@
       <w:r>
         <w:fldChar w:fldCharType="separate"/>
       </w:r>
-      <w:hyperlink w:anchor="_Toc242051314" w:history="1">
+      <w:hyperlink w:anchor="_Toc242210632" w:history="1">
         <w:r>
           <w:rPr>
             <w:rStyle w:val="Hipervnculo"/>
@@ -822,7 +822,7 @@
             <w:noProof/>
             <w:webHidden/>
           </w:rPr>
-          <w:instrText xml:space="preserve"> PAGEREF _Toc242051314 \h </w:instrText>
+          <w:instrText xml:space="preserve"> PAGEREF _Toc242210632 \h </w:instrText>
         </w:r>
         <w:r>
           <w:rPr>
@@ -869,7 +869,7 @@
           <w14:ligatures w14:val="standardContextual"/>
         </w:rPr>
       </w:pPr>
-      <w:hyperlink w:anchor="_Toc242051315" w:history="1">
+      <w:hyperlink w:anchor="_Toc242210633" w:history="1">
         <w:r>
           <w:rPr>
             <w:rStyle w:val="Hipervnculo"/>
@@ -896,7 +896,7 @@
             <w:noProof/>
             <w:webHidden/>
           </w:rPr>
-          <w:instrText xml:space="preserve"> PAGEREF _Toc242051315 \h </w:instrText>
+          <w:instrText xml:space="preserve"> PAGEREF _Toc242210633 \h </w:instrText>
         </w:r>
         <w:r>
           <w:rPr>
@@ -943,7 +943,7 @@
           <w14:ligatures w14:val="standardContextual"/>
         </w:rPr>
       </w:pPr>
-      <w:hyperlink w:anchor="_Toc242051316" w:history="1">
+      <w:hyperlink w:anchor="_Toc242210634" w:history="1">
         <w:r>
           <w:rPr>
             <w:rStyle w:val="Hipervnculo"/>
@@ -970,7 +970,7 @@
             <w:noProof/>
             <w:webHidden/>
           </w:rPr>
-          <w:instrText xml:space="preserve"> PAGEREF _Toc242051316 \h </w:instrText>
+          <w:instrText xml:space="preserve"> PAGEREF _Toc242210634 \h </w:instrText>
         </w:r>
         <w:r>
           <w:rPr>
@@ -1017,7 +1017,7 @@
           <w14:ligatures w14:val="standardContextual"/>
         </w:rPr>
       </w:pPr>
-      <w:hyperlink w:anchor="_Toc242051317" w:history="1">
+      <w:hyperlink w:anchor="_Toc242210635" w:history="1">
         <w:r>
           <w:rPr>
             <w:rStyle w:val="Hipervnculo"/>
@@ -1044,7 +1044,7 @@
             <w:noProof/>
             <w:webHidden/>
           </w:rPr>
-          <w:instrText xml:space="preserve"> PAGEREF _Toc242051317 \h </w:instrText>
+          <w:instrText xml:space="preserve"> PAGEREF _Toc242210635 \h </w:instrText>
         </w:r>
         <w:r>
           <w:rPr>
@@ -1091,7 +1091,7 @@
           <w14:ligatures w14:val="standardContextual"/>
         </w:rPr>
       </w:pPr>
-      <w:hyperlink w:anchor="_Toc242051318" w:history="1">
+      <w:hyperlink w:anchor="_Toc242210636" w:history="1">
         <w:r>
           <w:rPr>
             <w:rStyle w:val="Hipervnculo"/>
@@ -1118,7 +1118,7 @@
             <w:noProof/>
             <w:webHidden/>
           </w:rPr>
-          <w:instrText xml:space="preserve"> PAGEREF _Toc242051318 \h </w:instrText>
+          <w:instrText xml:space="preserve"> PAGEREF _Toc242210636 \h </w:instrText>
         </w:r>
         <w:r>
           <w:rPr>
@@ -1165,7 +1165,7 @@
           <w14:ligatures w14:val="standardContextual"/>
         </w:rPr>
       </w:pPr>
-      <w:hyperlink w:anchor="_Toc242051319" w:history="1">
+      <w:hyperlink w:anchor="_Toc242210637" w:history="1">
         <w:r>
           <w:rPr>
             <w:rStyle w:val="Hipervnculo"/>
@@ -1192,7 +1192,7 @@
             <w:noProof/>
             <w:webHidden/>
           </w:rPr>
-          <w:instrText xml:space="preserve"> PAGEREF _Toc242051319 \h </w:instrText>
+          <w:instrText xml:space="preserve"> PAGEREF _Toc242210637 \h </w:instrText>
         </w:r>
         <w:r>
           <w:rPr>
@@ -1239,7 +1239,7 @@
           <w14:ligatures w14:val="standardContextual"/>
         </w:rPr>
       </w:pPr>
-      <w:hyperlink w:anchor="_Toc242051320" w:history="1">
+      <w:hyperlink w:anchor="_Toc242210638" w:history="1">
         <w:r>
           <w:rPr>
             <w:rStyle w:val="Hipervnculo"/>
@@ -1266,7 +1266,7 @@
             <w:noProof/>
             <w:webHidden/>
           </w:rPr>
-          <w:instrText xml:space="preserve"> PAGEREF _Toc242051320 \h </w:instrText>
+          <w:instrText xml:space="preserve"> PAGEREF _Toc242210638 \h </w:instrText>
         </w:r>
         <w:r>
           <w:rPr>
@@ -1313,7 +1313,7 @@
           <w14:ligatures w14:val="standardContextual"/>
         </w:rPr>
       </w:pPr>
-      <w:hyperlink w:anchor="_Toc242051321" w:history="1">
+      <w:hyperlink w:anchor="_Toc242210639" w:history="1">
         <w:r>
           <w:rPr>
             <w:rStyle w:val="Hipervnculo"/>
@@ -1340,7 +1340,7 @@
             <w:noProof/>
             <w:webHidden/>
           </w:rPr>
-          <w:instrText xml:space="preserve"> PAGEREF _Toc242051321 \h </w:instrText>
+          <w:instrText xml:space="preserve"> PAGEREF _Toc242210639 \h </w:instrText>
         </w:r>
         <w:r>
           <w:rPr>
@@ -1387,7 +1387,7 @@
           <w14:ligatures w14:val="standardContextual"/>
         </w:rPr>
       </w:pPr>
-      <w:hyperlink w:anchor="_Toc242051322" w:history="1">
+      <w:hyperlink w:anchor="_Toc242210640" w:history="1">
         <w:r>
           <w:rPr>
             <w:rStyle w:val="Hipervnculo"/>
@@ -1414,7 +1414,7 @@
             <w:noProof/>
             <w:webHidden/>
           </w:rPr>
-          <w:instrText xml:space="preserve"> PAGEREF _Toc242051322 \h </w:instrText>
+          <w:instrText xml:space="preserve"> PAGEREF _Toc242210640 \h </w:instrText>
         </w:r>
         <w:r>
           <w:rPr>
@@ -1461,7 +1461,7 @@
           <w14:ligatures w14:val="standardContextual"/>
         </w:rPr>
       </w:pPr>
-      <w:hyperlink w:anchor="_Toc242051323" w:history="1">
+      <w:hyperlink w:anchor="_Toc242210641" w:history="1">
         <w:r>
           <w:rPr>
             <w:rStyle w:val="Hipervnculo"/>
@@ -1488,7 +1488,7 @@
             <w:noProof/>
             <w:webHidden/>
           </w:rPr>
-          <w:instrText xml:space="preserve"> PAGEREF _Toc242051323 \h </w:instrText>
+          <w:instrText xml:space="preserve"> PAGEREF _Toc242210641 \h </w:instrText>
         </w:r>
         <w:r>
           <w:rPr>
@@ -1535,7 +1535,7 @@
           <w14:ligatures w14:val="standardContextual"/>
         </w:rPr>
       </w:pPr>
-      <w:hyperlink w:anchor="_Toc242051324" w:history="1">
+      <w:hyperlink w:anchor="_Toc242210642" w:history="1">
         <w:r>
           <w:rPr>
             <w:rStyle w:val="Hipervnculo"/>
@@ -1562,7 +1562,7 @@
             <w:noProof/>
             <w:webHidden/>
           </w:rPr>
-          <w:instrText xml:space="preserve"> PAGEREF _Toc242051324 \h </w:instrText>
+          <w:instrText xml:space="preserve"> PAGEREF _Toc242210642 \h </w:instrText>
         </w:r>
         <w:r>
           <w:rPr>
@@ -1609,7 +1609,7 @@
           <w14:ligatures w14:val="standardContextual"/>
         </w:rPr>
       </w:pPr>
-      <w:hyperlink w:anchor="_Toc242051325" w:history="1">
+      <w:hyperlink w:anchor="_Toc242210643" w:history="1">
         <w:r>
           <w:rPr>
             <w:rStyle w:val="Hipervnculo"/>
@@ -1636,7 +1636,7 @@
             <w:noProof/>
             <w:webHidden/>
           </w:rPr>
-          <w:instrText xml:space="preserve"> PAGEREF _Toc242051325 \h </w:instrText>
+          <w:instrText xml:space="preserve"> PAGEREF _Toc242210643 \h </w:instrText>
         </w:r>
         <w:r>
           <w:rPr>
@@ -1683,7 +1683,7 @@
           <w14:ligatures w14:val="standardContextual"/>
         </w:rPr>
       </w:pPr>
-      <w:hyperlink w:anchor="_Toc242051326" w:history="1">
+      <w:hyperlink w:anchor="_Toc242210644" w:history="1">
         <w:r>
           <w:rPr>
             <w:rStyle w:val="Hipervnculo"/>
@@ -1710,7 +1710,7 @@
             <w:noProof/>
             <w:webHidden/>
           </w:rPr>
-          <w:instrText xml:space="preserve"> PAGEREF _Toc242051326 \h </w:instrText>
+          <w:instrText xml:space="preserve"> PAGEREF _Toc242210644 \h </w:instrText>
         </w:r>
         <w:r>
           <w:rPr>
@@ -1757,7 +1757,7 @@
           <w14:ligatures w14:val="standardContextual"/>
         </w:rPr>
       </w:pPr>
-      <w:hyperlink w:anchor="_Toc242051327" w:history="1">
+      <w:hyperlink w:anchor="_Toc242210645" w:history="1">
         <w:r>
           <w:rPr>
             <w:rStyle w:val="Hipervnculo"/>
@@ -1784,7 +1784,7 @@
             <w:noProof/>
             <w:webHidden/>
           </w:rPr>
-          <w:instrText xml:space="preserve"> PAGEREF _Toc242051327 \h </w:instrText>
+          <w:instrText xml:space="preserve"> PAGEREF _Toc242210645 \h </w:instrText>
         </w:r>
         <w:r>
           <w:rPr>
@@ -1831,7 +1831,7 @@
           <w14:ligatures w14:val="standardContextual"/>
         </w:rPr>
       </w:pPr>
-      <w:hyperlink w:anchor="_Toc242051328" w:history="1">
+      <w:hyperlink w:anchor="_Toc242210646" w:history="1">
         <w:r>
           <w:rPr>
             <w:rStyle w:val="Hipervnculo"/>
@@ -1858,7 +1858,7 @@
             <w:noProof/>
             <w:webHidden/>
           </w:rPr>
-          <w:instrText xml:space="preserve"> PAGEREF _Toc242051328 \h </w:instrText>
+          <w:instrText xml:space="preserve"> PAGEREF _Toc242210646 \h </w:instrText>
         </w:r>
         <w:r>
           <w:rPr>
@@ -1905,7 +1905,7 @@
           <w14:ligatures w14:val="standardContextual"/>
         </w:rPr>
       </w:pPr>
-      <w:hyperlink w:anchor="_Toc242051329" w:history="1">
+      <w:hyperlink w:anchor="_Toc242210647" w:history="1">
         <w:r>
           <w:rPr>
             <w:rStyle w:val="Hipervnculo"/>
@@ -1932,7 +1932,7 @@
             <w:noProof/>
             <w:webHidden/>
           </w:rPr>
-          <w:instrText xml:space="preserve"> PAGEREF _Toc242051329 \h </w:instrText>
+          <w:instrText xml:space="preserve"> PAGEREF _Toc242210647 \h </w:instrText>
         </w:r>
         <w:r>
           <w:rPr>
@@ -1979,7 +1979,7 @@
           <w14:ligatures w14:val="standardContextual"/>
         </w:rPr>
       </w:pPr>
-      <w:hyperlink w:anchor="_Toc242051330" w:history="1">
+      <w:hyperlink w:anchor="_Toc242210648" w:history="1">
         <w:r>
           <w:rPr>
             <w:rStyle w:val="Hipervnculo"/>
@@ -2006,7 +2006,7 @@
             <w:noProof/>
             <w:webHidden/>
           </w:rPr>
-          <w:instrText xml:space="preserve"> PAGEREF _Toc242051330 \h </w:instrText>
+          <w:instrText xml:space="preserve"> PAGEREF _Toc242210648 \h </w:instrText>
         </w:r>
         <w:r>
           <w:rPr>
@@ -2053,7 +2053,7 @@
           <w14:ligatures w14:val="standardContextual"/>
         </w:rPr>
       </w:pPr>
-      <w:hyperlink w:anchor="_Toc242051331" w:history="1">
+      <w:hyperlink w:anchor="_Toc242210649" w:history="1">
         <w:r>
           <w:rPr>
             <w:rStyle w:val="Hipervnculo"/>
@@ -2080,7 +2080,7 @@
             <w:noProof/>
             <w:webHidden/>
           </w:rPr>
-          <w:instrText xml:space="preserve"> PAGEREF _Toc242051331 \h </w:instrText>
+          <w:instrText xml:space="preserve"> PAGEREF _Toc242210649 \h </w:instrText>
         </w:r>
         <w:r>
           <w:rPr>
@@ -2127,7 +2127,7 @@
           <w14:ligatures w14:val="standardContextual"/>
         </w:rPr>
       </w:pPr>
-      <w:hyperlink w:anchor="_Toc242051332" w:history="1">
+      <w:hyperlink w:anchor="_Toc242210650" w:history="1">
         <w:r>
           <w:rPr>
             <w:rStyle w:val="Hipervnculo"/>
@@ -2154,7 +2154,7 @@
             <w:noProof/>
             <w:webHidden/>
           </w:rPr>
-          <w:instrText xml:space="preserve"> PAGEREF _Toc242051332 \h </w:instrText>
+          <w:instrText xml:space="preserve"> PAGEREF _Toc242210650 \h </w:instrText>
         </w:r>
         <w:r>
           <w:rPr>
@@ -2201,7 +2201,7 @@
           <w14:ligatures w14:val="standardContextual"/>
         </w:rPr>
       </w:pPr>
-      <w:hyperlink w:anchor="_Toc242051333" w:history="1">
+      <w:hyperlink w:anchor="_Toc242210651" w:history="1">
         <w:r>
           <w:rPr>
             <w:rStyle w:val="Hipervnculo"/>
@@ -2228,7 +2228,7 @@
             <w:noProof/>
             <w:webHidden/>
           </w:rPr>
-          <w:instrText xml:space="preserve"> PAGEREF _Toc242051333 \h </w:instrText>
+          <w:instrText xml:space="preserve"> PAGEREF _Toc242210651 \h </w:instrText>
         </w:r>
         <w:r>
           <w:rPr>
@@ -2275,7 +2275,7 @@
           <w14:ligatures w14:val="standardContextual"/>
         </w:rPr>
       </w:pPr>
-      <w:hyperlink w:anchor="_Toc242051334" w:history="1">
+      <w:hyperlink w:anchor="_Toc242210652" w:history="1">
         <w:r>
           <w:rPr>
             <w:rStyle w:val="Hipervnculo"/>
@@ -2302,7 +2302,7 @@
             <w:noProof/>
             <w:webHidden/>
           </w:rPr>
-          <w:instrText xml:space="preserve"> PAGEREF _Toc242051334 \h </w:instrText>
+          <w:instrText xml:space="preserve"> PAGEREF _Toc242210652 \h </w:instrText>
         </w:r>
         <w:r>
           <w:rPr>
@@ -2349,7 +2349,7 @@
           <w14:ligatures w14:val="standardContextual"/>
         </w:rPr>
       </w:pPr>
-      <w:hyperlink w:anchor="_Toc242051335" w:history="1">
+      <w:hyperlink w:anchor="_Toc242210653" w:history="1">
         <w:r>
           <w:rPr>
             <w:rStyle w:val="Hipervnculo"/>
@@ -2376,7 +2376,7 @@
             <w:noProof/>
             <w:webHidden/>
           </w:rPr>
-          <w:instrText xml:space="preserve"> PAGEREF _Toc242051335 \h </w:instrText>
+          <w:instrText xml:space="preserve"> PAGEREF _Toc242210653 \h </w:instrText>
         </w:r>
         <w:r>
           <w:rPr>
@@ -2423,7 +2423,7 @@
           <w14:ligatures w14:val="standardContextual"/>
         </w:rPr>
       </w:pPr>
-      <w:hyperlink w:anchor="_Toc242051336" w:history="1">
+      <w:hyperlink w:anchor="_Toc242210654" w:history="1">
         <w:r>
           <w:rPr>
             <w:rStyle w:val="Hipervnculo"/>
@@ -2450,7 +2450,7 @@
             <w:noProof/>
             <w:webHidden/>
           </w:rPr>
-          <w:instrText xml:space="preserve"> PAGEREF _Toc242051336 \h </w:instrText>
+          <w:instrText xml:space="preserve"> PAGEREF _Toc242210654 \h </w:instrText>
         </w:r>
         <w:r>
           <w:rPr>
@@ -2497,7 +2497,7 @@
           <w14:ligatures w14:val="standardContextual"/>
         </w:rPr>
       </w:pPr>
-      <w:hyperlink w:anchor="_Toc242051337" w:history="1">
+      <w:hyperlink w:anchor="_Toc242210655" w:history="1">
         <w:r>
           <w:rPr>
             <w:rStyle w:val="Hipervnculo"/>
@@ -2524,7 +2524,7 @@
             <w:noProof/>
             <w:webHidden/>
           </w:rPr>
-          <w:instrText xml:space="preserve"> PAGEREF _Toc242051337 \h </w:instrText>
+          <w:instrText xml:space="preserve"> PAGEREF _Toc242210655 \h </w:instrText>
         </w:r>
         <w:r>
           <w:rPr>
@@ -2571,7 +2571,7 @@
           <w14:ligatures w14:val="standardContextual"/>
         </w:rPr>
       </w:pPr>
-      <w:hyperlink w:anchor="_Toc242051338" w:history="1">
+      <w:hyperlink w:anchor="_Toc242210656" w:history="1">
         <w:r>
           <w:rPr>
             <w:rStyle w:val="Hipervnculo"/>
@@ -2598,7 +2598,7 @@
             <w:noProof/>
             <w:webHidden/>
           </w:rPr>
-          <w:instrText xml:space="preserve"> PAGEREF _Toc242051338 \h </w:instrText>
+          <w:instrText xml:space="preserve"> PAGEREF _Toc242210656 \h </w:instrText>
         </w:r>
         <w:r>
           <w:rPr>
@@ -2645,7 +2645,7 @@
           <w14:ligatures w14:val="standardContextual"/>
         </w:rPr>
       </w:pPr>
-      <w:hyperlink w:anchor="_Toc242051339" w:history="1">
+      <w:hyperlink w:anchor="_Toc242210657" w:history="1">
         <w:r>
           <w:rPr>
             <w:rStyle w:val="Hipervnculo"/>
@@ -2672,7 +2672,7 @@
             <w:noProof/>
             <w:webHidden/>
           </w:rPr>
-          <w:instrText xml:space="preserve"> PAGEREF _Toc242051339 \h </w:instrText>
+          <w:instrText xml:space="preserve"> PAGEREF _Toc242210657 \h </w:instrText>
         </w:r>
         <w:r>
           <w:rPr>
@@ -2719,7 +2719,7 @@
           <w14:ligatures w14:val="standardContextual"/>
         </w:rPr>
       </w:pPr>
-      <w:hyperlink w:anchor="_Toc242051340" w:history="1">
+      <w:hyperlink w:anchor="_Toc242210658" w:history="1">
         <w:r>
           <w:rPr>
             <w:rStyle w:val="Hipervnculo"/>
@@ -2746,7 +2746,7 @@
             <w:noProof/>
             <w:webHidden/>
           </w:rPr>
-          <w:instrText xml:space="preserve"> PAGEREF _Toc242051340 \h </w:instrText>
+          <w:instrText xml:space="preserve"> PAGEREF _Toc242210658 \h </w:instrText>
         </w:r>
         <w:r>
           <w:rPr>
@@ -2793,7 +2793,7 @@
           <w14:ligatures w14:val="standardContextual"/>
         </w:rPr>
       </w:pPr>
-      <w:hyperlink w:anchor="_Toc242051341" w:history="1">
+      <w:hyperlink w:anchor="_Toc242210659" w:history="1">
         <w:r>
           <w:rPr>
             <w:rStyle w:val="Hipervnculo"/>
@@ -2820,7 +2820,7 @@
             <w:noProof/>
             <w:webHidden/>
           </w:rPr>
-          <w:instrText xml:space="preserve"> PAGEREF _Toc242051341 \h </w:instrText>
+          <w:instrText xml:space="preserve"> PAGEREF _Toc242210659 \h </w:instrText>
         </w:r>
         <w:r>
           <w:rPr>
@@ -2867,7 +2867,7 @@
           <w14:ligatures w14:val="standardContextual"/>
         </w:rPr>
       </w:pPr>
-      <w:hyperlink w:anchor="_Toc242051342" w:history="1">
+      <w:hyperlink w:anchor="_Toc242210660" w:history="1">
         <w:r>
           <w:rPr>
             <w:rStyle w:val="Hipervnculo"/>
@@ -2894,7 +2894,7 @@
             <w:noProof/>
             <w:webHidden/>
           </w:rPr>
-          <w:instrText xml:space="preserve"> PAGEREF _Toc242051342 \h </w:instrText>
+          <w:instrText xml:space="preserve"> PAGEREF _Toc242210660 \h </w:instrText>
         </w:r>
         <w:r>
           <w:rPr>
@@ -2941,7 +2941,7 @@
           <w14:ligatures w14:val="standardContextual"/>
         </w:rPr>
       </w:pPr>
-      <w:hyperlink w:anchor="_Toc242051343" w:history="1">
+      <w:hyperlink w:anchor="_Toc242210661" w:history="1">
         <w:r>
           <w:rPr>
             <w:rStyle w:val="Hipervnculo"/>
@@ -2968,7 +2968,7 @@
             <w:noProof/>
             <w:webHidden/>
           </w:rPr>
-          <w:instrText xml:space="preserve"> PAGEREF _Toc242051343 \h </w:instrText>
+          <w:instrText xml:space="preserve"> PAGEREF _Toc242210661 \h </w:instrText>
         </w:r>
         <w:r>
           <w:rPr>
@@ -3015,7 +3015,7 @@
           <w14:ligatures w14:val="standardContextual"/>
         </w:rPr>
       </w:pPr>
-      <w:hyperlink w:anchor="_Toc242051344" w:history="1">
+      <w:hyperlink w:anchor="_Toc242210662" w:history="1">
         <w:r>
           <w:rPr>
             <w:rStyle w:val="Hipervnculo"/>
@@ -3042,7 +3042,7 @@
             <w:noProof/>
             <w:webHidden/>
           </w:rPr>
-          <w:instrText xml:space="preserve"> PAGEREF _Toc242051344 \h </w:instrText>
+          <w:instrText xml:space="preserve"> PAGEREF _Toc242210662 \h </w:instrText>
         </w:r>
         <w:r>
           <w:rPr>
@@ -3089,7 +3089,7 @@
           <w14:ligatures w14:val="standardContextual"/>
         </w:rPr>
       </w:pPr>
-      <w:hyperlink w:anchor="_Toc242051345" w:history="1">
+      <w:hyperlink w:anchor="_Toc242210663" w:history="1">
         <w:r>
           <w:rPr>
             <w:rStyle w:val="Hipervnculo"/>
@@ -3116,7 +3116,7 @@
             <w:noProof/>
             <w:webHidden/>
           </w:rPr>
-          <w:instrText xml:space="preserve"> PAGEREF _Toc242051345 \h </w:instrText>
+          <w:instrText xml:space="preserve"> PAGEREF _Toc242210663 \h </w:instrText>
         </w:r>
         <w:r>
           <w:rPr>
@@ -3163,7 +3163,7 @@
           <w14:ligatures w14:val="standardContextual"/>
         </w:rPr>
       </w:pPr>
-      <w:hyperlink w:anchor="_Toc242051346" w:history="1">
+      <w:hyperlink w:anchor="_Toc242210664" w:history="1">
         <w:r>
           <w:rPr>
             <w:rStyle w:val="Hipervnculo"/>
@@ -3190,7 +3190,7 @@
             <w:noProof/>
             <w:webHidden/>
           </w:rPr>
-          <w:instrText xml:space="preserve"> PAGEREF _Toc242051346 \h </w:instrText>
+          <w:instrText xml:space="preserve"> PAGEREF _Toc242210664 \h </w:instrText>
         </w:r>
         <w:r>
           <w:rPr>
@@ -3237,7 +3237,7 @@
           <w14:ligatures w14:val="standardContextual"/>
         </w:rPr>
       </w:pPr>
-      <w:hyperlink w:anchor="_Toc242051347" w:history="1">
+      <w:hyperlink w:anchor="_Toc242210665" w:history="1">
         <w:r>
           <w:rPr>
             <w:rStyle w:val="Hipervnculo"/>
@@ -3264,7 +3264,7 @@
             <w:noProof/>
             <w:webHidden/>
           </w:rPr>
-          <w:instrText xml:space="preserve"> PAGEREF _Toc242051347 \h </w:instrText>
+          <w:instrText xml:space="preserve"> PAGEREF _Toc242210665 \h </w:instrText>
         </w:r>
         <w:r>
           <w:rPr>
@@ -3311,7 +3311,7 @@
           <w14:ligatures w14:val="standardContextual"/>
         </w:rPr>
       </w:pPr>
-      <w:hyperlink w:anchor="_Toc242051348" w:history="1">
+      <w:hyperlink w:anchor="_Toc242210666" w:history="1">
         <w:r>
           <w:rPr>
             <w:rStyle w:val="Hipervnculo"/>
@@ -3338,7 +3338,7 @@
             <w:noProof/>
             <w:webHidden/>
           </w:rPr>
-          <w:instrText xml:space="preserve"> PAGEREF _Toc242051348 \h </w:instrText>
+          <w:instrText xml:space="preserve"> PAGEREF _Toc242210666 \h </w:instrText>
         </w:r>
         <w:r>
           <w:rPr>
@@ -3385,7 +3385,7 @@
           <w14:ligatures w14:val="standardContextual"/>
         </w:rPr>
       </w:pPr>
-      <w:hyperlink w:anchor="_Toc242051349" w:history="1">
+      <w:hyperlink w:anchor="_Toc242210667" w:history="1">
         <w:r>
           <w:rPr>
             <w:rStyle w:val="Hipervnculo"/>
@@ -3412,7 +3412,7 @@
             <w:noProof/>
             <w:webHidden/>
           </w:rPr>
-          <w:instrText xml:space="preserve"> PAGEREF _Toc242051349 \h </w:instrText>
+          <w:instrText xml:space="preserve"> PAGEREF _Toc242210667 \h </w:instrText>
         </w:r>
         <w:r>
           <w:rPr>
@@ -3459,7 +3459,7 @@
           <w14:ligatures w14:val="standardContextual"/>
         </w:rPr>
       </w:pPr>
-      <w:hyperlink w:anchor="_Toc242051350" w:history="1">
+      <w:hyperlink w:anchor="_Toc242210668" w:history="1">
         <w:r>
           <w:rPr>
             <w:rStyle w:val="Hipervnculo"/>
@@ -3486,7 +3486,7 @@
             <w:noProof/>
             <w:webHidden/>
           </w:rPr>
-          <w:instrText xml:space="preserve"> PAGEREF _Toc242051350 \h </w:instrText>
+          <w:instrText xml:space="preserve"> PAGEREF _Toc242210668 \h </w:instrText>
         </w:r>
         <w:r>
           <w:rPr>
@@ -3533,7 +3533,7 @@
           <w14:ligatures w14:val="standardContextual"/>
         </w:rPr>
       </w:pPr>
-      <w:hyperlink w:anchor="_Toc242051351" w:history="1">
+      <w:hyperlink w:anchor="_Toc242210669" w:history="1">
         <w:r>
           <w:rPr>
             <w:rStyle w:val="Hipervnculo"/>
@@ -3560,7 +3560,7 @@
             <w:noProof/>
             <w:webHidden/>
           </w:rPr>
-          <w:instrText xml:space="preserve"> PAGEREF _Toc242051351 \h </w:instrText>
+          <w:instrText xml:space="preserve"> PAGEREF _Toc242210669 \h </w:instrText>
         </w:r>
         <w:r>
           <w:rPr>
@@ -3607,7 +3607,7 @@
           <w14:ligatures w14:val="standardContextual"/>
         </w:rPr>
       </w:pPr>
-      <w:hyperlink w:anchor="_Toc242051352" w:history="1">
+      <w:hyperlink w:anchor="_Toc242210670" w:history="1">
         <w:r>
           <w:rPr>
             <w:rStyle w:val="Hipervnculo"/>
@@ -3634,7 +3634,7 @@
             <w:noProof/>
             <w:webHidden/>
           </w:rPr>
-          <w:instrText xml:space="preserve"> PAGEREF _Toc242051352 \h </w:instrText>
+          <w:instrText xml:space="preserve"> PAGEREF _Toc242210670 \h </w:instrText>
         </w:r>
         <w:r>
           <w:rPr>
@@ -3681,7 +3681,7 @@
           <w14:ligatures w14:val="standardContextual"/>
         </w:rPr>
       </w:pPr>
-      <w:hyperlink w:anchor="_Toc242051353" w:history="1">
+      <w:hyperlink w:anchor="_Toc242210671" w:history="1">
         <w:r>
           <w:rPr>
             <w:rStyle w:val="Hipervnculo"/>
@@ -3708,7 +3708,7 @@
             <w:noProof/>
             <w:webHidden/>
           </w:rPr>
-          <w:instrText xml:space="preserve"> PAGEREF _Toc242051353 \h </w:instrText>
+          <w:instrText xml:space="preserve"> PAGEREF _Toc242210671 \h </w:instrText>
         </w:r>
         <w:r>
           <w:rPr>
@@ -3755,7 +3755,7 @@
           <w14:ligatures w14:val="standardContextual"/>
         </w:rPr>
       </w:pPr>
-      <w:hyperlink w:anchor="_Toc242051354" w:history="1">
+      <w:hyperlink w:anchor="_Toc242210672" w:history="1">
         <w:r>
           <w:rPr>
             <w:rStyle w:val="Hipervnculo"/>
@@ -3782,7 +3782,7 @@
             <w:noProof/>
             <w:webHidden/>
           </w:rPr>
-          <w:instrText xml:space="preserve"> PAGEREF _Toc242051354 \h </w:instrText>
+          <w:instrText xml:space="preserve"> PAGEREF _Toc242210672 \h </w:instrText>
         </w:r>
         <w:r>
           <w:rPr>
@@ -3829,7 +3829,7 @@
           <w14:ligatures w14:val="standardContextual"/>
         </w:rPr>
       </w:pPr>
-      <w:hyperlink w:anchor="_Toc242051355" w:history="1">
+      <w:hyperlink w:anchor="_Toc242210673" w:history="1">
         <w:r>
           <w:rPr>
             <w:rStyle w:val="Hipervnculo"/>
@@ -3856,7 +3856,7 @@
             <w:noProof/>
             <w:webHidden/>
           </w:rPr>
-          <w:instrText xml:space="preserve"> PAGEREF _Toc242051355 \h </w:instrText>
+          <w:instrText xml:space="preserve"> PAGEREF _Toc242210673 \h </w:instrText>
         </w:r>
         <w:r>
           <w:rPr>
@@ -3903,7 +3903,7 @@
           <w14:ligatures w14:val="standardContextual"/>
         </w:rPr>
       </w:pPr>
-      <w:hyperlink w:anchor="_Toc242051356" w:history="1">
+      <w:hyperlink w:anchor="_Toc242210674" w:history="1">
         <w:r>
           <w:rPr>
             <w:rStyle w:val="Hipervnculo"/>
@@ -3930,7 +3930,7 @@
             <w:noProof/>
             <w:webHidden/>
           </w:rPr>
-          <w:instrText xml:space="preserve"> PAGEREF _Toc242051356 \h </w:instrText>
+          <w:instrText xml:space="preserve"> PAGEREF _Toc242210674 \h </w:instrText>
         </w:r>
         <w:r>
           <w:rPr>
@@ -3977,7 +3977,7 @@
           <w14:ligatures w14:val="standardContextual"/>
         </w:rPr>
       </w:pPr>
-      <w:hyperlink w:anchor="_Toc242051357" w:history="1">
+      <w:hyperlink w:anchor="_Toc242210675" w:history="1">
         <w:r>
           <w:rPr>
             <w:rStyle w:val="Hipervnculo"/>
@@ -4004,7 +4004,7 @@
             <w:noProof/>
             <w:webHidden/>
           </w:rPr>
-          <w:instrText xml:space="preserve"> PAGEREF _Toc242051357 \h </w:instrText>
+          <w:instrText xml:space="preserve"> PAGEREF _Toc242210675 \h </w:instrText>
         </w:r>
         <w:r>
           <w:rPr>
@@ -4051,7 +4051,7 @@
           <w14:ligatures w14:val="standardContextual"/>
         </w:rPr>
       </w:pPr>
-      <w:hyperlink w:anchor="_Toc242051358" w:history="1">
+      <w:hyperlink w:anchor="_Toc242210676" w:history="1">
         <w:r>
           <w:rPr>
             <w:rStyle w:val="Hipervnculo"/>
@@ -4078,7 +4078,7 @@
             <w:noProof/>
             <w:webHidden/>
           </w:rPr>
-          <w:instrText xml:space="preserve"> PAGEREF _Toc242051358 \h </w:instrText>
+          <w:instrText xml:space="preserve"> PAGEREF _Toc242210676 \h </w:instrText>
         </w:r>
         <w:r>
           <w:rPr>
@@ -4125,7 +4125,7 @@
           <w14:ligatures w14:val="standardContextual"/>
         </w:rPr>
       </w:pPr>
-      <w:hyperlink w:anchor="_Toc242051359" w:history="1">
+      <w:hyperlink w:anchor="_Toc242210677" w:history="1">
         <w:r>
           <w:rPr>
             <w:rStyle w:val="Hipervnculo"/>
@@ -4152,7 +4152,7 @@
             <w:noProof/>
             <w:webHidden/>
           </w:rPr>
-          <w:instrText xml:space="preserve"> PAGEREF _Toc242051359 \h </w:instrText>
+          <w:instrText xml:space="preserve"> PAGEREF _Toc242210677 \h </w:instrText>
         </w:r>
         <w:r>
           <w:rPr>
@@ -4199,7 +4199,7 @@
           <w14:ligatures w14:val="standardContextual"/>
         </w:rPr>
       </w:pPr>
-      <w:hyperlink w:anchor="_Toc242051360" w:history="1">
+      <w:hyperlink w:anchor="_Toc242210678" w:history="1">
         <w:r>
           <w:rPr>
             <w:rStyle w:val="Hipervnculo"/>
@@ -4226,7 +4226,7 @@
             <w:noProof/>
             <w:webHidden/>
           </w:rPr>
-          <w:instrText xml:space="preserve"> PAGEREF _Toc242051360 \h </w:instrText>
+          <w:instrText xml:space="preserve"> PAGEREF _Toc242210678 \h </w:instrText>
         </w:r>
         <w:r>
           <w:rPr>
@@ -4273,7 +4273,7 @@
           <w14:ligatures w14:val="standardContextual"/>
         </w:rPr>
       </w:pPr>
-      <w:hyperlink w:anchor="_Toc242051361" w:history="1">
+      <w:hyperlink w:anchor="_Toc242210679" w:history="1">
         <w:r>
           <w:rPr>
             <w:rStyle w:val="Hipervnculo"/>
@@ -4300,7 +4300,7 @@
             <w:noProof/>
             <w:webHidden/>
           </w:rPr>
-          <w:instrText xml:space="preserve"> PAGEREF _Toc242051361 \h </w:instrText>
+          <w:instrText xml:space="preserve"> PAGEREF _Toc242210679 \h </w:instrText>
         </w:r>
         <w:r>
           <w:rPr>
@@ -4347,7 +4347,7 @@
           <w14:ligatures w14:val="standardContextual"/>
         </w:rPr>
       </w:pPr>
-      <w:hyperlink w:anchor="_Toc242051362" w:history="1">
+      <w:hyperlink w:anchor="_Toc242210680" w:history="1">
         <w:r>
           <w:rPr>
             <w:rStyle w:val="Hipervnculo"/>
@@ -4374,7 +4374,7 @@
             <w:noProof/>
             <w:webHidden/>
           </w:rPr>
-          <w:instrText xml:space="preserve"> PAGEREF _Toc242051362 \h </w:instrText>
+          <w:instrText xml:space="preserve"> PAGEREF _Toc242210680 \h </w:instrText>
         </w:r>
         <w:r>
           <w:rPr>
@@ -4421,7 +4421,7 @@
           <w14:ligatures w14:val="standardContextual"/>
         </w:rPr>
       </w:pPr>
-      <w:hyperlink w:anchor="_Toc242051363" w:history="1">
+      <w:hyperlink w:anchor="_Toc242210681" w:history="1">
         <w:r>
           <w:rPr>
             <w:rStyle w:val="Hipervnculo"/>
@@ -4448,7 +4448,7 @@
             <w:noProof/>
             <w:webHidden/>
           </w:rPr>
-          <w:instrText xml:space="preserve"> PAGEREF _Toc242051363 \h </w:instrText>
+          <w:instrText xml:space="preserve"> PAGEREF _Toc242210681 \h </w:instrText>
         </w:r>
         <w:r>
           <w:rPr>
@@ -4495,7 +4495,7 @@
           <w14:ligatures w14:val="standardContextual"/>
         </w:rPr>
       </w:pPr>
-      <w:hyperlink w:anchor="_Toc242051364" w:history="1">
+      <w:hyperlink w:anchor="_Toc242210682" w:history="1">
         <w:r>
           <w:rPr>
             <w:rStyle w:val="Hipervnculo"/>
@@ -4522,7 +4522,7 @@
             <w:noProof/>
             <w:webHidden/>
           </w:rPr>
-          <w:instrText xml:space="preserve"> PAGEREF _Toc242051364 \h </w:instrText>
+          <w:instrText xml:space="preserve"> PAGEREF _Toc242210682 \h </w:instrText>
         </w:r>
         <w:r>
           <w:rPr>
@@ -4569,7 +4569,7 @@
           <w14:ligatures w14:val="standardContextual"/>
         </w:rPr>
       </w:pPr>
-      <w:hyperlink w:anchor="_Toc242051365" w:history="1">
+      <w:hyperlink w:anchor="_Toc242210683" w:history="1">
         <w:r>
           <w:rPr>
             <w:rStyle w:val="Hipervnculo"/>
@@ -4596,7 +4596,7 @@
             <w:noProof/>
             <w:webHidden/>
           </w:rPr>
-          <w:instrText xml:space="preserve"> PAGEREF _Toc242051365 \h </w:instrText>
+          <w:instrText xml:space="preserve"> PAGEREF _Toc242210683 \h </w:instrText>
         </w:r>
         <w:r>
           <w:rPr>
@@ -4643,7 +4643,7 @@
           <w14:ligatures w14:val="standardContextual"/>
         </w:rPr>
       </w:pPr>
-      <w:hyperlink w:anchor="_Toc242051366" w:history="1">
+      <w:hyperlink w:anchor="_Toc242210684" w:history="1">
         <w:r>
           <w:rPr>
             <w:rStyle w:val="Hipervnculo"/>
@@ -4670,7 +4670,7 @@
             <w:noProof/>
             <w:webHidden/>
           </w:rPr>
-          <w:instrText xml:space="preserve"> PAGEREF _Toc242051366 \h </w:instrText>
+          <w:instrText xml:space="preserve"> PAGEREF _Toc242210684 \h </w:instrText>
         </w:r>
         <w:r>
           <w:rPr>
@@ -4717,7 +4717,7 @@
           <w14:ligatures w14:val="standardContextual"/>
         </w:rPr>
       </w:pPr>
-      <w:hyperlink w:anchor="_Toc242051367" w:history="1">
+      <w:hyperlink w:anchor="_Toc242210685" w:history="1">
         <w:r>
           <w:rPr>
             <w:rStyle w:val="Hipervnculo"/>
@@ -4744,7 +4744,7 @@
             <w:noProof/>
             <w:webHidden/>
           </w:rPr>
-          <w:instrText xml:space="preserve"> PAGEREF _Toc242051367 \h </w:instrText>
+          <w:instrText xml:space="preserve"> PAGEREF _Toc242210685 \h </w:instrText>
         </w:r>
         <w:r>
           <w:rPr>
@@ -4764,7 +4764,7 @@
             <w:noProof/>
             <w:webHidden/>
           </w:rPr>
-          <w:t>45</w:t>
+          <w:t>46</w:t>
         </w:r>
         <w:r>
           <w:rPr>
@@ -4791,7 +4791,7 @@
           <w14:ligatures w14:val="standardContextual"/>
         </w:rPr>
       </w:pPr>
-      <w:hyperlink w:anchor="_Toc242051368" w:history="1">
+      <w:hyperlink w:anchor="_Toc242210686" w:history="1">
         <w:r>
           <w:rPr>
             <w:rStyle w:val="Hipervnculo"/>
@@ -4818,7 +4818,7 @@
             <w:noProof/>
             <w:webHidden/>
           </w:rPr>
-          <w:instrText xml:space="preserve"> PAGEREF _Toc242051368 \h </w:instrText>
+          <w:instrText xml:space="preserve"> PAGEREF _Toc242210686 \h </w:instrText>
         </w:r>
         <w:r>
           <w:rPr>
@@ -4865,7 +4865,7 @@
           <w14:ligatures w14:val="standardContextual"/>
         </w:rPr>
       </w:pPr>
-      <w:hyperlink w:anchor="_Toc242051369" w:history="1">
+      <w:hyperlink w:anchor="_Toc242210687" w:history="1">
         <w:r>
           <w:rPr>
             <w:rStyle w:val="Hipervnculo"/>
@@ -4892,7 +4892,7 @@
             <w:noProof/>
             <w:webHidden/>
           </w:rPr>
-          <w:instrText xml:space="preserve"> PAGEREF _Toc242051369 \h </w:instrText>
+          <w:instrText xml:space="preserve"> PAGEREF _Toc242210687 \h </w:instrText>
         </w:r>
         <w:r>
           <w:rPr>
@@ -4939,7 +4939,7 @@
           <w14:ligatures w14:val="standardContextual"/>
         </w:rPr>
       </w:pPr>
-      <w:hyperlink w:anchor="_Toc242051370" w:history="1">
+      <w:hyperlink w:anchor="_Toc242210688" w:history="1">
         <w:r>
           <w:rPr>
             <w:rStyle w:val="Hipervnculo"/>
@@ -4966,7 +4966,7 @@
             <w:noProof/>
             <w:webHidden/>
           </w:rPr>
-          <w:instrText xml:space="preserve"> PAGEREF _Toc242051370 \h </w:instrText>
+          <w:instrText xml:space="preserve"> PAGEREF _Toc242210688 \h </w:instrText>
         </w:r>
         <w:r>
           <w:rPr>
@@ -5013,7 +5013,7 @@
           <w14:ligatures w14:val="standardContextual"/>
         </w:rPr>
       </w:pPr>
-      <w:hyperlink w:anchor="_Toc242051371" w:history="1">
+      <w:hyperlink w:anchor="_Toc242210689" w:history="1">
         <w:r>
           <w:rPr>
             <w:rStyle w:val="Hipervnculo"/>
@@ -5040,7 +5040,7 @@
             <w:noProof/>
             <w:webHidden/>
           </w:rPr>
-          <w:instrText xml:space="preserve"> PAGEREF _Toc242051371 \h </w:instrText>
+          <w:instrText xml:space="preserve"> PAGEREF _Toc242210689 \h </w:instrText>
         </w:r>
         <w:r>
           <w:rPr>
@@ -5087,7 +5087,7 @@
           <w14:ligatures w14:val="standardContextual"/>
         </w:rPr>
       </w:pPr>
-      <w:hyperlink w:anchor="_Toc242051372" w:history="1">
+      <w:hyperlink w:anchor="_Toc242210690" w:history="1">
         <w:r>
           <w:rPr>
             <w:rStyle w:val="Hipervnculo"/>
@@ -5114,7 +5114,7 @@
             <w:noProof/>
             <w:webHidden/>
           </w:rPr>
-          <w:instrText xml:space="preserve"> PAGEREF _Toc242051372 \h </w:instrText>
+          <w:instrText xml:space="preserve"> PAGEREF _Toc242210690 \h </w:instrText>
         </w:r>
         <w:r>
           <w:rPr>
@@ -5161,7 +5161,7 @@
           <w14:ligatures w14:val="standardContextual"/>
         </w:rPr>
       </w:pPr>
-      <w:hyperlink w:anchor="_Toc242051373" w:history="1">
+      <w:hyperlink w:anchor="_Toc242210691" w:history="1">
         <w:r>
           <w:rPr>
             <w:rStyle w:val="Hipervnculo"/>
@@ -5188,7 +5188,7 @@
             <w:noProof/>
             <w:webHidden/>
           </w:rPr>
-          <w:instrText xml:space="preserve"> PAGEREF _Toc242051373 \h </w:instrText>
+          <w:instrText xml:space="preserve"> PAGEREF _Toc242210691 \h </w:instrText>
         </w:r>
         <w:r>
           <w:rPr>
@@ -5235,7 +5235,7 @@
           <w14:ligatures w14:val="standardContextual"/>
         </w:rPr>
       </w:pPr>
-      <w:hyperlink w:anchor="_Toc242051374" w:history="1">
+      <w:hyperlink w:anchor="_Toc242210692" w:history="1">
         <w:r>
           <w:rPr>
             <w:rStyle w:val="Hipervnculo"/>
@@ -5262,7 +5262,7 @@
             <w:noProof/>
             <w:webHidden/>
           </w:rPr>
-          <w:instrText xml:space="preserve"> PAGEREF _Toc242051374 \h </w:instrText>
+          <w:instrText xml:space="preserve"> PAGEREF _Toc242210692 \h </w:instrText>
         </w:r>
         <w:r>
           <w:rPr>
@@ -5309,7 +5309,7 @@
           <w14:ligatures w14:val="standardContextual"/>
         </w:rPr>
       </w:pPr>
-      <w:hyperlink w:anchor="_Toc242051375" w:history="1">
+      <w:hyperlink w:anchor="_Toc242210693" w:history="1">
         <w:r>
           <w:rPr>
             <w:rStyle w:val="Hipervnculo"/>
@@ -5336,7 +5336,7 @@
             <w:noProof/>
             <w:webHidden/>
           </w:rPr>
-          <w:instrText xml:space="preserve"> PAGEREF _Toc242051375 \h </w:instrText>
+          <w:instrText xml:space="preserve"> PAGEREF _Toc242210693 \h </w:instrText>
         </w:r>
         <w:r>
           <w:rPr>
@@ -5383,7 +5383,7 @@
           <w14:ligatures w14:val="standardContextual"/>
         </w:rPr>
       </w:pPr>
-      <w:hyperlink w:anchor="_Toc242051376" w:history="1">
+      <w:hyperlink w:anchor="_Toc242210694" w:history="1">
         <w:r>
           <w:rPr>
             <w:rStyle w:val="Hipervnculo"/>
@@ -5410,7 +5410,7 @@
             <w:noProof/>
             <w:webHidden/>
           </w:rPr>
-          <w:instrText xml:space="preserve"> PAGEREF _Toc242051376 \h </w:instrText>
+          <w:instrText xml:space="preserve"> PAGEREF _Toc242210694 \h </w:instrText>
         </w:r>
         <w:r>
           <w:rPr>
@@ -5457,7 +5457,7 @@
           <w14:ligatures w14:val="standardContextual"/>
         </w:rPr>
       </w:pPr>
-      <w:hyperlink w:anchor="_Toc242051377" w:history="1">
+      <w:hyperlink w:anchor="_Toc242210695" w:history="1">
         <w:r>
           <w:rPr>
             <w:rStyle w:val="Hipervnculo"/>
@@ -5484,7 +5484,7 @@
             <w:noProof/>
             <w:webHidden/>
           </w:rPr>
-          <w:instrText xml:space="preserve"> PAGEREF _Toc242051377 \h </w:instrText>
+          <w:instrText xml:space="preserve"> PAGEREF _Toc242210695 \h </w:instrText>
         </w:r>
         <w:r>
           <w:rPr>
@@ -5531,7 +5531,7 @@
           <w14:ligatures w14:val="standardContextual"/>
         </w:rPr>
       </w:pPr>
-      <w:hyperlink w:anchor="_Toc242051378" w:history="1">
+      <w:hyperlink w:anchor="_Toc242210696" w:history="1">
         <w:r>
           <w:rPr>
             <w:rStyle w:val="Hipervnculo"/>
@@ -5558,7 +5558,7 @@
             <w:noProof/>
             <w:webHidden/>
           </w:rPr>
-          <w:instrText xml:space="preserve"> PAGEREF _Toc242051378 \h </w:instrText>
+          <w:instrText xml:space="preserve"> PAGEREF _Toc242210696 \h </w:instrText>
         </w:r>
         <w:r>
           <w:rPr>
@@ -5605,7 +5605,7 @@
           <w14:ligatures w14:val="standardContextual"/>
         </w:rPr>
       </w:pPr>
-      <w:hyperlink w:anchor="_Toc242051379" w:history="1">
+      <w:hyperlink w:anchor="_Toc242210697" w:history="1">
         <w:r>
           <w:rPr>
             <w:rStyle w:val="Hipervnculo"/>
@@ -5632,7 +5632,7 @@
             <w:noProof/>
             <w:webHidden/>
           </w:rPr>
-          <w:instrText xml:space="preserve"> PAGEREF _Toc242051379 \h </w:instrText>
+          <w:instrText xml:space="preserve"> PAGEREF _Toc242210697 \h </w:instrText>
         </w:r>
         <w:r>
           <w:rPr>
@@ -5679,7 +5679,7 @@
           <w14:ligatures w14:val="standardContextual"/>
         </w:rPr>
       </w:pPr>
-      <w:hyperlink w:anchor="_Toc242051380" w:history="1">
+      <w:hyperlink w:anchor="_Toc242210698" w:history="1">
         <w:r>
           <w:rPr>
             <w:rStyle w:val="Hipervnculo"/>
@@ -5706,7 +5706,7 @@
             <w:noProof/>
             <w:webHidden/>
           </w:rPr>
-          <w:instrText xml:space="preserve"> PAGEREF _Toc242051380 \h </w:instrText>
+          <w:instrText xml:space="preserve"> PAGEREF _Toc242210698 \h </w:instrText>
         </w:r>
         <w:r>
           <w:rPr>
@@ -5753,7 +5753,7 @@
           <w14:ligatures w14:val="standardContextual"/>
         </w:rPr>
       </w:pPr>
-      <w:hyperlink w:anchor="_Toc242051381" w:history="1">
+      <w:hyperlink w:anchor="_Toc242210699" w:history="1">
         <w:r>
           <w:rPr>
             <w:rStyle w:val="Hipervnculo"/>
@@ -5780,7 +5780,7 @@
             <w:noProof/>
             <w:webHidden/>
           </w:rPr>
-          <w:instrText xml:space="preserve"> PAGEREF _Toc242051381 \h </w:instrText>
+          <w:instrText xml:space="preserve"> PAGEREF _Toc242210699 \h </w:instrText>
         </w:r>
         <w:r>
           <w:rPr>
@@ -5827,7 +5827,7 @@
           <w14:ligatures w14:val="standardContextual"/>
         </w:rPr>
       </w:pPr>
-      <w:hyperlink w:anchor="_Toc242051382" w:history="1">
+      <w:hyperlink w:anchor="_Toc242210700" w:history="1">
         <w:r>
           <w:rPr>
             <w:rStyle w:val="Hipervnculo"/>
@@ -5854,7 +5854,7 @@
             <w:noProof/>
             <w:webHidden/>
           </w:rPr>
-          <w:instrText xml:space="preserve"> PAGEREF _Toc242051382 \h </w:instrText>
+          <w:instrText xml:space="preserve"> PAGEREF _Toc242210700 \h </w:instrText>
         </w:r>
         <w:r>
           <w:rPr>
@@ -5901,7 +5901,7 @@
           <w14:ligatures w14:val="standardContextual"/>
         </w:rPr>
       </w:pPr>
-      <w:hyperlink w:anchor="_Toc242051383" w:history="1">
+      <w:hyperlink w:anchor="_Toc242210701" w:history="1">
         <w:r>
           <w:rPr>
             <w:rStyle w:val="Hipervnculo"/>
@@ -5928,7 +5928,7 @@
             <w:noProof/>
             <w:webHidden/>
           </w:rPr>
-          <w:instrText xml:space="preserve"> PAGEREF _Toc242051383 \h </w:instrText>
+          <w:instrText xml:space="preserve"> PAGEREF _Toc242210701 \h </w:instrText>
         </w:r>
         <w:r>
           <w:rPr>
@@ -5975,7 +5975,7 @@
           <w14:ligatures w14:val="standardContextual"/>
         </w:rPr>
       </w:pPr>
-      <w:hyperlink w:anchor="_Toc242051384" w:history="1">
+      <w:hyperlink w:anchor="_Toc242210702" w:history="1">
         <w:r>
           <w:rPr>
             <w:rStyle w:val="Hipervnculo"/>
@@ -6002,7 +6002,7 @@
             <w:noProof/>
             <w:webHidden/>
           </w:rPr>
-          <w:instrText xml:space="preserve"> PAGEREF _Toc242051384 \h </w:instrText>
+          <w:instrText xml:space="preserve"> PAGEREF _Toc242210702 \h </w:instrText>
         </w:r>
         <w:r>
           <w:rPr>
@@ -6070,7 +6070,7 @@
       <w:r>
         <w:fldChar w:fldCharType="separate"/>
       </w:r>
-      <w:hyperlink w:anchor="_Toc242051207" w:history="1">
+      <w:hyperlink w:anchor="_Toc242210525" w:history="1">
         <w:r>
           <w:rPr>
             <w:rStyle w:val="Hipervnculo"/>
@@ -6097,7 +6097,7 @@
             <w:noProof/>
             <w:webHidden/>
           </w:rPr>
-          <w:instrText xml:space="preserve"> PAGEREF _Toc242051207 \h </w:instrText>
+          <w:instrText xml:space="preserve"> PAGEREF _Toc242210525 \h </w:instrText>
         </w:r>
         <w:r>
           <w:rPr>
@@ -6138,7 +6138,7 @@
           <w:noProof/>
         </w:rPr>
       </w:pPr>
-      <w:hyperlink w:anchor="_Toc242051208" w:history="1">
+      <w:hyperlink w:anchor="_Toc242210526" w:history="1">
         <w:r>
           <w:rPr>
             <w:rStyle w:val="Hipervnculo"/>
@@ -6165,7 +6165,7 @@
             <w:noProof/>
             <w:webHidden/>
           </w:rPr>
-          <w:instrText xml:space="preserve"> PAGEREF _Toc242051208 \h </w:instrText>
+          <w:instrText xml:space="preserve"> PAGEREF _Toc242210526 \h </w:instrText>
         </w:r>
         <w:r>
           <w:rPr>
@@ -6206,7 +6206,7 @@
           <w:noProof/>
         </w:rPr>
       </w:pPr>
-      <w:hyperlink w:anchor="_Toc242051209" w:history="1">
+      <w:hyperlink w:anchor="_Toc242210527" w:history="1">
         <w:r>
           <w:rPr>
             <w:rStyle w:val="Hipervnculo"/>
@@ -6233,7 +6233,7 @@
             <w:noProof/>
             <w:webHidden/>
           </w:rPr>
-          <w:instrText xml:space="preserve"> PAGEREF _Toc242051209 \h </w:instrText>
+          <w:instrText xml:space="preserve"> PAGEREF _Toc242210527 \h </w:instrText>
         </w:r>
         <w:r>
           <w:rPr>
@@ -6274,7 +6274,7 @@
           <w:noProof/>
         </w:rPr>
       </w:pPr>
-      <w:hyperlink w:anchor="_Toc242051210" w:history="1">
+      <w:hyperlink w:anchor="_Toc242210528" w:history="1">
         <w:r>
           <w:rPr>
             <w:rStyle w:val="Hipervnculo"/>
@@ -6301,7 +6301,7 @@
             <w:noProof/>
             <w:webHidden/>
           </w:rPr>
-          <w:instrText xml:space="preserve"> PAGEREF _Toc242051210 \h </w:instrText>
+          <w:instrText xml:space="preserve"> PAGEREF _Toc242210528 \h </w:instrText>
         </w:r>
         <w:r>
           <w:rPr>
@@ -6342,7 +6342,7 @@
           <w:noProof/>
         </w:rPr>
       </w:pPr>
-      <w:hyperlink w:anchor="_Toc242051211" w:history="1">
+      <w:hyperlink w:anchor="_Toc242210529" w:history="1">
         <w:r>
           <w:rPr>
             <w:rStyle w:val="Hipervnculo"/>
@@ -6369,7 +6369,7 @@
             <w:noProof/>
             <w:webHidden/>
           </w:rPr>
-          <w:instrText xml:space="preserve"> PAGEREF _Toc242051211 \h </w:instrText>
+          <w:instrText xml:space="preserve"> PAGEREF _Toc242210529 \h </w:instrText>
         </w:r>
         <w:r>
           <w:rPr>
@@ -6410,7 +6410,7 @@
           <w:noProof/>
         </w:rPr>
       </w:pPr>
-      <w:hyperlink w:anchor="_Toc242051212" w:history="1">
+      <w:hyperlink w:anchor="_Toc242210530" w:history="1">
         <w:r>
           <w:rPr>
             <w:rStyle w:val="Hipervnculo"/>
@@ -6437,7 +6437,7 @@
             <w:noProof/>
             <w:webHidden/>
           </w:rPr>
-          <w:instrText xml:space="preserve"> PAGEREF _Toc242051212 \h </w:instrText>
+          <w:instrText xml:space="preserve"> PAGEREF _Toc242210530 \h </w:instrText>
         </w:r>
         <w:r>
           <w:rPr>
@@ -6478,7 +6478,7 @@
           <w:noProof/>
         </w:rPr>
       </w:pPr>
-      <w:hyperlink w:anchor="_Toc242051213" w:history="1">
+      <w:hyperlink w:anchor="_Toc242210531" w:history="1">
         <w:r>
           <w:rPr>
             <w:rStyle w:val="Hipervnculo"/>
@@ -6505,7 +6505,7 @@
             <w:noProof/>
             <w:webHidden/>
           </w:rPr>
-          <w:instrText xml:space="preserve"> PAGEREF _Toc242051213 \h </w:instrText>
+          <w:instrText xml:space="preserve"> PAGEREF _Toc242210531 \h </w:instrText>
         </w:r>
         <w:r>
           <w:rPr>
@@ -6546,7 +6546,7 @@
           <w:noProof/>
         </w:rPr>
       </w:pPr>
-      <w:hyperlink w:anchor="_Toc242051214" w:history="1">
+      <w:hyperlink w:anchor="_Toc242210532" w:history="1">
         <w:r>
           <w:rPr>
             <w:rStyle w:val="Hipervnculo"/>
@@ -6573,7 +6573,7 @@
             <w:noProof/>
             <w:webHidden/>
           </w:rPr>
-          <w:instrText xml:space="preserve"> PAGEREF _Toc242051214 \h </w:instrText>
+          <w:instrText xml:space="preserve"> PAGEREF _Toc242210532 \h </w:instrText>
         </w:r>
         <w:r>
           <w:rPr>
@@ -6614,7 +6614,7 @@
           <w:noProof/>
         </w:rPr>
       </w:pPr>
-      <w:hyperlink w:anchor="_Toc242051215" w:history="1">
+      <w:hyperlink w:anchor="_Toc242210533" w:history="1">
         <w:r>
           <w:rPr>
             <w:rStyle w:val="Hipervnculo"/>
@@ -6641,7 +6641,7 @@
             <w:noProof/>
             <w:webHidden/>
           </w:rPr>
-          <w:instrText xml:space="preserve"> PAGEREF _Toc242051215 \h </w:instrText>
+          <w:instrText xml:space="preserve"> PAGEREF _Toc242210533 \h </w:instrText>
         </w:r>
         <w:r>
           <w:rPr>
@@ -6682,7 +6682,7 @@
           <w:noProof/>
         </w:rPr>
       </w:pPr>
-      <w:hyperlink w:anchor="_Toc242051216" w:history="1">
+      <w:hyperlink w:anchor="_Toc242210534" w:history="1">
         <w:r>
           <w:rPr>
             <w:rStyle w:val="Hipervnculo"/>
@@ -6709,7 +6709,7 @@
             <w:noProof/>
             <w:webHidden/>
           </w:rPr>
-          <w:instrText xml:space="preserve"> PAGEREF _Toc242051216 \h </w:instrText>
+          <w:instrText xml:space="preserve"> PAGEREF _Toc242210534 \h </w:instrText>
         </w:r>
         <w:r>
           <w:rPr>
@@ -6750,7 +6750,7 @@
           <w:noProof/>
         </w:rPr>
       </w:pPr>
-      <w:hyperlink w:anchor="_Toc242051217" w:history="1">
+      <w:hyperlink w:anchor="_Toc242210535" w:history="1">
         <w:r>
           <w:rPr>
             <w:rStyle w:val="Hipervnculo"/>
@@ -6777,7 +6777,7 @@
             <w:noProof/>
             <w:webHidden/>
           </w:rPr>
-          <w:instrText xml:space="preserve"> PAGEREF _Toc242051217 \h </w:instrText>
+          <w:instrText xml:space="preserve"> PAGEREF _Toc242210535 \h </w:instrText>
         </w:r>
         <w:r>
           <w:rPr>
@@ -6818,7 +6818,7 @@
           <w:noProof/>
         </w:rPr>
       </w:pPr>
-      <w:hyperlink w:anchor="_Toc242051218" w:history="1">
+      <w:hyperlink w:anchor="_Toc242210536" w:history="1">
         <w:r>
           <w:rPr>
             <w:rStyle w:val="Hipervnculo"/>
@@ -6845,7 +6845,7 @@
             <w:noProof/>
             <w:webHidden/>
           </w:rPr>
-          <w:instrText xml:space="preserve"> PAGEREF _Toc242051218 \h </w:instrText>
+          <w:instrText xml:space="preserve"> PAGEREF _Toc242210536 \h </w:instrText>
         </w:r>
         <w:r>
           <w:rPr>
@@ -6886,7 +6886,7 @@
           <w:noProof/>
         </w:rPr>
       </w:pPr>
-      <w:hyperlink w:anchor="_Toc242051219" w:history="1">
+      <w:hyperlink w:anchor="_Toc242210537" w:history="1">
         <w:r>
           <w:rPr>
             <w:rStyle w:val="Hipervnculo"/>
@@ -6913,7 +6913,7 @@
             <w:noProof/>
             <w:webHidden/>
           </w:rPr>
-          <w:instrText xml:space="preserve"> PAGEREF _Toc242051219 \h </w:instrText>
+          <w:instrText xml:space="preserve"> PAGEREF _Toc242210537 \h </w:instrText>
         </w:r>
         <w:r>
           <w:rPr>
@@ -6954,7 +6954,7 @@
           <w:noProof/>
         </w:rPr>
       </w:pPr>
-      <w:hyperlink w:anchor="_Toc242051220" w:history="1">
+      <w:hyperlink w:anchor="_Toc242210538" w:history="1">
         <w:r>
           <w:rPr>
             <w:rStyle w:val="Hipervnculo"/>
@@ -6981,7 +6981,7 @@
             <w:noProof/>
             <w:webHidden/>
           </w:rPr>
-          <w:instrText xml:space="preserve"> PAGEREF _Toc242051220 \h </w:instrText>
+          <w:instrText xml:space="preserve"> PAGEREF _Toc242210538 \h </w:instrText>
         </w:r>
         <w:r>
           <w:rPr>
@@ -7022,7 +7022,7 @@
           <w:noProof/>
         </w:rPr>
       </w:pPr>
-      <w:hyperlink w:anchor="_Toc242051221" w:history="1">
+      <w:hyperlink w:anchor="_Toc242210539" w:history="1">
         <w:r>
           <w:rPr>
             <w:rStyle w:val="Hipervnculo"/>
@@ -7049,7 +7049,7 @@
             <w:noProof/>
             <w:webHidden/>
           </w:rPr>
-          <w:instrText xml:space="preserve"> PAGEREF _Toc242051221 \h </w:instrText>
+          <w:instrText xml:space="preserve"> PAGEREF _Toc242210539 \h </w:instrText>
         </w:r>
         <w:r>
           <w:rPr>
@@ -7090,7 +7090,7 @@
           <w:noProof/>
         </w:rPr>
       </w:pPr>
-      <w:hyperlink w:anchor="_Toc242051222" w:history="1">
+      <w:hyperlink w:anchor="_Toc242210540" w:history="1">
         <w:r>
           <w:rPr>
             <w:rStyle w:val="Hipervnculo"/>
@@ -7117,7 +7117,7 @@
             <w:noProof/>
             <w:webHidden/>
           </w:rPr>
-          <w:instrText xml:space="preserve"> PAGEREF _Toc242051222 \h </w:instrText>
+          <w:instrText xml:space="preserve"> PAGEREF _Toc242210540 \h </w:instrText>
         </w:r>
         <w:r>
           <w:rPr>
@@ -7158,7 +7158,7 @@
           <w:noProof/>
         </w:rPr>
       </w:pPr>
-      <w:hyperlink w:anchor="_Toc242051223" w:history="1">
+      <w:hyperlink w:anchor="_Toc242210541" w:history="1">
         <w:r>
           <w:rPr>
             <w:rStyle w:val="Hipervnculo"/>
@@ -7185,7 +7185,7 @@
             <w:noProof/>
             <w:webHidden/>
           </w:rPr>
-          <w:instrText xml:space="preserve"> PAGEREF _Toc242051223 \h </w:instrText>
+          <w:instrText xml:space="preserve"> PAGEREF _Toc242210541 \h </w:instrText>
         </w:r>
         <w:r>
           <w:rPr>
@@ -7226,7 +7226,7 @@
           <w:noProof/>
         </w:rPr>
       </w:pPr>
-      <w:hyperlink w:anchor="_Toc242051224" w:history="1">
+      <w:hyperlink w:anchor="_Toc242210542" w:history="1">
         <w:r>
           <w:rPr>
             <w:rStyle w:val="Hipervnculo"/>
@@ -7253,7 +7253,7 @@
             <w:noProof/>
             <w:webHidden/>
           </w:rPr>
-          <w:instrText xml:space="preserve"> PAGEREF _Toc242051224 \h </w:instrText>
+          <w:instrText xml:space="preserve"> PAGEREF _Toc242210542 \h </w:instrText>
         </w:r>
         <w:r>
           <w:rPr>
@@ -7294,7 +7294,7 @@
           <w:noProof/>
         </w:rPr>
       </w:pPr>
-      <w:hyperlink w:anchor="_Toc242051225" w:history="1">
+      <w:hyperlink w:anchor="_Toc242210543" w:history="1">
         <w:r>
           <w:rPr>
             <w:rStyle w:val="Hipervnculo"/>
@@ -7321,7 +7321,7 @@
             <w:noProof/>
             <w:webHidden/>
           </w:rPr>
-          <w:instrText xml:space="preserve"> PAGEREF _Toc242051225 \h </w:instrText>
+          <w:instrText xml:space="preserve"> PAGEREF _Toc242210543 \h </w:instrText>
         </w:r>
         <w:r>
           <w:rPr>
@@ -7362,7 +7362,7 @@
           <w:noProof/>
         </w:rPr>
       </w:pPr>
-      <w:hyperlink w:anchor="_Toc242051226" w:history="1">
+      <w:hyperlink w:anchor="_Toc242210544" w:history="1">
         <w:r>
           <w:rPr>
             <w:rStyle w:val="Hipervnculo"/>
@@ -7389,7 +7389,7 @@
             <w:noProof/>
             <w:webHidden/>
           </w:rPr>
-          <w:instrText xml:space="preserve"> PAGEREF _Toc242051226 \h </w:instrText>
+          <w:instrText xml:space="preserve"> PAGEREF _Toc242210544 \h </w:instrText>
         </w:r>
         <w:r>
           <w:rPr>
@@ -7430,7 +7430,7 @@
           <w:noProof/>
         </w:rPr>
       </w:pPr>
-      <w:hyperlink w:anchor="_Toc242051227" w:history="1">
+      <w:hyperlink w:anchor="_Toc242210545" w:history="1">
         <w:r>
           <w:rPr>
             <w:rStyle w:val="Hipervnculo"/>
@@ -7457,7 +7457,7 @@
             <w:noProof/>
             <w:webHidden/>
           </w:rPr>
-          <w:instrText xml:space="preserve"> PAGEREF _Toc242051227 \h </w:instrText>
+          <w:instrText xml:space="preserve"> PAGEREF _Toc242210545 \h </w:instrText>
         </w:r>
         <w:r>
           <w:rPr>
@@ -7498,7 +7498,7 @@
           <w:noProof/>
         </w:rPr>
       </w:pPr>
-      <w:hyperlink w:anchor="_Toc242051228" w:history="1">
+      <w:hyperlink w:anchor="_Toc242210546" w:history="1">
         <w:r>
           <w:rPr>
             <w:rStyle w:val="Hipervnculo"/>
@@ -7525,7 +7525,7 @@
             <w:noProof/>
             <w:webHidden/>
           </w:rPr>
-          <w:instrText xml:space="preserve"> PAGEREF _Toc242051228 \h </w:instrText>
+          <w:instrText xml:space="preserve"> PAGEREF _Toc242210546 \h </w:instrText>
         </w:r>
         <w:r>
           <w:rPr>
@@ -7566,7 +7566,7 @@
           <w:noProof/>
         </w:rPr>
       </w:pPr>
-      <w:hyperlink w:anchor="_Toc242051229" w:history="1">
+      <w:hyperlink w:anchor="_Toc242210547" w:history="1">
         <w:r>
           <w:rPr>
             <w:rStyle w:val="Hipervnculo"/>
@@ -7593,7 +7593,7 @@
             <w:noProof/>
             <w:webHidden/>
           </w:rPr>
-          <w:instrText xml:space="preserve"> PAGEREF _Toc242051229 \h </w:instrText>
+          <w:instrText xml:space="preserve"> PAGEREF _Toc242210547 \h </w:instrText>
         </w:r>
         <w:r>
           <w:rPr>
@@ -7634,7 +7634,7 @@
           <w:noProof/>
         </w:rPr>
       </w:pPr>
-      <w:hyperlink w:anchor="_Toc242051230" w:history="1">
+      <w:hyperlink w:anchor="_Toc242210548" w:history="1">
         <w:r>
           <w:rPr>
             <w:rStyle w:val="Hipervnculo"/>
@@ -7661,7 +7661,7 @@
             <w:noProof/>
             <w:webHidden/>
           </w:rPr>
-          <w:instrText xml:space="preserve"> PAGEREF _Toc242051230 \h </w:instrText>
+          <w:instrText xml:space="preserve"> PAGEREF _Toc242210548 \h </w:instrText>
         </w:r>
         <w:r>
           <w:rPr>
@@ -7702,7 +7702,7 @@
           <w:noProof/>
         </w:rPr>
       </w:pPr>
-      <w:hyperlink w:anchor="_Toc242051231" w:history="1">
+      <w:hyperlink w:anchor="_Toc242210549" w:history="1">
         <w:r>
           <w:rPr>
             <w:rStyle w:val="Hipervnculo"/>
@@ -7729,7 +7729,7 @@
             <w:noProof/>
             <w:webHidden/>
           </w:rPr>
-          <w:instrText xml:space="preserve"> PAGEREF _Toc242051231 \h </w:instrText>
+          <w:instrText xml:space="preserve"> PAGEREF _Toc242210549 \h </w:instrText>
         </w:r>
         <w:r>
           <w:rPr>
@@ -7770,7 +7770,7 @@
           <w:noProof/>
         </w:rPr>
       </w:pPr>
-      <w:hyperlink w:anchor="_Toc242051232" w:history="1">
+      <w:hyperlink w:anchor="_Toc242210550" w:history="1">
         <w:r>
           <w:rPr>
             <w:rStyle w:val="Hipervnculo"/>
@@ -7797,7 +7797,7 @@
             <w:noProof/>
             <w:webHidden/>
           </w:rPr>
-          <w:instrText xml:space="preserve"> PAGEREF _Toc242051232 \h </w:instrText>
+          <w:instrText xml:space="preserve"> PAGEREF _Toc242210550 \h </w:instrText>
         </w:r>
         <w:r>
           <w:rPr>
@@ -7838,7 +7838,7 @@
           <w:noProof/>
         </w:rPr>
       </w:pPr>
-      <w:hyperlink w:anchor="_Toc242051233" w:history="1">
+      <w:hyperlink w:anchor="_Toc242210551" w:history="1">
         <w:r>
           <w:rPr>
             <w:rStyle w:val="Hipervnculo"/>
@@ -7865,7 +7865,7 @@
             <w:noProof/>
             <w:webHidden/>
           </w:rPr>
-          <w:instrText xml:space="preserve"> PAGEREF _Toc242051233 \h </w:instrText>
+          <w:instrText xml:space="preserve"> PAGEREF _Toc242210551 \h </w:instrText>
         </w:r>
         <w:r>
           <w:rPr>
@@ -7906,7 +7906,7 @@
           <w:noProof/>
         </w:rPr>
       </w:pPr>
-      <w:hyperlink w:anchor="_Toc242051234" w:history="1">
+      <w:hyperlink w:anchor="_Toc242210552" w:history="1">
         <w:r>
           <w:rPr>
             <w:rStyle w:val="Hipervnculo"/>
@@ -7933,7 +7933,7 @@
             <w:noProof/>
             <w:webHidden/>
           </w:rPr>
-          <w:instrText xml:space="preserve"> PAGEREF _Toc242051234 \h </w:instrText>
+          <w:instrText xml:space="preserve"> PAGEREF _Toc242210552 \h </w:instrText>
         </w:r>
         <w:r>
           <w:rPr>
@@ -7974,7 +7974,7 @@
           <w:noProof/>
         </w:rPr>
       </w:pPr>
-      <w:hyperlink w:anchor="_Toc242051235" w:history="1">
+      <w:hyperlink w:anchor="_Toc242210553" w:history="1">
         <w:r>
           <w:rPr>
             <w:rStyle w:val="Hipervnculo"/>
@@ -8001,7 +8001,7 @@
             <w:noProof/>
             <w:webHidden/>
           </w:rPr>
-          <w:instrText xml:space="preserve"> PAGEREF _Toc242051235 \h </w:instrText>
+          <w:instrText xml:space="preserve"> PAGEREF _Toc242210553 \h </w:instrText>
         </w:r>
         <w:r>
           <w:rPr>
@@ -8042,7 +8042,7 @@
           <w:noProof/>
         </w:rPr>
       </w:pPr>
-      <w:hyperlink w:anchor="_Toc242051236" w:history="1">
+      <w:hyperlink w:anchor="_Toc242210554" w:history="1">
         <w:r>
           <w:rPr>
             <w:rStyle w:val="Hipervnculo"/>
@@ -8069,7 +8069,7 @@
             <w:noProof/>
             <w:webHidden/>
           </w:rPr>
-          <w:instrText xml:space="preserve"> PAGEREF _Toc242051236 \h </w:instrText>
+          <w:instrText xml:space="preserve"> PAGEREF _Toc242210554 \h </w:instrText>
         </w:r>
         <w:r>
           <w:rPr>
@@ -8110,7 +8110,7 @@
           <w:noProof/>
         </w:rPr>
       </w:pPr>
-      <w:hyperlink w:anchor="_Toc242051237" w:history="1">
+      <w:hyperlink w:anchor="_Toc242210555" w:history="1">
         <w:r>
           <w:rPr>
             <w:rStyle w:val="Hipervnculo"/>
@@ -8137,7 +8137,7 @@
             <w:noProof/>
             <w:webHidden/>
           </w:rPr>
-          <w:instrText xml:space="preserve"> PAGEREF _Toc242051237 \h </w:instrText>
+          <w:instrText xml:space="preserve"> PAGEREF _Toc242210555 \h </w:instrText>
         </w:r>
         <w:r>
           <w:rPr>
@@ -8178,7 +8178,7 @@
           <w:noProof/>
         </w:rPr>
       </w:pPr>
-      <w:hyperlink w:anchor="_Toc242051238" w:history="1">
+      <w:hyperlink w:anchor="_Toc242210556" w:history="1">
         <w:r>
           <w:rPr>
             <w:rStyle w:val="Hipervnculo"/>
@@ -8205,7 +8205,7 @@
             <w:noProof/>
             <w:webHidden/>
           </w:rPr>
-          <w:instrText xml:space="preserve"> PAGEREF _Toc242051238 \h </w:instrText>
+          <w:instrText xml:space="preserve"> PAGEREF _Toc242210556 \h </w:instrText>
         </w:r>
         <w:r>
           <w:rPr>
@@ -8246,7 +8246,7 @@
           <w:noProof/>
         </w:rPr>
       </w:pPr>
-      <w:hyperlink w:anchor="_Toc242051239" w:history="1">
+      <w:hyperlink w:anchor="_Toc242210557" w:history="1">
         <w:r>
           <w:rPr>
             <w:rStyle w:val="Hipervnculo"/>
@@ -8273,7 +8273,7 @@
             <w:noProof/>
             <w:webHidden/>
           </w:rPr>
-          <w:instrText xml:space="preserve"> PAGEREF _Toc242051239 \h </w:instrText>
+          <w:instrText xml:space="preserve"> PAGEREF _Toc242210557 \h </w:instrText>
         </w:r>
         <w:r>
           <w:rPr>
@@ -8314,7 +8314,7 @@
           <w:noProof/>
         </w:rPr>
       </w:pPr>
-      <w:hyperlink w:anchor="_Toc242051240" w:history="1">
+      <w:hyperlink w:anchor="_Toc242210558" w:history="1">
         <w:r>
           <w:rPr>
             <w:rStyle w:val="Hipervnculo"/>
@@ -8341,7 +8341,7 @@
             <w:noProof/>
             <w:webHidden/>
           </w:rPr>
-          <w:instrText xml:space="preserve"> PAGEREF _Toc242051240 \h </w:instrText>
+          <w:instrText xml:space="preserve"> PAGEREF _Toc242210558 \h </w:instrText>
         </w:r>
         <w:r>
           <w:rPr>
@@ -8382,7 +8382,7 @@
           <w:noProof/>
         </w:rPr>
       </w:pPr>
-      <w:hyperlink w:anchor="_Toc242051241" w:history="1">
+      <w:hyperlink w:anchor="_Toc242210559" w:history="1">
         <w:r>
           <w:rPr>
             <w:rStyle w:val="Hipervnculo"/>
@@ -8409,7 +8409,7 @@
             <w:noProof/>
             <w:webHidden/>
           </w:rPr>
-          <w:instrText xml:space="preserve"> PAGEREF _Toc242051241 \h </w:instrText>
+          <w:instrText xml:space="preserve"> PAGEREF _Toc242210559 \h </w:instrText>
         </w:r>
         <w:r>
           <w:rPr>
@@ -8450,7 +8450,7 @@
           <w:noProof/>
         </w:rPr>
       </w:pPr>
-      <w:hyperlink w:anchor="_Toc242051242" w:history="1">
+      <w:hyperlink w:anchor="_Toc242210560" w:history="1">
         <w:r>
           <w:rPr>
             <w:rStyle w:val="Hipervnculo"/>
@@ -8477,7 +8477,7 @@
             <w:noProof/>
             <w:webHidden/>
           </w:rPr>
-          <w:instrText xml:space="preserve"> PAGEREF _Toc242051242 \h </w:instrText>
+          <w:instrText xml:space="preserve"> PAGEREF _Toc242210560 \h </w:instrText>
         </w:r>
         <w:r>
           <w:rPr>
@@ -8520,7 +8520,7 @@
       <w:pPr>
         <w:pStyle w:val="Ttulo11"/>
       </w:pPr>
-      <w:bookmarkStart w:id="0" w:name="_Toc242051314"/>
+      <w:bookmarkStart w:id="0" w:name="_Toc242210632"/>
       <w:r>
         <w:t>1. DESCRIPCIÓN GENERAL DEL PROYECTO</w:t>
       </w:r>
@@ -8530,7 +8530,7 @@
       <w:pPr>
         <w:pStyle w:val="Ttulo21"/>
       </w:pPr>
-      <w:bookmarkStart w:id="1" w:name="_Toc242051315"/>
+      <w:bookmarkStart w:id="1" w:name="_Toc242210633"/>
       <w:r>
         <w:t>1.1 Contexto</w:t>
       </w:r>
@@ -8628,7 +8628,7 @@
       <w:pPr>
         <w:pStyle w:val="Ttulo21"/>
       </w:pPr>
-      <w:bookmarkStart w:id="2" w:name="_Toc242051316"/>
+      <w:bookmarkStart w:id="2" w:name="_Toc242210634"/>
       <w:r>
         <w:t>1.2 Problema que resuelve</w:t>
       </w:r>
@@ -8701,7 +8701,7 @@
       <w:pPr>
         <w:pStyle w:val="Ttulo21"/>
       </w:pPr>
-      <w:bookmarkStart w:id="3" w:name="_Toc242051317"/>
+      <w:bookmarkStart w:id="3" w:name="_Toc242210635"/>
       <w:r>
         <w:t>1.3 Solución desarrollada</w:t>
       </w:r>
@@ -8903,7 +8903,7 @@
       <w:pPr>
         <w:pStyle w:val="Ttulo21"/>
       </w:pPr>
-      <w:bookmarkStart w:id="4" w:name="_Toc242051318"/>
+      <w:bookmarkStart w:id="4" w:name="_Toc242210636"/>
       <w:r>
         <w:t>1.4 Usuarios y perfiles</w:t>
       </w:r>
@@ -9210,7 +9210,7 @@
       <w:pPr>
         <w:pStyle w:val="Ttulo21"/>
       </w:pPr>
-      <w:bookmarkStart w:id="5" w:name="_Toc242051319"/>
+      <w:bookmarkStart w:id="5" w:name="_Toc242210637"/>
       <w:r>
         <w:t>1.5 Arquitectura</w:t>
       </w:r>
@@ -9264,7 +9264,7 @@
           <w:noProof/>
         </w:rPr>
         <w:drawing>
-          <wp:inline distT="0" distB="0" distL="0" distR="0" wp14:anchorId="27304213" wp14:editId="01639B36">
+          <wp:inline distT="0" distB="0" distL="0" distR="0" wp14:anchorId="51080D4B" wp14:editId="3CF2C7D8">
             <wp:extent cx="5670000" cy="4631315"/>
             <wp:effectExtent l="0" t="0" r="0" b="0"/>
             <wp:docPr id="218" name="Picture 218"/>
@@ -9304,7 +9304,7 @@
       <w:pPr>
         <w:pStyle w:val="Descripcin1"/>
       </w:pPr>
-      <w:bookmarkStart w:id="6" w:name="_Toc242051207"/>
+      <w:bookmarkStart w:id="6" w:name="_Toc242210525"/>
       <w:r>
         <w:t xml:space="preserve">Figura </w:t>
       </w:r>
@@ -9353,7 +9353,7 @@
       <w:pPr>
         <w:pStyle w:val="Ttulo11"/>
       </w:pPr>
-      <w:bookmarkStart w:id="7" w:name="_Toc242051320"/>
+      <w:bookmarkStart w:id="7" w:name="_Toc242210638"/>
       <w:r>
         <w:t>2. OBJETIVOS Y ALCANCE DEL PROYECTO</w:t>
       </w:r>
@@ -9363,7 +9363,7 @@
       <w:pPr>
         <w:pStyle w:val="Ttulo21"/>
       </w:pPr>
-      <w:bookmarkStart w:id="8" w:name="_Toc242051321"/>
+      <w:bookmarkStart w:id="8" w:name="_Toc242210639"/>
       <w:r>
         <w:t>2.1 Objetivos</w:t>
       </w:r>
@@ -10176,7 +10176,7 @@
       <w:pPr>
         <w:pStyle w:val="Ttulo21"/>
       </w:pPr>
-      <w:bookmarkStart w:id="9" w:name="_Toc242051322"/>
+      <w:bookmarkStart w:id="9" w:name="_Toc242210640"/>
       <w:r>
         <w:t>2.2 Alcance: qué incluye</w:t>
       </w:r>
@@ -10298,7 +10298,7 @@
       <w:pPr>
         <w:pStyle w:val="Ttulo21"/>
       </w:pPr>
-      <w:bookmarkStart w:id="10" w:name="_Toc242051323"/>
+      <w:bookmarkStart w:id="10" w:name="_Toc242210641"/>
       <w:r>
         <w:t>2.3 Alcance: qué queda fuera</w:t>
       </w:r>
@@ -10373,7 +10373,7 @@
       <w:pPr>
         <w:pStyle w:val="Ttulo21"/>
       </w:pPr>
-      <w:bookmarkStart w:id="11" w:name="_Toc242051324"/>
+      <w:bookmarkStart w:id="11" w:name="_Toc242210642"/>
       <w:r>
         <w:t>2.4 Relación con la propuesta aprobada</w:t>
       </w:r>
@@ -10923,7 +10923,7 @@
       <w:pPr>
         <w:pStyle w:val="Ttulo11"/>
       </w:pPr>
-      <w:bookmarkStart w:id="12" w:name="_Toc242051325"/>
+      <w:bookmarkStart w:id="12" w:name="_Toc242210643"/>
       <w:r>
         <w:t>3. STACK TECNOLÓGICO Y ALTERNATIVAS EVALUADAS</w:t>
       </w:r>
@@ -10933,7 +10933,7 @@
       <w:pPr>
         <w:pStyle w:val="Ttulo21"/>
       </w:pPr>
-      <w:bookmarkStart w:id="13" w:name="_Toc242051326"/>
+      <w:bookmarkStart w:id="13" w:name="_Toc242210644"/>
       <w:r>
         <w:t>3.1 Stack tecnológico</w:t>
       </w:r>
@@ -11877,7 +11877,7 @@
       <w:pPr>
         <w:pStyle w:val="Ttulo21"/>
       </w:pPr>
-      <w:bookmarkStart w:id="14" w:name="_Toc242051327"/>
+      <w:bookmarkStart w:id="14" w:name="_Toc242210645"/>
       <w:r>
         <w:t>3.2 Alternativas evaluadas</w:t>
       </w:r>
@@ -11887,7 +11887,7 @@
       <w:pPr>
         <w:pStyle w:val="Ttulo31"/>
       </w:pPr>
-      <w:bookmarkStart w:id="15" w:name="_Toc242051328"/>
+      <w:bookmarkStart w:id="15" w:name="_Toc242210646"/>
       <w:r>
         <w:t xml:space="preserve">Framework del </w:t>
       </w:r>
@@ -12003,7 +12003,7 @@
       <w:pPr>
         <w:pStyle w:val="Ttulo31"/>
       </w:pPr>
-      <w:bookmarkStart w:id="16" w:name="_Toc242051329"/>
+      <w:bookmarkStart w:id="16" w:name="_Toc242210647"/>
       <w:r>
         <w:t xml:space="preserve">Base de datos: </w:t>
       </w:r>
@@ -12080,7 +12080,7 @@
       <w:pPr>
         <w:pStyle w:val="Ttulo31"/>
       </w:pPr>
-      <w:bookmarkStart w:id="17" w:name="_Toc242051330"/>
+      <w:bookmarkStart w:id="17" w:name="_Toc242210648"/>
       <w:r>
         <w:rPr>
           <w:noProof/>
@@ -12148,7 +12148,7 @@
       <w:pPr>
         <w:pStyle w:val="Ttulo31"/>
       </w:pPr>
-      <w:bookmarkStart w:id="18" w:name="_Toc242051331"/>
+      <w:bookmarkStart w:id="18" w:name="_Toc242210649"/>
       <w:r>
         <w:t xml:space="preserve">Sesión: </w:t>
       </w:r>
@@ -12195,7 +12195,7 @@
       <w:pPr>
         <w:pStyle w:val="Ttulo31"/>
       </w:pPr>
-      <w:bookmarkStart w:id="19" w:name="_Toc242051332"/>
+      <w:bookmarkStart w:id="19" w:name="_Toc242210650"/>
       <w:r>
         <w:t xml:space="preserve">Agregación: SQL frente a </w:t>
       </w:r>
@@ -12241,7 +12241,7 @@
       <w:pPr>
         <w:pStyle w:val="Ttulo11"/>
       </w:pPr>
-      <w:bookmarkStart w:id="20" w:name="_Toc242051333"/>
+      <w:bookmarkStart w:id="20" w:name="_Toc242210651"/>
       <w:r>
         <w:t>4. MODELO DE DATOS</w:t>
       </w:r>
@@ -12251,7 +12251,7 @@
       <w:pPr>
         <w:pStyle w:val="Ttulo21"/>
       </w:pPr>
-      <w:bookmarkStart w:id="21" w:name="_Toc242051334"/>
+      <w:bookmarkStart w:id="21" w:name="_Toc242210652"/>
       <w:r>
         <w:t>4.1 Tipo de base de datos</w:t>
       </w:r>
@@ -12348,7 +12348,7 @@
       <w:pPr>
         <w:pStyle w:val="Ttulo21"/>
       </w:pPr>
-      <w:bookmarkStart w:id="22" w:name="_Toc242051335"/>
+      <w:bookmarkStart w:id="22" w:name="_Toc242210653"/>
       <w:r>
         <w:t>4.2 Esquema</w:t>
       </w:r>
@@ -12366,7 +12366,7 @@
           <w:noProof/>
         </w:rPr>
         <w:drawing>
-          <wp:inline distT="0" distB="0" distL="0" distR="0" wp14:anchorId="654624F5" wp14:editId="4F04A9A4">
+          <wp:inline distT="0" distB="0" distL="0" distR="0" wp14:anchorId="48E97BE4" wp14:editId="4042AC2D">
             <wp:extent cx="7737882" cy="4176000"/>
             <wp:effectExtent l="0" t="0" r="0" b="0"/>
             <wp:docPr id="219" name="Picture 219"/>
@@ -12414,7 +12414,7 @@
           <w:docGrid w:linePitch="360"/>
         </w:sectPr>
       </w:pPr>
-      <w:bookmarkStart w:id="23" w:name="_Toc242051208"/>
+      <w:bookmarkStart w:id="23" w:name="_Toc242210526"/>
       <w:r>
         <w:t xml:space="preserve">Figura </w:t>
       </w:r>
@@ -12472,7 +12472,7 @@
       <w:pPr>
         <w:pStyle w:val="Ttulo21"/>
       </w:pPr>
-      <w:bookmarkStart w:id="24" w:name="_Toc242051336"/>
+      <w:bookmarkStart w:id="24" w:name="_Toc242210654"/>
       <w:r>
         <w:t>4.3 Descripción de las tablas</w:t>
       </w:r>
@@ -13231,7 +13231,7 @@
       <w:pPr>
         <w:pStyle w:val="Ttulo21"/>
       </w:pPr>
-      <w:bookmarkStart w:id="25" w:name="_Toc242051337"/>
+      <w:bookmarkStart w:id="25" w:name="_Toc242210655"/>
       <w:r>
         <w:t>4.4 La tabla de partes en detalle</w:t>
       </w:r>
@@ -13886,7 +13886,7 @@
       <w:pPr>
         <w:pStyle w:val="Ttulo21"/>
       </w:pPr>
-      <w:bookmarkStart w:id="26" w:name="_Toc242051338"/>
+      <w:bookmarkStart w:id="26" w:name="_Toc242210656"/>
       <w:r>
         <w:t>4.5 Índices y rendimiento</w:t>
       </w:r>
@@ -14268,7 +14268,7 @@
       <w:pPr>
         <w:pStyle w:val="Ttulo21"/>
       </w:pPr>
-      <w:bookmarkStart w:id="27" w:name="_Toc242051339"/>
+      <w:bookmarkStart w:id="27" w:name="_Toc242210657"/>
       <w:r>
         <w:t>4.6 Datos de prueba y protección de datos (LOPD)</w:t>
       </w:r>
@@ -14317,7 +14317,7 @@
           <w:noProof/>
         </w:rPr>
         <w:drawing>
-          <wp:inline distT="0" distB="0" distL="0" distR="0" wp14:anchorId="00ECC755" wp14:editId="16A7B7B0">
+          <wp:inline distT="0" distB="0" distL="0" distR="0" wp14:anchorId="58D405B9" wp14:editId="58EC8011">
             <wp:extent cx="5670000" cy="1989654"/>
             <wp:effectExtent l="0" t="0" r="0" b="0"/>
             <wp:docPr id="220" name="Picture 220"/>
@@ -14357,7 +14357,7 @@
       <w:pPr>
         <w:pStyle w:val="Descripcin1"/>
       </w:pPr>
-      <w:bookmarkStart w:id="28" w:name="_Toc242051209"/>
+      <w:bookmarkStart w:id="28" w:name="_Toc242210527"/>
       <w:r>
         <w:t xml:space="preserve">Figura </w:t>
       </w:r>
@@ -14397,7 +14397,7 @@
       <w:pPr>
         <w:pStyle w:val="Ttulo11"/>
       </w:pPr>
-      <w:bookmarkStart w:id="29" w:name="_Toc242051340"/>
+      <w:bookmarkStart w:id="29" w:name="_Toc242210658"/>
       <w:r>
         <w:t>5. REQUISITOS DE LA APLICACIÓN</w:t>
       </w:r>
@@ -14488,7 +14488,7 @@
       <w:pPr>
         <w:pStyle w:val="Ttulo21"/>
       </w:pPr>
-      <w:bookmarkStart w:id="30" w:name="_Toc242051341"/>
+      <w:bookmarkStart w:id="30" w:name="_Toc242210659"/>
       <w:r>
         <w:t>5.1 Requisitos funcionales</w:t>
       </w:r>
@@ -14498,7 +14498,7 @@
       <w:pPr>
         <w:pStyle w:val="Ttulo31"/>
       </w:pPr>
-      <w:bookmarkStart w:id="31" w:name="_Toc242051342"/>
+      <w:bookmarkStart w:id="31" w:name="_Toc242210660"/>
       <w:r>
         <w:t>RF-01. Inicio de sesión en dos pasos</w:t>
       </w:r>
@@ -14590,7 +14590,7 @@
           <w:noProof/>
         </w:rPr>
         <w:drawing>
-          <wp:inline distT="0" distB="0" distL="0" distR="0" wp14:anchorId="3B3E8A12" wp14:editId="69439D2E">
+          <wp:inline distT="0" distB="0" distL="0" distR="0" wp14:anchorId="03FA01AB" wp14:editId="291EA968">
             <wp:extent cx="3789473" cy="2879999"/>
             <wp:effectExtent l="0" t="0" r="0" b="0"/>
             <wp:docPr id="221" name="Picture 221"/>
@@ -14630,7 +14630,7 @@
       <w:pPr>
         <w:pStyle w:val="Descripcin1"/>
       </w:pPr>
-      <w:bookmarkStart w:id="32" w:name="_Toc242051210"/>
+      <w:bookmarkStart w:id="32" w:name="_Toc242210528"/>
       <w:r>
         <w:t xml:space="preserve">Figura </w:t>
       </w:r>
@@ -14669,7 +14669,7 @@
           <w:noProof/>
         </w:rPr>
         <w:drawing>
-          <wp:inline distT="0" distB="0" distL="0" distR="0" wp14:anchorId="61F1DE8D" wp14:editId="16F3B632">
+          <wp:inline distT="0" distB="0" distL="0" distR="0" wp14:anchorId="1855BBAC" wp14:editId="2C0D7480">
             <wp:extent cx="3789473" cy="2879999"/>
             <wp:effectExtent l="0" t="0" r="0" b="0"/>
             <wp:docPr id="222" name="Picture 222"/>
@@ -14709,7 +14709,7 @@
       <w:pPr>
         <w:pStyle w:val="Descripcin1"/>
       </w:pPr>
-      <w:bookmarkStart w:id="33" w:name="_Toc242051211"/>
+      <w:bookmarkStart w:id="33" w:name="_Toc242210529"/>
       <w:r>
         <w:t xml:space="preserve">Figura </w:t>
       </w:r>
@@ -14748,7 +14748,7 @@
           <w:noProof/>
         </w:rPr>
         <w:drawing>
-          <wp:inline distT="0" distB="0" distL="0" distR="0" wp14:anchorId="1EA15004" wp14:editId="2D87779B">
+          <wp:inline distT="0" distB="0" distL="0" distR="0" wp14:anchorId="1B3B2320" wp14:editId="46BF472F">
             <wp:extent cx="3789473" cy="2879999"/>
             <wp:effectExtent l="0" t="0" r="0" b="0"/>
             <wp:docPr id="223" name="Picture 223"/>
@@ -14788,7 +14788,7 @@
       <w:pPr>
         <w:pStyle w:val="Descripcin1"/>
       </w:pPr>
-      <w:bookmarkStart w:id="34" w:name="_Toc242051212"/>
+      <w:bookmarkStart w:id="34" w:name="_Toc242210530"/>
       <w:r>
         <w:t xml:space="preserve">Figura </w:t>
       </w:r>
@@ -14819,7 +14819,7 @@
       <w:pPr>
         <w:pStyle w:val="Ttulo31"/>
       </w:pPr>
-      <w:bookmarkStart w:id="35" w:name="_Toc242051343"/>
+      <w:bookmarkStart w:id="35" w:name="_Toc242210661"/>
       <w:r>
         <w:t>RF-02. Control de accesos por perfil</w:t>
       </w:r>
@@ -14934,7 +14934,7 @@
           <w:noProof/>
         </w:rPr>
         <w:drawing>
-          <wp:inline distT="0" distB="0" distL="0" distR="0" wp14:anchorId="41043A18" wp14:editId="5A357AD1">
+          <wp:inline distT="0" distB="0" distL="0" distR="0" wp14:anchorId="331AB7A2" wp14:editId="2303885C">
             <wp:extent cx="1091368" cy="3239999"/>
             <wp:effectExtent l="0" t="0" r="0" b="0"/>
             <wp:docPr id="224" name="Picture 224"/>
@@ -14974,7 +14974,7 @@
       <w:pPr>
         <w:pStyle w:val="Descripcin1"/>
       </w:pPr>
-      <w:bookmarkStart w:id="36" w:name="_Toc242051213"/>
+      <w:bookmarkStart w:id="36" w:name="_Toc242210531"/>
       <w:r>
         <w:t xml:space="preserve">Figura </w:t>
       </w:r>
@@ -15013,7 +15013,7 @@
           <w:noProof/>
         </w:rPr>
         <w:drawing>
-          <wp:inline distT="0" distB="0" distL="0" distR="0" wp14:anchorId="50B5846F" wp14:editId="5EA66E5D">
+          <wp:inline distT="0" distB="0" distL="0" distR="0" wp14:anchorId="59930856" wp14:editId="78B3C00D">
             <wp:extent cx="1091368" cy="3239999"/>
             <wp:effectExtent l="0" t="0" r="0" b="0"/>
             <wp:docPr id="225" name="Picture 225"/>
@@ -15053,7 +15053,7 @@
       <w:pPr>
         <w:pStyle w:val="Descripcin1"/>
       </w:pPr>
-      <w:bookmarkStart w:id="37" w:name="_Toc242051214"/>
+      <w:bookmarkStart w:id="37" w:name="_Toc242210532"/>
       <w:r>
         <w:t xml:space="preserve">Figura </w:t>
       </w:r>
@@ -15092,7 +15092,7 @@
           <w:noProof/>
         </w:rPr>
         <w:drawing>
-          <wp:inline distT="0" distB="0" distL="0" distR="0" wp14:anchorId="31E4D009" wp14:editId="320DB27A">
+          <wp:inline distT="0" distB="0" distL="0" distR="0" wp14:anchorId="22DBB9BF" wp14:editId="62719426">
             <wp:extent cx="1091368" cy="3239999"/>
             <wp:effectExtent l="0" t="0" r="0" b="0"/>
             <wp:docPr id="226" name="Picture 226"/>
@@ -15132,7 +15132,7 @@
       <w:pPr>
         <w:pStyle w:val="Descripcin1"/>
       </w:pPr>
-      <w:bookmarkStart w:id="38" w:name="_Toc242051215"/>
+      <w:bookmarkStart w:id="38" w:name="_Toc242210533"/>
       <w:r>
         <w:t xml:space="preserve">Figura </w:t>
       </w:r>
@@ -15171,7 +15171,7 @@
           <w:noProof/>
         </w:rPr>
         <w:drawing>
-          <wp:inline distT="0" distB="0" distL="0" distR="0" wp14:anchorId="5284B78E" wp14:editId="48829621">
+          <wp:inline distT="0" distB="0" distL="0" distR="0" wp14:anchorId="3A4D65C0" wp14:editId="46453876">
             <wp:extent cx="5670000" cy="1597909"/>
             <wp:effectExtent l="0" t="0" r="0" b="0"/>
             <wp:docPr id="227" name="Picture 227"/>
@@ -15211,7 +15211,7 @@
       <w:pPr>
         <w:pStyle w:val="Descripcin1"/>
       </w:pPr>
-      <w:bookmarkStart w:id="39" w:name="_Toc242051216"/>
+      <w:bookmarkStart w:id="39" w:name="_Toc242210534"/>
       <w:r>
         <w:t xml:space="preserve">Figura </w:t>
       </w:r>
@@ -15259,7 +15259,7 @@
           <w:noProof/>
         </w:rPr>
         <w:drawing>
-          <wp:inline distT="0" distB="0" distL="0" distR="0" wp14:anchorId="54C65E22" wp14:editId="591618A4">
+          <wp:inline distT="0" distB="0" distL="0" distR="0" wp14:anchorId="6893EC2B" wp14:editId="0DD81DA4">
             <wp:extent cx="5600000" cy="3600000"/>
             <wp:effectExtent l="0" t="0" r="0" b="0"/>
             <wp:docPr id="228" name="Picture 228"/>
@@ -15299,7 +15299,7 @@
       <w:pPr>
         <w:pStyle w:val="Descripcin1"/>
       </w:pPr>
-      <w:bookmarkStart w:id="40" w:name="_Toc242051217"/>
+      <w:bookmarkStart w:id="40" w:name="_Toc242210535"/>
       <w:r>
         <w:t xml:space="preserve">Figura </w:t>
       </w:r>
@@ -15338,7 +15338,7 @@
           <w:noProof/>
         </w:rPr>
         <w:drawing>
-          <wp:inline distT="0" distB="0" distL="0" distR="0" wp14:anchorId="3FBC20B2" wp14:editId="2F3F33B1">
+          <wp:inline distT="0" distB="0" distL="0" distR="0" wp14:anchorId="36F5E542" wp14:editId="1268F629">
             <wp:extent cx="5040000" cy="3600000"/>
             <wp:effectExtent l="0" t="0" r="0" b="0"/>
             <wp:docPr id="229" name="Picture 229"/>
@@ -15378,7 +15378,7 @@
       <w:pPr>
         <w:pStyle w:val="Descripcin1"/>
       </w:pPr>
-      <w:bookmarkStart w:id="41" w:name="_Toc242051218"/>
+      <w:bookmarkStart w:id="41" w:name="_Toc242210536"/>
       <w:r>
         <w:t xml:space="preserve">Figura </w:t>
       </w:r>
@@ -15409,7 +15409,7 @@
       <w:pPr>
         <w:pStyle w:val="Ttulo31"/>
       </w:pPr>
-      <w:bookmarkStart w:id="42" w:name="_Toc242051344"/>
+      <w:bookmarkStart w:id="42" w:name="_Toc242210662"/>
       <w:r>
         <w:t>RF-03. Mantenimiento y cierre de la sesión</w:t>
       </w:r>
@@ -15469,7 +15469,7 @@
           <w:noProof/>
         </w:rPr>
         <w:drawing>
-          <wp:inline distT="0" distB="0" distL="0" distR="0" wp14:anchorId="26AEDDC7" wp14:editId="1D7ED1EB">
+          <wp:inline distT="0" distB="0" distL="0" distR="0" wp14:anchorId="5FB84CEC" wp14:editId="3C6BE542">
             <wp:extent cx="1091368" cy="3239999"/>
             <wp:effectExtent l="0" t="0" r="0" b="0"/>
             <wp:docPr id="230" name="Picture 230"/>
@@ -15509,7 +15509,7 @@
       <w:pPr>
         <w:pStyle w:val="Descripcin1"/>
       </w:pPr>
-      <w:bookmarkStart w:id="43" w:name="_Toc242051219"/>
+      <w:bookmarkStart w:id="43" w:name="_Toc242210537"/>
       <w:r>
         <w:t xml:space="preserve">Figura </w:t>
       </w:r>
@@ -15540,7 +15540,7 @@
       <w:pPr>
         <w:pStyle w:val="Ttulo31"/>
       </w:pPr>
-      <w:bookmarkStart w:id="44" w:name="_Toc242051345"/>
+      <w:bookmarkStart w:id="44" w:name="_Toc242210663"/>
       <w:r>
         <w:t>RF-04. Resumen general de plantilla</w:t>
       </w:r>
@@ -15600,7 +15600,7 @@
           <w:noProof/>
         </w:rPr>
         <w:drawing>
-          <wp:inline distT="0" distB="0" distL="0" distR="0" wp14:anchorId="2547E7CF" wp14:editId="5294B5F5">
+          <wp:inline distT="0" distB="0" distL="0" distR="0" wp14:anchorId="1246E18E" wp14:editId="4447D07D">
             <wp:extent cx="5600000" cy="3600000"/>
             <wp:effectExtent l="0" t="0" r="0" b="0"/>
             <wp:docPr id="231" name="Picture 231"/>
@@ -15640,7 +15640,7 @@
       <w:pPr>
         <w:pStyle w:val="Descripcin1"/>
       </w:pPr>
-      <w:bookmarkStart w:id="45" w:name="_Toc242051220"/>
+      <w:bookmarkStart w:id="45" w:name="_Toc242210538"/>
       <w:r>
         <w:t xml:space="preserve">Figura </w:t>
       </w:r>
@@ -15679,7 +15679,7 @@
           <w:noProof/>
         </w:rPr>
         <w:drawing>
-          <wp:inline distT="0" distB="0" distL="0" distR="0" wp14:anchorId="2E1555F7" wp14:editId="038FB608">
+          <wp:inline distT="0" distB="0" distL="0" distR="0" wp14:anchorId="12162554" wp14:editId="76A2B9CA">
             <wp:extent cx="5600000" cy="3600000"/>
             <wp:effectExtent l="0" t="0" r="0" b="0"/>
             <wp:docPr id="232" name="Picture 232"/>
@@ -15719,7 +15719,7 @@
       <w:pPr>
         <w:pStyle w:val="Descripcin1"/>
       </w:pPr>
-      <w:bookmarkStart w:id="46" w:name="_Toc242051221"/>
+      <w:bookmarkStart w:id="46" w:name="_Toc242210539"/>
       <w:r>
         <w:t xml:space="preserve">Figura </w:t>
       </w:r>
@@ -15750,7 +15750,7 @@
       <w:pPr>
         <w:pStyle w:val="Ttulo31"/>
       </w:pPr>
-      <w:bookmarkStart w:id="47" w:name="_Toc242051346"/>
+      <w:bookmarkStart w:id="47" w:name="_Toc242210664"/>
       <w:r>
         <w:t>RF-05. Directorio de personal</w:t>
       </w:r>
@@ -15810,7 +15810,7 @@
           <w:noProof/>
         </w:rPr>
         <w:drawing>
-          <wp:inline distT="0" distB="0" distL="0" distR="0" wp14:anchorId="3B470774" wp14:editId="2EF5CFF9">
+          <wp:inline distT="0" distB="0" distL="0" distR="0" wp14:anchorId="5BBE7603" wp14:editId="34C24634">
             <wp:extent cx="5600000" cy="3600000"/>
             <wp:effectExtent l="0" t="0" r="0" b="0"/>
             <wp:docPr id="233" name="Picture 233"/>
@@ -15850,7 +15850,7 @@
       <w:pPr>
         <w:pStyle w:val="Descripcin1"/>
       </w:pPr>
-      <w:bookmarkStart w:id="48" w:name="_Toc242051222"/>
+      <w:bookmarkStart w:id="48" w:name="_Toc242210540"/>
       <w:r>
         <w:t xml:space="preserve">Figura </w:t>
       </w:r>
@@ -15889,7 +15889,7 @@
           <w:noProof/>
         </w:rPr>
         <w:drawing>
-          <wp:inline distT="0" distB="0" distL="0" distR="0" wp14:anchorId="27384D57" wp14:editId="35FBB9D4">
+          <wp:inline distT="0" distB="0" distL="0" distR="0" wp14:anchorId="1C0C0F10" wp14:editId="15AA87F2">
             <wp:extent cx="5600000" cy="3600000"/>
             <wp:effectExtent l="0" t="0" r="0" b="0"/>
             <wp:docPr id="234" name="Picture 234"/>
@@ -15929,7 +15929,7 @@
       <w:pPr>
         <w:pStyle w:val="Descripcin1"/>
       </w:pPr>
-      <w:bookmarkStart w:id="49" w:name="_Toc242051223"/>
+      <w:bookmarkStart w:id="49" w:name="_Toc242210541"/>
       <w:r>
         <w:t xml:space="preserve">Figura </w:t>
       </w:r>
@@ -15968,7 +15968,7 @@
           <w:noProof/>
         </w:rPr>
         <w:drawing>
-          <wp:inline distT="0" distB="0" distL="0" distR="0" wp14:anchorId="1514CED6" wp14:editId="5A4FB2E5">
+          <wp:inline distT="0" distB="0" distL="0" distR="0" wp14:anchorId="4A2E0C0E" wp14:editId="63915751">
             <wp:extent cx="5600000" cy="3600000"/>
             <wp:effectExtent l="0" t="0" r="0" b="0"/>
             <wp:docPr id="235" name="Picture 235"/>
@@ -16008,7 +16008,7 @@
       <w:pPr>
         <w:pStyle w:val="Descripcin1"/>
       </w:pPr>
-      <w:bookmarkStart w:id="50" w:name="_Toc242051224"/>
+      <w:bookmarkStart w:id="50" w:name="_Toc242210542"/>
       <w:r>
         <w:t xml:space="preserve">Figura </w:t>
       </w:r>
@@ -16039,7 +16039,7 @@
       <w:pPr>
         <w:pStyle w:val="Ttulo31"/>
       </w:pPr>
-      <w:bookmarkStart w:id="51" w:name="_Toc242051347"/>
+      <w:bookmarkStart w:id="51" w:name="_Toc242210665"/>
       <w:r>
         <w:t>RF-06. Horas extra por periodos</w:t>
       </w:r>
@@ -16113,7 +16113,7 @@
           <w:noProof/>
         </w:rPr>
         <w:drawing>
-          <wp:inline distT="0" distB="0" distL="0" distR="0" wp14:anchorId="3E8EDC26" wp14:editId="09A0794C">
+          <wp:inline distT="0" distB="0" distL="0" distR="0" wp14:anchorId="59CF9D49" wp14:editId="0CD1D1B7">
             <wp:extent cx="5670000" cy="5969700"/>
             <wp:effectExtent l="0" t="0" r="0" b="0"/>
             <wp:docPr id="236" name="Picture 236"/>
@@ -16153,7 +16153,7 @@
       <w:pPr>
         <w:pStyle w:val="Descripcin1"/>
       </w:pPr>
-      <w:bookmarkStart w:id="52" w:name="_Toc242051225"/>
+      <w:bookmarkStart w:id="52" w:name="_Toc242210543"/>
       <w:r>
         <w:t xml:space="preserve">Figura </w:t>
       </w:r>
@@ -16192,7 +16192,7 @@
           <w:noProof/>
         </w:rPr>
         <w:drawing>
-          <wp:inline distT="0" distB="0" distL="0" distR="0" wp14:anchorId="6C5A03C4" wp14:editId="544F6805">
+          <wp:inline distT="0" distB="0" distL="0" distR="0" wp14:anchorId="686704F0" wp14:editId="53355283">
             <wp:extent cx="5600000" cy="3600000"/>
             <wp:effectExtent l="0" t="0" r="0" b="0"/>
             <wp:docPr id="237" name="Picture 237"/>
@@ -16232,7 +16232,7 @@
       <w:pPr>
         <w:pStyle w:val="Descripcin1"/>
       </w:pPr>
-      <w:bookmarkStart w:id="53" w:name="_Toc242051226"/>
+      <w:bookmarkStart w:id="53" w:name="_Toc242210544"/>
       <w:r>
         <w:t xml:space="preserve">Figura </w:t>
       </w:r>
@@ -16271,7 +16271,7 @@
           <w:noProof/>
         </w:rPr>
         <w:drawing>
-          <wp:inline distT="0" distB="0" distL="0" distR="0" wp14:anchorId="05565E5D" wp14:editId="5D6EC164">
+          <wp:inline distT="0" distB="0" distL="0" distR="0" wp14:anchorId="3FAB57F0" wp14:editId="2B595EB1">
             <wp:extent cx="5600000" cy="3600000"/>
             <wp:effectExtent l="0" t="0" r="0" b="0"/>
             <wp:docPr id="238" name="Picture 238"/>
@@ -16311,7 +16311,7 @@
       <w:pPr>
         <w:pStyle w:val="Descripcin1"/>
       </w:pPr>
-      <w:bookmarkStart w:id="54" w:name="_Toc242051227"/>
+      <w:bookmarkStart w:id="54" w:name="_Toc242210545"/>
       <w:r>
         <w:t xml:space="preserve">Figura </w:t>
       </w:r>
@@ -16342,7 +16342,7 @@
       <w:pPr>
         <w:pStyle w:val="Ttulo31"/>
       </w:pPr>
-      <w:bookmarkStart w:id="55" w:name="_Toc242051348"/>
+      <w:bookmarkStart w:id="55" w:name="_Toc242210666"/>
       <w:r>
         <w:t>RF-07. Horas extra por empleado</w:t>
       </w:r>
@@ -16388,7 +16388,7 @@
           <w:noProof/>
         </w:rPr>
         <w:drawing>
-          <wp:inline distT="0" distB="0" distL="0" distR="0" wp14:anchorId="7CFE0E96" wp14:editId="39829AF6">
+          <wp:inline distT="0" distB="0" distL="0" distR="0" wp14:anchorId="1E92713D" wp14:editId="730EE8D4">
             <wp:extent cx="5600000" cy="3600000"/>
             <wp:effectExtent l="0" t="0" r="0" b="0"/>
             <wp:docPr id="239" name="Picture 239"/>
@@ -16428,7 +16428,7 @@
       <w:pPr>
         <w:pStyle w:val="Descripcin1"/>
       </w:pPr>
-      <w:bookmarkStart w:id="56" w:name="_Toc242051228"/>
+      <w:bookmarkStart w:id="56" w:name="_Toc242210546"/>
       <w:r>
         <w:t xml:space="preserve">Figura </w:t>
       </w:r>
@@ -16459,7 +16459,7 @@
       <w:pPr>
         <w:pStyle w:val="Ttulo31"/>
       </w:pPr>
-      <w:bookmarkStart w:id="57" w:name="_Toc242051349"/>
+      <w:bookmarkStart w:id="57" w:name="_Toc242210667"/>
       <w:r>
         <w:t>RF-08. Ranking de horas combo</w:t>
       </w:r>
@@ -16505,7 +16505,7 @@
           <w:noProof/>
         </w:rPr>
         <w:drawing>
-          <wp:inline distT="0" distB="0" distL="0" distR="0" wp14:anchorId="627F9C9E" wp14:editId="54A83DA7">
+          <wp:inline distT="0" distB="0" distL="0" distR="0" wp14:anchorId="1E070BA6" wp14:editId="0F5691E2">
             <wp:extent cx="5600000" cy="3600000"/>
             <wp:effectExtent l="0" t="0" r="0" b="0"/>
             <wp:docPr id="240" name="Picture 240"/>
@@ -16545,7 +16545,7 @@
       <w:pPr>
         <w:pStyle w:val="Descripcin1"/>
       </w:pPr>
-      <w:bookmarkStart w:id="58" w:name="_Toc242051229"/>
+      <w:bookmarkStart w:id="58" w:name="_Toc242210547"/>
       <w:r>
         <w:t xml:space="preserve">Figura </w:t>
       </w:r>
@@ -16576,7 +16576,7 @@
       <w:pPr>
         <w:pStyle w:val="Ttulo31"/>
       </w:pPr>
-      <w:bookmarkStart w:id="59" w:name="_Toc242051350"/>
+      <w:bookmarkStart w:id="59" w:name="_Toc242210668"/>
       <w:r>
         <w:t>RF-09. Total de servicios prestados (SP)</w:t>
       </w:r>
@@ -16622,7 +16622,7 @@
           <w:noProof/>
         </w:rPr>
         <w:drawing>
-          <wp:inline distT="0" distB="0" distL="0" distR="0" wp14:anchorId="55520ADB" wp14:editId="47774F92">
+          <wp:inline distT="0" distB="0" distL="0" distR="0" wp14:anchorId="072755E2" wp14:editId="0B167D38">
             <wp:extent cx="5600000" cy="3600000"/>
             <wp:effectExtent l="0" t="0" r="0" b="0"/>
             <wp:docPr id="241" name="Picture 241"/>
@@ -16662,7 +16662,7 @@
       <w:pPr>
         <w:pStyle w:val="Descripcin1"/>
       </w:pPr>
-      <w:bookmarkStart w:id="60" w:name="_Toc242051230"/>
+      <w:bookmarkStart w:id="60" w:name="_Toc242210548"/>
       <w:r>
         <w:t xml:space="preserve">Figura </w:t>
       </w:r>
@@ -16693,7 +16693,7 @@
       <w:pPr>
         <w:pStyle w:val="Ttulo31"/>
       </w:pPr>
-      <w:bookmarkStart w:id="61" w:name="_Toc242051351"/>
+      <w:bookmarkStart w:id="61" w:name="_Toc242210669"/>
       <w:r>
         <w:t>RF-10. Formulario de parte de trabajo</w:t>
       </w:r>
@@ -17466,7 +17466,7 @@
           <w:noProof/>
         </w:rPr>
         <w:drawing>
-          <wp:inline distT="0" distB="0" distL="0" distR="0" wp14:anchorId="47346FFA" wp14:editId="41B89ECA">
+          <wp:inline distT="0" distB="0" distL="0" distR="0" wp14:anchorId="78CE9712" wp14:editId="2886838E">
             <wp:extent cx="4789140" cy="7560000"/>
             <wp:effectExtent l="0" t="0" r="0" b="0"/>
             <wp:docPr id="242" name="Picture 242"/>
@@ -17506,7 +17506,7 @@
       <w:pPr>
         <w:pStyle w:val="Descripcin1"/>
       </w:pPr>
-      <w:bookmarkStart w:id="62" w:name="_Toc242051231"/>
+      <w:bookmarkStart w:id="62" w:name="_Toc242210549"/>
       <w:r>
         <w:t xml:space="preserve">Figura </w:t>
       </w:r>
@@ -17545,7 +17545,7 @@
           <w:noProof/>
         </w:rPr>
         <w:drawing>
-          <wp:inline distT="0" distB="0" distL="0" distR="0" wp14:anchorId="62B08479" wp14:editId="28D6EEAD">
+          <wp:inline distT="0" distB="0" distL="0" distR="0" wp14:anchorId="4B71955C" wp14:editId="5F7BBBCB">
             <wp:extent cx="4789140" cy="7560000"/>
             <wp:effectExtent l="0" t="0" r="0" b="0"/>
             <wp:docPr id="243" name="Picture 243"/>
@@ -17585,7 +17585,7 @@
       <w:pPr>
         <w:pStyle w:val="Descripcin1"/>
       </w:pPr>
-      <w:bookmarkStart w:id="63" w:name="_Toc242051232"/>
+      <w:bookmarkStart w:id="63" w:name="_Toc242210550"/>
       <w:r>
         <w:t xml:space="preserve">Figura </w:t>
       </w:r>
@@ -17624,7 +17624,7 @@
           <w:noProof/>
         </w:rPr>
         <w:drawing>
-          <wp:inline distT="0" distB="0" distL="0" distR="0" wp14:anchorId="588F18B8" wp14:editId="04B43BB1">
+          <wp:inline distT="0" distB="0" distL="0" distR="0" wp14:anchorId="28E03EA1" wp14:editId="3DCF5ED6">
             <wp:extent cx="5670000" cy="1213036"/>
             <wp:effectExtent l="0" t="0" r="0" b="0"/>
             <wp:docPr id="244" name="Picture 244"/>
@@ -17664,7 +17664,7 @@
       <w:pPr>
         <w:pStyle w:val="Descripcin1"/>
       </w:pPr>
-      <w:bookmarkStart w:id="64" w:name="_Toc242051233"/>
+      <w:bookmarkStart w:id="64" w:name="_Toc242210551"/>
       <w:r>
         <w:t xml:space="preserve">Figura </w:t>
       </w:r>
@@ -17695,7 +17695,7 @@
       <w:pPr>
         <w:pStyle w:val="Ttulo31"/>
       </w:pPr>
-      <w:bookmarkStart w:id="65" w:name="_Toc242051352"/>
+      <w:bookmarkStart w:id="65" w:name="_Toc242210670"/>
       <w:r>
         <w:t>RF-11. Mis partes</w:t>
       </w:r>
@@ -17764,7 +17764,7 @@
           <w:noProof/>
         </w:rPr>
         <w:drawing>
-          <wp:inline distT="0" distB="0" distL="0" distR="0" wp14:anchorId="1162978C" wp14:editId="0E5C89B7">
+          <wp:inline distT="0" distB="0" distL="0" distR="0" wp14:anchorId="577601FF" wp14:editId="65376DB3">
             <wp:extent cx="5600000" cy="3600000"/>
             <wp:effectExtent l="0" t="0" r="0" b="0"/>
             <wp:docPr id="245" name="Picture 245"/>
@@ -17804,7 +17804,7 @@
       <w:pPr>
         <w:pStyle w:val="Descripcin1"/>
       </w:pPr>
-      <w:bookmarkStart w:id="66" w:name="_Toc242051234"/>
+      <w:bookmarkStart w:id="66" w:name="_Toc242210552"/>
       <w:r>
         <w:t xml:space="preserve">Figura </w:t>
       </w:r>
@@ -17843,7 +17843,7 @@
           <w:noProof/>
         </w:rPr>
         <w:drawing>
-          <wp:inline distT="0" distB="0" distL="0" distR="0" wp14:anchorId="0F1BD945" wp14:editId="3A6AF0DA">
+          <wp:inline distT="0" distB="0" distL="0" distR="0" wp14:anchorId="1A78529B" wp14:editId="1505D156">
             <wp:extent cx="5040000" cy="3600000"/>
             <wp:effectExtent l="0" t="0" r="0" b="0"/>
             <wp:docPr id="246" name="Picture 246"/>
@@ -17883,7 +17883,7 @@
       <w:pPr>
         <w:pStyle w:val="Descripcin1"/>
       </w:pPr>
-      <w:bookmarkStart w:id="67" w:name="_Toc242051235"/>
+      <w:bookmarkStart w:id="67" w:name="_Toc242210553"/>
       <w:r>
         <w:t xml:space="preserve">Figura </w:t>
       </w:r>
@@ -17914,7 +17914,7 @@
       <w:pPr>
         <w:pStyle w:val="Ttulo31"/>
       </w:pPr>
-      <w:bookmarkStart w:id="68" w:name="_Toc242051353"/>
+      <w:bookmarkStart w:id="68" w:name="_Toc242210671"/>
       <w:r>
         <w:t>RF-12. Persistencia en la base de datos</w:t>
       </w:r>
@@ -17962,7 +17962,7 @@
           <w:noProof/>
         </w:rPr>
         <w:drawing>
-          <wp:inline distT="0" distB="0" distL="0" distR="0" wp14:anchorId="33A6AB4B" wp14:editId="1C063CC2">
+          <wp:inline distT="0" distB="0" distL="0" distR="0" wp14:anchorId="1B3C9F98" wp14:editId="7FC34B67">
             <wp:extent cx="5670000" cy="4282342"/>
             <wp:effectExtent l="0" t="0" r="0" b="0"/>
             <wp:docPr id="247" name="Picture 247"/>
@@ -18002,7 +18002,7 @@
       <w:pPr>
         <w:pStyle w:val="Descripcin1"/>
       </w:pPr>
-      <w:bookmarkStart w:id="69" w:name="_Toc242051236"/>
+      <w:bookmarkStart w:id="69" w:name="_Toc242210554"/>
       <w:r>
         <w:t xml:space="preserve">Figura </w:t>
       </w:r>
@@ -18042,7 +18042,7 @@
       <w:pPr>
         <w:pStyle w:val="Ttulo31"/>
       </w:pPr>
-      <w:bookmarkStart w:id="70" w:name="_Toc242051354"/>
+      <w:bookmarkStart w:id="70" w:name="_Toc242210672"/>
       <w:r>
         <w:t>RF-13. API REST documentada</w:t>
       </w:r>
@@ -18097,7 +18097,7 @@
           <w:noProof/>
         </w:rPr>
         <w:drawing>
-          <wp:inline distT="0" distB="0" distL="0" distR="0" wp14:anchorId="36559028" wp14:editId="0B88126B">
+          <wp:inline distT="0" distB="0" distL="0" distR="0" wp14:anchorId="0230AFAC" wp14:editId="20D019B3">
             <wp:extent cx="5670000" cy="4050000"/>
             <wp:effectExtent l="0" t="0" r="0" b="0"/>
             <wp:docPr id="248" name="Picture 248"/>
@@ -18137,7 +18137,7 @@
       <w:pPr>
         <w:pStyle w:val="Descripcin1"/>
       </w:pPr>
-      <w:bookmarkStart w:id="71" w:name="_Toc242051237"/>
+      <w:bookmarkStart w:id="71" w:name="_Toc242210555"/>
       <w:r>
         <w:t xml:space="preserve">Figura </w:t>
       </w:r>
@@ -18168,7 +18168,7 @@
       <w:pPr>
         <w:pStyle w:val="Ttulo21"/>
       </w:pPr>
-      <w:bookmarkStart w:id="72" w:name="_Toc242051355"/>
+      <w:bookmarkStart w:id="72" w:name="_Toc242210673"/>
       <w:r>
         <w:t>5.2 Requisitos no funcionales</w:t>
       </w:r>
@@ -18178,7 +18178,7 @@
       <w:pPr>
         <w:pStyle w:val="Ttulo31"/>
       </w:pPr>
-      <w:bookmarkStart w:id="73" w:name="_Toc242051356"/>
+      <w:bookmarkStart w:id="73" w:name="_Toc242210674"/>
       <w:r>
         <w:t>RNF-01. Seguridad</w:t>
       </w:r>
@@ -18326,7 +18326,7 @@
           <w:noProof/>
         </w:rPr>
         <w:drawing>
-          <wp:inline distT="0" distB="0" distL="0" distR="0" wp14:anchorId="7E375C13" wp14:editId="2CD43080">
+          <wp:inline distT="0" distB="0" distL="0" distR="0" wp14:anchorId="6A76B50E" wp14:editId="670CC070">
             <wp:extent cx="5670000" cy="3639109"/>
             <wp:effectExtent l="0" t="0" r="0" b="0"/>
             <wp:docPr id="249" name="Picture 249"/>
@@ -18366,7 +18366,7 @@
       <w:pPr>
         <w:pStyle w:val="Descripcin1"/>
       </w:pPr>
-      <w:bookmarkStart w:id="74" w:name="_Toc242051238"/>
+      <w:bookmarkStart w:id="74" w:name="_Toc242210556"/>
       <w:r>
         <w:t xml:space="preserve">Figura </w:t>
       </w:r>
@@ -18405,7 +18405,7 @@
           <w:noProof/>
         </w:rPr>
         <w:drawing>
-          <wp:inline distT="0" distB="0" distL="0" distR="0" wp14:anchorId="6355720B" wp14:editId="6004FE24">
+          <wp:inline distT="0" distB="0" distL="0" distR="0" wp14:anchorId="6F3F672B" wp14:editId="6E65DEB2">
             <wp:extent cx="5670000" cy="1017163"/>
             <wp:effectExtent l="0" t="0" r="0" b="0"/>
             <wp:docPr id="250" name="Picture 250"/>
@@ -18445,7 +18445,7 @@
       <w:pPr>
         <w:pStyle w:val="Descripcin1"/>
       </w:pPr>
-      <w:bookmarkStart w:id="75" w:name="_Toc242051239"/>
+      <w:bookmarkStart w:id="75" w:name="_Toc242210557"/>
       <w:r>
         <w:t xml:space="preserve">Figura </w:t>
       </w:r>
@@ -18485,7 +18485,7 @@
       <w:pPr>
         <w:pStyle w:val="Ttulo31"/>
       </w:pPr>
-      <w:bookmarkStart w:id="76" w:name="_Toc242051357"/>
+      <w:bookmarkStart w:id="76" w:name="_Toc242210675"/>
       <w:r>
         <w:t>RNF-02. Rendimiento</w:t>
       </w:r>
@@ -18516,7 +18516,7 @@
       <w:pPr>
         <w:pStyle w:val="Ttulo31"/>
       </w:pPr>
-      <w:bookmarkStart w:id="77" w:name="_Toc242051358"/>
+      <w:bookmarkStart w:id="77" w:name="_Toc242210676"/>
       <w:r>
         <w:t>RNF-03. Calidad y mantenibilidad</w:t>
       </w:r>
@@ -18617,7 +18617,7 @@
           <w:noProof/>
         </w:rPr>
         <w:drawing>
-          <wp:inline distT="0" distB="0" distL="0" distR="0" wp14:anchorId="3A96855E" wp14:editId="3B873C44">
+          <wp:inline distT="0" distB="0" distL="0" distR="0" wp14:anchorId="551D3917" wp14:editId="5D240CE2">
             <wp:extent cx="5670000" cy="3364200"/>
             <wp:effectExtent l="0" t="0" r="0" b="0"/>
             <wp:docPr id="251" name="Picture 251"/>
@@ -18657,7 +18657,7 @@
       <w:pPr>
         <w:pStyle w:val="Descripcin1"/>
       </w:pPr>
-      <w:bookmarkStart w:id="78" w:name="_Toc242051240"/>
+      <w:bookmarkStart w:id="78" w:name="_Toc242210558"/>
       <w:r>
         <w:t xml:space="preserve">Figura </w:t>
       </w:r>
@@ -18714,7 +18714,7 @@
           <w:noProof/>
         </w:rPr>
         <w:drawing>
-          <wp:inline distT="0" distB="0" distL="0" distR="0" wp14:anchorId="4E1FE3BB" wp14:editId="38704D68">
+          <wp:inline distT="0" distB="0" distL="0" distR="0" wp14:anchorId="4B0F18A9" wp14:editId="1D31EE14">
             <wp:extent cx="5670000" cy="1243200"/>
             <wp:effectExtent l="0" t="0" r="0" b="0"/>
             <wp:docPr id="252" name="Picture 252"/>
@@ -18754,7 +18754,7 @@
       <w:pPr>
         <w:pStyle w:val="Descripcin1"/>
       </w:pPr>
-      <w:bookmarkStart w:id="79" w:name="_Toc242051241"/>
+      <w:bookmarkStart w:id="79" w:name="_Toc242210559"/>
       <w:r>
         <w:t xml:space="preserve">Figura </w:t>
       </w:r>
@@ -18803,7 +18803,7 @@
       <w:pPr>
         <w:pStyle w:val="Ttulo31"/>
       </w:pPr>
-      <w:bookmarkStart w:id="80" w:name="_Toc242051359"/>
+      <w:bookmarkStart w:id="80" w:name="_Toc242210677"/>
       <w:r>
         <w:t>RNF-04. Portabilidad e instalación</w:t>
       </w:r>
@@ -18873,7 +18873,7 @@
       <w:pPr>
         <w:pStyle w:val="Ttulo31"/>
       </w:pPr>
-      <w:bookmarkStart w:id="81" w:name="_Toc242051360"/>
+      <w:bookmarkStart w:id="81" w:name="_Toc242210678"/>
       <w:r>
         <w:t>RNF-05. Usabilidad</w:t>
       </w:r>
@@ -18892,7 +18892,7 @@
       <w:pPr>
         <w:pStyle w:val="Ttulo31"/>
       </w:pPr>
-      <w:bookmarkStart w:id="82" w:name="_Toc242051361"/>
+      <w:bookmarkStart w:id="82" w:name="_Toc242210679"/>
       <w:r>
         <w:t>RNF-06. Protección de datos</w:t>
       </w:r>
@@ -18911,7 +18911,7 @@
       <w:pPr>
         <w:pStyle w:val="Ttulo11"/>
       </w:pPr>
-      <w:bookmarkStart w:id="83" w:name="_Toc242051362"/>
+      <w:bookmarkStart w:id="83" w:name="_Toc242210680"/>
       <w:r>
         <w:t>6. MANUAL DE INSTALACIÓN</w:t>
       </w:r>
@@ -18950,7 +18950,7 @@
       <w:pPr>
         <w:pStyle w:val="Ttulo21"/>
       </w:pPr>
-      <w:bookmarkStart w:id="84" w:name="_Toc242051363"/>
+      <w:bookmarkStart w:id="84" w:name="_Toc242210681"/>
       <w:r>
         <w:t>6.1 Requisitos previos</w:t>
       </w:r>
@@ -19350,7 +19350,7 @@
       <w:pPr>
         <w:pStyle w:val="Ttulo21"/>
       </w:pPr>
-      <w:bookmarkStart w:id="85" w:name="_Toc242051364"/>
+      <w:bookmarkStart w:id="85" w:name="_Toc242210682"/>
       <w:r>
         <w:t>6.2 Obtener el proyecto y crear los ficheros .env</w:t>
       </w:r>
@@ -19661,7 +19661,7 @@
       <w:pPr>
         <w:pStyle w:val="Ttulo21"/>
       </w:pPr>
-      <w:bookmarkStart w:id="86" w:name="_Toc242051365"/>
+      <w:bookmarkStart w:id="86" w:name="_Toc242210683"/>
       <w:r>
         <w:t>6.3 Arrancar la base de datos</w:t>
       </w:r>
@@ -19802,7 +19802,7 @@
           <w:noProof/>
         </w:rPr>
         <w:drawing>
-          <wp:inline distT="0" distB="0" distL="0" distR="0" wp14:anchorId="47566BC4" wp14:editId="59712800">
+          <wp:inline distT="0" distB="0" distL="0" distR="0" wp14:anchorId="1F873136" wp14:editId="2077A415">
             <wp:extent cx="5670000" cy="924382"/>
             <wp:effectExtent l="0" t="0" r="0" b="0"/>
             <wp:docPr id="253" name="Picture 253"/>
@@ -19842,7 +19842,7 @@
       <w:pPr>
         <w:pStyle w:val="Descripcin1"/>
       </w:pPr>
-      <w:bookmarkStart w:id="87" w:name="_Toc242051242"/>
+      <w:bookmarkStart w:id="87" w:name="_Toc242210560"/>
       <w:r>
         <w:t xml:space="preserve">Figura </w:t>
       </w:r>
@@ -19882,7 +19882,7 @@
       <w:pPr>
         <w:pStyle w:val="Ttulo21"/>
       </w:pPr>
-      <w:bookmarkStart w:id="88" w:name="_Toc242051366"/>
+      <w:bookmarkStart w:id="88" w:name="_Toc242210684"/>
       <w:r>
         <w:t xml:space="preserve">6.4 </w:t>
       </w:r>
@@ -20041,7 +20041,7 @@
                 <w:color w:val="1E293B"/>
                 <w:sz w:val="18"/>
               </w:rPr>
-              <w:t>python generar_datos.py      # opcional: ~100.000 partes ficticios (≈ 25 s)</w:t>
+              <w:t>python generar_datos.py      # recomendado: datos de demostración (≈ 25 s)</w:t>
             </w:r>
           </w:p>
           <w:p>
@@ -20239,7 +20239,7 @@
         <w:jc w:val="both"/>
       </w:pPr>
       <w:r>
-        <w:t xml:space="preserve">Si PowerShell bloquea </w:t>
+        <w:t xml:space="preserve">El paso </w:t>
       </w:r>
       <w:r>
         <w:rPr>
@@ -20248,10 +20248,29 @@
           <w:color w:val="0D2F38"/>
           <w:sz w:val="19"/>
         </w:rPr>
-        <w:t>Activate.ps1</w:t>
-      </w:r>
-      <w:r>
-        <w:t xml:space="preserve">, se ejecuta una vez </w:t>
+        <w:t>python generar_datos.py</w:t>
+      </w:r>
+      <w:r>
+        <w:t xml:space="preserve"> es </w:t>
+      </w:r>
+      <w:r>
+        <w:rPr>
+          <w:b/>
+          <w:color w:val="262626"/>
+        </w:rPr>
+        <w:t>recomendado</w:t>
+      </w:r>
+      <w:r>
+        <w:t xml:space="preserve">. Con el volcado y los usuarios de prueba solo hay 5 empleados y 3 partes, por lo que las pantallas del cuadro de mando (horas extra, ranking, servicios prestados y sus gráficos) aparecerían casi vacías. El script carga datos inventados (250 empleados en 25 grupos y unos 100.000 partes) con los que la aplicación se ve como en las capturas de esta memoria: se aprecia qué ve cada perfil y el rendimiento se puede medir con un volumen realista. Mantiene los usuarios de prueba y no afecta a los </w:t>
+      </w:r>
+      <w:r>
+        <w:rPr>
+          <w:noProof/>
+        </w:rPr>
+        <w:t>tests</w:t>
+      </w:r>
+      <w:r>
+        <w:t>, que usan su propia base de datos (</w:t>
       </w:r>
       <w:r>
         <w:rPr>
@@ -20260,6 +20279,39 @@
           <w:color w:val="0D2F38"/>
           <w:sz w:val="19"/>
         </w:rPr>
+        <w:t>epartes_test</w:t>
+      </w:r>
+      <w:r>
+        <w:t>).</w:t>
+      </w:r>
+    </w:p>
+    <w:p>
+      <w:pPr>
+        <w:pStyle w:val="Tokio"/>
+        <w:jc w:val="both"/>
+      </w:pPr>
+      <w:r>
+        <w:t xml:space="preserve">Si PowerShell bloquea </w:t>
+      </w:r>
+      <w:r>
+        <w:rPr>
+          <w:rFonts w:ascii="Consolas" w:hAnsi="Consolas" w:cs="Consolas"/>
+          <w:noProof/>
+          <w:color w:val="0D2F38"/>
+          <w:sz w:val="19"/>
+        </w:rPr>
+        <w:t>Activate.ps1</w:t>
+      </w:r>
+      <w:r>
+        <w:t xml:space="preserve">, se ejecuta una vez </w:t>
+      </w:r>
+      <w:r>
+        <w:rPr>
+          <w:rFonts w:ascii="Consolas" w:hAnsi="Consolas" w:cs="Consolas"/>
+          <w:noProof/>
+          <w:color w:val="0D2F38"/>
+          <w:sz w:val="19"/>
+        </w:rPr>
         <w:t>Set-ExecutionPolicy -Scope CurrentUser RemoteSigned</w:t>
       </w:r>
       <w:r>
@@ -20270,7 +20322,7 @@
       <w:pPr>
         <w:pStyle w:val="Ttulo21"/>
       </w:pPr>
-      <w:bookmarkStart w:id="89" w:name="_Toc242051367"/>
+      <w:bookmarkStart w:id="89" w:name="_Toc242210685"/>
       <w:r>
         <w:t xml:space="preserve">6.5 </w:t>
       </w:r>
@@ -20421,7 +20473,7 @@
       <w:pPr>
         <w:pStyle w:val="Ttulo21"/>
       </w:pPr>
-      <w:bookmarkStart w:id="90" w:name="_Toc242051368"/>
+      <w:bookmarkStart w:id="90" w:name="_Toc242210686"/>
       <w:r>
         <w:t>6.6 Operaciones habituales y problemas frecuentes</w:t>
       </w:r>
@@ -20907,7 +20959,7 @@
       <w:pPr>
         <w:pStyle w:val="Ttulo11"/>
       </w:pPr>
-      <w:bookmarkStart w:id="91" w:name="_Toc242051369"/>
+      <w:bookmarkStart w:id="91" w:name="_Toc242210687"/>
       <w:r>
         <w:t>7. METODOLOGÍA Y HERRAMIENTAS</w:t>
       </w:r>
@@ -20917,7 +20969,7 @@
       <w:pPr>
         <w:pStyle w:val="Ttulo21"/>
       </w:pPr>
-      <w:bookmarkStart w:id="92" w:name="_Toc242051370"/>
+      <w:bookmarkStart w:id="92" w:name="_Toc242210688"/>
       <w:r>
         <w:t>7.1 Forma de trabajo</w:t>
       </w:r>
@@ -20963,7 +21015,7 @@
       <w:pPr>
         <w:pStyle w:val="Ttulo21"/>
       </w:pPr>
-      <w:bookmarkStart w:id="93" w:name="_Toc242051371"/>
+      <w:bookmarkStart w:id="93" w:name="_Toc242210689"/>
       <w:r>
         <w:t>7.2 Uso de un asistente de inteligencia artificial</w:t>
       </w:r>
@@ -21121,7 +21173,7 @@
       <w:pPr>
         <w:pStyle w:val="Ttulo21"/>
       </w:pPr>
-      <w:bookmarkStart w:id="94" w:name="_Toc242051372"/>
+      <w:bookmarkStart w:id="94" w:name="_Toc242210690"/>
       <w:r>
         <w:t>7.3 Herramientas</w:t>
       </w:r>
@@ -21555,7 +21607,7 @@
       <w:pPr>
         <w:pStyle w:val="Ttulo11"/>
       </w:pPr>
-      <w:bookmarkStart w:id="95" w:name="_Toc242051373"/>
+      <w:bookmarkStart w:id="95" w:name="_Toc242210691"/>
       <w:r>
         <w:t>8. CONCLUSIONES</w:t>
       </w:r>
@@ -21565,7 +21617,7 @@
       <w:pPr>
         <w:pStyle w:val="Ttulo21"/>
       </w:pPr>
-      <w:bookmarkStart w:id="96" w:name="_Toc242051374"/>
+      <w:bookmarkStart w:id="96" w:name="_Toc242210692"/>
       <w:r>
         <w:t>8.1 Conclusiones generales</w:t>
       </w:r>
@@ -21593,7 +21645,7 @@
       <w:pPr>
         <w:pStyle w:val="Ttulo21"/>
       </w:pPr>
-      <w:bookmarkStart w:id="97" w:name="_Toc242051375"/>
+      <w:bookmarkStart w:id="97" w:name="_Toc242210693"/>
       <w:r>
         <w:t>8.2 Aprendizajes</w:t>
       </w:r>
@@ -21765,7 +21817,7 @@
       <w:pPr>
         <w:pStyle w:val="Ttulo21"/>
       </w:pPr>
-      <w:bookmarkStart w:id="98" w:name="_Toc242051376"/>
+      <w:bookmarkStart w:id="98" w:name="_Toc242210694"/>
       <w:r>
         <w:t>8.3 Dificultades encontradas</w:t>
       </w:r>
@@ -21837,7 +21889,7 @@
       <w:pPr>
         <w:pStyle w:val="Ttulo11"/>
       </w:pPr>
-      <w:bookmarkStart w:id="99" w:name="_Toc242051377"/>
+      <w:bookmarkStart w:id="99" w:name="_Toc242210695"/>
       <w:r>
         <w:t>9. EVOLUTIVOS DEL PROYECTO</w:t>
       </w:r>
@@ -21856,7 +21908,7 @@
       <w:pPr>
         <w:pStyle w:val="Ttulo21"/>
       </w:pPr>
-      <w:bookmarkStart w:id="100" w:name="_Toc242051378"/>
+      <w:bookmarkStart w:id="100" w:name="_Toc242210696"/>
       <w:r>
         <w:t>9.1 Mejoras funcionales</w:t>
       </w:r>
@@ -21866,7 +21918,7 @@
       <w:pPr>
         <w:pStyle w:val="Ttulo31"/>
       </w:pPr>
-      <w:bookmarkStart w:id="101" w:name="_Toc242051379"/>
+      <w:bookmarkStart w:id="101" w:name="_Toc242210697"/>
       <w:r>
         <w:t xml:space="preserve">Circuito de firmas desde el </w:t>
       </w:r>
@@ -21927,7 +21979,7 @@
       <w:pPr>
         <w:pStyle w:val="Ttulo31"/>
       </w:pPr>
-      <w:bookmarkStart w:id="102" w:name="_Toc242051380"/>
+      <w:bookmarkStart w:id="102" w:name="_Toc242210698"/>
       <w:r>
         <w:t>Indicadores de absentismo y rotación (prioridad media)</w:t>
       </w:r>
@@ -21967,7 +22019,7 @@
       <w:pPr>
         <w:pStyle w:val="Ttulo31"/>
       </w:pPr>
-      <w:bookmarkStart w:id="103" w:name="_Toc242051381"/>
+      <w:bookmarkStart w:id="103" w:name="_Toc242210699"/>
       <w:r>
         <w:t>Exportación de informes (prioridad media)</w:t>
       </w:r>
@@ -21995,7 +22047,7 @@
       <w:pPr>
         <w:pStyle w:val="Ttulo31"/>
       </w:pPr>
-      <w:bookmarkStart w:id="104" w:name="_Toc242051382"/>
+      <w:bookmarkStart w:id="104" w:name="_Toc242210700"/>
       <w:r>
         <w:t>Partes del equipo para los mandos (prioridad baja)</w:t>
       </w:r>
@@ -22014,7 +22066,7 @@
       <w:pPr>
         <w:pStyle w:val="Ttulo21"/>
       </w:pPr>
-      <w:bookmarkStart w:id="105" w:name="_Toc242051383"/>
+      <w:bookmarkStart w:id="105" w:name="_Toc242210701"/>
       <w:r>
         <w:t>9.2 Mejoras técnicas</w:t>
       </w:r>
@@ -22539,7 +22591,7 @@
       <w:pPr>
         <w:pStyle w:val="Ttulo21"/>
       </w:pPr>
-      <w:bookmarkStart w:id="106" w:name="_Toc242051384"/>
+      <w:bookmarkStart w:id="106" w:name="_Toc242210702"/>
       <w:r>
         <w:t>9.3 Hoja de ruta</w:t>
       </w:r>
@@ -22765,7 +22817,7 @@
           <wp:extent cx="1031875" cy="533000"/>
           <wp:effectExtent l="0" t="0" r="0" b="0"/>
           <wp:wrapNone/>
-          <wp:docPr id="662106660" name="Imagen 662106660"/>
+          <wp:docPr id="1246127224" name="Imagen 1246127224"/>
           <wp:cNvGraphicFramePr>
             <a:graphicFrameLocks xmlns:a="http://schemas.openxmlformats.org/drawingml/2006/main" noChangeAspect="1"/>
           </wp:cNvGraphicFramePr>
@@ -22901,7 +22953,7 @@
           <wp:extent cx="1031875" cy="533000"/>
           <wp:effectExtent l="0" t="0" r="0" b="0"/>
           <wp:wrapNone/>
-          <wp:docPr id="1030376488" name="Imagen 1030376488"/>
+          <wp:docPr id="2007734569" name="Imagen 2007734569"/>
           <wp:cNvGraphicFramePr>
             <a:graphicFrameLocks xmlns:a="http://schemas.openxmlformats.org/drawingml/2006/main" noChangeAspect="1"/>
           </wp:cNvGraphicFramePr>
@@ -23195,7 +23247,7 @@
           <wp:extent cx="350450" cy="313690"/>
           <wp:effectExtent l="0" t="0" r="0" b="0"/>
           <wp:wrapNone/>
-          <wp:docPr id="1678570247" name="Imagen 1678570247"/>
+          <wp:docPr id="2067072418" name="Imagen 2067072418"/>
           <wp:cNvGraphicFramePr>
             <a:graphicFrameLocks xmlns:a="http://schemas.openxmlformats.org/drawingml/2006/main" noChangeAspect="1"/>
           </wp:cNvGraphicFramePr>
@@ -23245,7 +23297,7 @@
         <w:lang w:eastAsia="es-ES"/>
       </w:rPr>
       <w:drawing>
-        <wp:anchor distT="0" distB="0" distL="114300" distR="114300" simplePos="0" relativeHeight="251661824" behindDoc="0" locked="0" layoutInCell="1" allowOverlap="1" wp14:anchorId="7C56FADA" wp14:editId="2FE26965">
+        <wp:anchor distT="0" distB="0" distL="114300" distR="114300" simplePos="0" relativeHeight="251660800" behindDoc="0" locked="0" layoutInCell="1" allowOverlap="1" wp14:anchorId="7C56FADA" wp14:editId="2FE26965">
           <wp:simplePos x="0" y="0"/>
           <wp:positionH relativeFrom="column">
             <wp:posOffset>-52602</wp:posOffset>
@@ -23256,7 +23308,7 @@
           <wp:extent cx="692150" cy="362585"/>
           <wp:effectExtent l="0" t="0" r="0" b="0"/>
           <wp:wrapNone/>
-          <wp:docPr id="1462394094" name="Imagen 1462394094" descr="C:\Users\Andrea\AppData\Local\Microsoft\Windows\INetCache\Content.Word\new technology school-01.png"/>
+          <wp:docPr id="188295789" name="Imagen 188295789" descr="C:\Users\Andrea\AppData\Local\Microsoft\Windows\INetCache\Content.Word\new technology school-01.png"/>
           <wp:cNvGraphicFramePr>
             <a:graphicFrameLocks xmlns:a="http://schemas.openxmlformats.org/drawingml/2006/main" noChangeAspect="1"/>
           </wp:cNvGraphicFramePr>
@@ -23334,7 +23386,7 @@
           <wp:extent cx="350450" cy="313690"/>
           <wp:effectExtent l="0" t="0" r="0" b="0"/>
           <wp:wrapNone/>
-          <wp:docPr id="802574785" name="Imagen 802574785"/>
+          <wp:docPr id="191367410" name="Imagen 191367410"/>
           <wp:cNvGraphicFramePr>
             <a:graphicFrameLocks xmlns:a="http://schemas.openxmlformats.org/drawingml/2006/main" noChangeAspect="1"/>
           </wp:cNvGraphicFramePr>
@@ -23384,7 +23436,7 @@
         <w:lang w:eastAsia="es-ES"/>
       </w:rPr>
       <w:drawing>
-        <wp:anchor distT="0" distB="0" distL="114300" distR="114300" simplePos="0" relativeHeight="251660800" behindDoc="0" locked="0" layoutInCell="1" allowOverlap="1" wp14:anchorId="7C56FADA" wp14:editId="2FE26965">
+        <wp:anchor distT="0" distB="0" distL="114300" distR="114300" simplePos="0" relativeHeight="251661824" behindDoc="0" locked="0" layoutInCell="1" allowOverlap="1" wp14:anchorId="7C56FADA" wp14:editId="2FE26965">
           <wp:simplePos x="0" y="0"/>
           <wp:positionH relativeFrom="column">
             <wp:posOffset>-52602</wp:posOffset>
@@ -23395,7 +23447,7 @@
           <wp:extent cx="692150" cy="362585"/>
           <wp:effectExtent l="0" t="0" r="0" b="0"/>
           <wp:wrapNone/>
-          <wp:docPr id="146185856" name="Imagen 146185856" descr="C:\Users\Andrea\AppData\Local\Microsoft\Windows\INetCache\Content.Word\new technology school-01.png"/>
+          <wp:docPr id="616476929" name="Imagen 616476929" descr="C:\Users\Andrea\AppData\Local\Microsoft\Windows\INetCache\Content.Word\new technology school-01.png"/>
           <wp:cNvGraphicFramePr>
             <a:graphicFrameLocks xmlns:a="http://schemas.openxmlformats.org/drawingml/2006/main" noChangeAspect="1"/>
           </wp:cNvGraphicFramePr>
@@ -23714,6 +23766,64 @@
     </w:lvl>
   </w:abstractNum>
   <w:abstractNum w:abstractNumId="3" w15:restartNumberingAfterBreak="0">
+    <w:nsid w:val="2FE93665"/>
+    <w:multiLevelType w:val="hybridMultilevel"/>
+    <w:tmpl w:val="18302E80"/>
+    <w:lvl w:ilvl="0" w:tplc="69B6DEC0">
+      <w:start w:val="1"/>
+      <w:numFmt w:val="decimal"/>
+      <w:lvlText w:val="%1."/>
+      <w:lvlJc w:val="left"/>
+      <w:pPr>
+        <w:ind w:left="360" w:hanging="300"/>
+      </w:pPr>
+    </w:lvl>
+    <w:lvl w:ilvl="1" w:tplc="225A48DE">
+      <w:start w:val="1"/>
+      <w:numFmt w:val="decimal"/>
+      <w:lvlText w:val="%2."/>
+      <w:lvlJc w:val="left"/>
+      <w:pPr>
+        <w:ind w:left="720" w:hanging="300"/>
+      </w:pPr>
+    </w:lvl>
+    <w:lvl w:ilvl="2" w:tplc="D9AEA0A8">
+      <w:numFmt w:val="decimal"/>
+      <w:lvlText w:val=""/>
+      <w:lvlJc w:val="left"/>
+    </w:lvl>
+    <w:lvl w:ilvl="3" w:tplc="E95CF5A6">
+      <w:numFmt w:val="decimal"/>
+      <w:lvlText w:val=""/>
+      <w:lvlJc w:val="left"/>
+    </w:lvl>
+    <w:lvl w:ilvl="4" w:tplc="A85420C0">
+      <w:numFmt w:val="decimal"/>
+      <w:lvlText w:val=""/>
+      <w:lvlJc w:val="left"/>
+    </w:lvl>
+    <w:lvl w:ilvl="5" w:tplc="AA38CCD8">
+      <w:numFmt w:val="decimal"/>
+      <w:lvlText w:val=""/>
+      <w:lvlJc w:val="left"/>
+    </w:lvl>
+    <w:lvl w:ilvl="6" w:tplc="2B9EB836">
+      <w:numFmt w:val="decimal"/>
+      <w:lvlText w:val=""/>
+      <w:lvlJc w:val="left"/>
+    </w:lvl>
+    <w:lvl w:ilvl="7" w:tplc="8D8A4828">
+      <w:numFmt w:val="decimal"/>
+      <w:lvlText w:val=""/>
+      <w:lvlJc w:val="left"/>
+    </w:lvl>
+    <w:lvl w:ilvl="8" w:tplc="AAEA7AEA">
+      <w:numFmt w:val="decimal"/>
+      <w:lvlText w:val=""/>
+      <w:lvlJc w:val="left"/>
+    </w:lvl>
+  </w:abstractNum>
+  <w:abstractNum w:abstractNumId="4" w15:restartNumberingAfterBreak="0">
     <w:nsid w:val="340014BA"/>
     <w:multiLevelType w:val="hybridMultilevel"/>
     <w:tmpl w:val="8BD052BE"/>
@@ -23799,7 +23909,7 @@
       </w:pPr>
     </w:lvl>
   </w:abstractNum>
-  <w:abstractNum w:abstractNumId="4" w15:restartNumberingAfterBreak="0">
+  <w:abstractNum w:abstractNumId="5" w15:restartNumberingAfterBreak="0">
     <w:nsid w:val="345842EB"/>
     <w:multiLevelType w:val="hybridMultilevel"/>
     <w:tmpl w:val="D61C7418"/>
@@ -23885,11 +23995,11 @@
       </w:pPr>
     </w:lvl>
   </w:abstractNum>
-  <w:abstractNum w:abstractNumId="5" w15:restartNumberingAfterBreak="0">
-    <w:nsid w:val="3F5675D8"/>
+  <w:abstractNum w:abstractNumId="6" w15:restartNumberingAfterBreak="0">
+    <w:nsid w:val="4E2E0075"/>
     <w:multiLevelType w:val="hybridMultilevel"/>
-    <w:tmpl w:val="623E7FE0"/>
-    <w:lvl w:ilvl="0" w:tplc="409E7230">
+    <w:tmpl w:val="697C17CE"/>
+    <w:lvl w:ilvl="0" w:tplc="A6E4E9F2">
       <w:start w:val="1"/>
       <w:numFmt w:val="bullet"/>
       <w:lvlText w:val="•"/>
@@ -23902,7 +24012,7 @@
         <w:color w:val="060E9F"/>
       </w:rPr>
     </w:lvl>
-    <w:lvl w:ilvl="1" w:tplc="16122792">
+    <w:lvl w:ilvl="1" w:tplc="713A39CA">
       <w:start w:val="1"/>
       <w:numFmt w:val="bullet"/>
       <w:lvlText w:val="–"/>
@@ -23915,43 +24025,43 @@
         <w:color w:val="060E9F"/>
       </w:rPr>
     </w:lvl>
-    <w:lvl w:ilvl="2" w:tplc="5CB4E998">
+    <w:lvl w:ilvl="2" w:tplc="58A87720">
       <w:numFmt w:val="decimal"/>
       <w:lvlText w:val=""/>
       <w:lvlJc w:val="left"/>
     </w:lvl>
-    <w:lvl w:ilvl="3" w:tplc="2FFEB1A4">
+    <w:lvl w:ilvl="3" w:tplc="662AEA9A">
       <w:numFmt w:val="decimal"/>
       <w:lvlText w:val=""/>
       <w:lvlJc w:val="left"/>
     </w:lvl>
-    <w:lvl w:ilvl="4" w:tplc="8DE0314C">
+    <w:lvl w:ilvl="4" w:tplc="AC68981C">
       <w:numFmt w:val="decimal"/>
       <w:lvlText w:val=""/>
       <w:lvlJc w:val="left"/>
     </w:lvl>
-    <w:lvl w:ilvl="5" w:tplc="96F6070C">
+    <w:lvl w:ilvl="5" w:tplc="13EA68D6">
       <w:numFmt w:val="decimal"/>
       <w:lvlText w:val=""/>
       <w:lvlJc w:val="left"/>
     </w:lvl>
-    <w:lvl w:ilvl="6" w:tplc="BB2AB1F6">
+    <w:lvl w:ilvl="6" w:tplc="4828992E">
       <w:numFmt w:val="decimal"/>
       <w:lvlText w:val=""/>
       <w:lvlJc w:val="left"/>
     </w:lvl>
-    <w:lvl w:ilvl="7" w:tplc="BBB6E812">
+    <w:lvl w:ilvl="7" w:tplc="E1CAAD76">
       <w:numFmt w:val="decimal"/>
       <w:lvlText w:val=""/>
       <w:lvlJc w:val="left"/>
     </w:lvl>
-    <w:lvl w:ilvl="8" w:tplc="B92EBBFC">
+    <w:lvl w:ilvl="8" w:tplc="041C25B8">
       <w:numFmt w:val="decimal"/>
       <w:lvlText w:val=""/>
       <w:lvlJc w:val="left"/>
     </w:lvl>
   </w:abstractNum>
-  <w:abstractNum w:abstractNumId="6" w15:restartNumberingAfterBreak="0">
+  <w:abstractNum w:abstractNumId="7" w15:restartNumberingAfterBreak="0">
     <w:nsid w:val="5BFC0AA2"/>
     <w:multiLevelType w:val="hybridMultilevel"/>
     <w:tmpl w:val="4546DA26"/>
@@ -24037,7 +24147,7 @@
       </w:pPr>
     </w:lvl>
   </w:abstractNum>
-  <w:abstractNum w:abstractNumId="7" w15:restartNumberingAfterBreak="0">
+  <w:abstractNum w:abstractNumId="8" w15:restartNumberingAfterBreak="0">
     <w:nsid w:val="676F4C8F"/>
     <w:multiLevelType w:val="hybridMultilevel"/>
     <w:tmpl w:val="494E886A"/>
@@ -24127,7 +24237,7 @@
       </w:pPr>
     </w:lvl>
   </w:abstractNum>
-  <w:abstractNum w:abstractNumId="8" w15:restartNumberingAfterBreak="0">
+  <w:abstractNum w:abstractNumId="9" w15:restartNumberingAfterBreak="0">
     <w:nsid w:val="6E6C6264"/>
     <w:multiLevelType w:val="hybridMultilevel"/>
     <w:tmpl w:val="AE9C226A"/>
@@ -24213,210 +24323,152 @@
       </w:pPr>
     </w:lvl>
   </w:abstractNum>
-  <w:abstractNum w:abstractNumId="9" w15:restartNumberingAfterBreak="0">
-    <w:nsid w:val="79A867B5"/>
-    <w:multiLevelType w:val="hybridMultilevel"/>
-    <w:tmpl w:val="8E56FFFA"/>
-    <w:lvl w:ilvl="0" w:tplc="C896A748">
-      <w:start w:val="1"/>
-      <w:numFmt w:val="decimal"/>
-      <w:lvlText w:val="%1."/>
-      <w:lvlJc w:val="left"/>
-      <w:pPr>
-        <w:ind w:left="360" w:hanging="300"/>
-      </w:pPr>
-    </w:lvl>
-    <w:lvl w:ilvl="1" w:tplc="FF4802FC">
-      <w:start w:val="1"/>
-      <w:numFmt w:val="decimal"/>
-      <w:lvlText w:val="%2."/>
-      <w:lvlJc w:val="left"/>
-      <w:pPr>
-        <w:ind w:left="720" w:hanging="300"/>
-      </w:pPr>
-    </w:lvl>
-    <w:lvl w:ilvl="2" w:tplc="ED8CA540">
-      <w:numFmt w:val="decimal"/>
-      <w:lvlText w:val=""/>
-      <w:lvlJc w:val="left"/>
-    </w:lvl>
-    <w:lvl w:ilvl="3" w:tplc="1B04E6E6">
-      <w:numFmt w:val="decimal"/>
-      <w:lvlText w:val=""/>
-      <w:lvlJc w:val="left"/>
-    </w:lvl>
-    <w:lvl w:ilvl="4" w:tplc="AB44F9AC">
-      <w:numFmt w:val="decimal"/>
-      <w:lvlText w:val=""/>
-      <w:lvlJc w:val="left"/>
-    </w:lvl>
-    <w:lvl w:ilvl="5" w:tplc="F30A59E0">
-      <w:numFmt w:val="decimal"/>
-      <w:lvlText w:val=""/>
-      <w:lvlJc w:val="left"/>
-    </w:lvl>
-    <w:lvl w:ilvl="6" w:tplc="74B6DE82">
-      <w:numFmt w:val="decimal"/>
-      <w:lvlText w:val=""/>
-      <w:lvlJc w:val="left"/>
-    </w:lvl>
-    <w:lvl w:ilvl="7" w:tplc="E2FA4C12">
-      <w:numFmt w:val="decimal"/>
-      <w:lvlText w:val=""/>
-      <w:lvlJc w:val="left"/>
-    </w:lvl>
-    <w:lvl w:ilvl="8" w:tplc="E0D0405A">
-      <w:numFmt w:val="decimal"/>
-      <w:lvlText w:val=""/>
-      <w:lvlJc w:val="left"/>
-    </w:lvl>
-  </w:abstractNum>
-  <w:num w:numId="1" w16cid:durableId="1578126536">
+  <w:num w:numId="1" w16cid:durableId="1335179920">
+    <w:abstractNumId w:val="8"/>
+  </w:num>
+  <w:num w:numId="2" w16cid:durableId="675379750">
+    <w:abstractNumId w:val="9"/>
+  </w:num>
+  <w:num w:numId="3" w16cid:durableId="1851144172">
+    <w:abstractNumId w:val="0"/>
+  </w:num>
+  <w:num w:numId="4" w16cid:durableId="1801875644">
+    <w:abstractNumId w:val="5"/>
+  </w:num>
+  <w:num w:numId="5" w16cid:durableId="1826973734">
+    <w:abstractNumId w:val="4"/>
+  </w:num>
+  <w:num w:numId="6" w16cid:durableId="1467895248">
     <w:abstractNumId w:val="7"/>
   </w:num>
-  <w:num w:numId="2" w16cid:durableId="835221333">
-    <w:abstractNumId w:val="8"/>
-  </w:num>
-  <w:num w:numId="3" w16cid:durableId="1500777159">
-    <w:abstractNumId w:val="0"/>
-  </w:num>
-  <w:num w:numId="4" w16cid:durableId="910315587">
-    <w:abstractNumId w:val="4"/>
-  </w:num>
-  <w:num w:numId="5" w16cid:durableId="39134358">
-    <w:abstractNumId w:val="3"/>
-  </w:num>
-  <w:num w:numId="6" w16cid:durableId="44333108">
-    <w:abstractNumId w:val="6"/>
-  </w:num>
-  <w:num w:numId="7" w16cid:durableId="92095925">
+  <w:num w:numId="7" w16cid:durableId="808671268">
     <w:abstractNumId w:val="1"/>
   </w:num>
-  <w:num w:numId="8" w16cid:durableId="1951623172">
+  <w:num w:numId="8" w16cid:durableId="325010641">
     <w:abstractNumId w:val="2"/>
   </w:num>
-  <w:num w:numId="9" w16cid:durableId="152962800">
-    <w:abstractNumId w:val="5"/>
+  <w:num w:numId="9" w16cid:durableId="881285563">
+    <w:abstractNumId w:val="6"/>
     <w:lvlOverride w:ilvl="0">
       <w:startOverride w:val="1"/>
     </w:lvlOverride>
   </w:num>
-  <w:num w:numId="10" w16cid:durableId="1560434191">
-    <w:abstractNumId w:val="5"/>
+  <w:num w:numId="10" w16cid:durableId="576402510">
+    <w:abstractNumId w:val="6"/>
     <w:lvlOverride w:ilvl="0">
       <w:startOverride w:val="1"/>
     </w:lvlOverride>
   </w:num>
-  <w:num w:numId="11" w16cid:durableId="1866291637">
-    <w:abstractNumId w:val="5"/>
+  <w:num w:numId="11" w16cid:durableId="1942452181">
+    <w:abstractNumId w:val="6"/>
     <w:lvlOverride w:ilvl="0">
       <w:startOverride w:val="1"/>
     </w:lvlOverride>
   </w:num>
-  <w:num w:numId="12" w16cid:durableId="932664846">
-    <w:abstractNumId w:val="5"/>
+  <w:num w:numId="12" w16cid:durableId="8411745">
+    <w:abstractNumId w:val="6"/>
     <w:lvlOverride w:ilvl="0">
       <w:startOverride w:val="1"/>
     </w:lvlOverride>
   </w:num>
-  <w:num w:numId="13" w16cid:durableId="604658567">
-    <w:abstractNumId w:val="5"/>
+  <w:num w:numId="13" w16cid:durableId="2095204497">
+    <w:abstractNumId w:val="6"/>
     <w:lvlOverride w:ilvl="0">
       <w:startOverride w:val="1"/>
     </w:lvlOverride>
   </w:num>
-  <w:num w:numId="14" w16cid:durableId="2000381294">
-    <w:abstractNumId w:val="5"/>
+  <w:num w:numId="14" w16cid:durableId="788279237">
+    <w:abstractNumId w:val="6"/>
     <w:lvlOverride w:ilvl="0">
       <w:startOverride w:val="1"/>
     </w:lvlOverride>
   </w:num>
-  <w:num w:numId="15" w16cid:durableId="95563758">
-    <w:abstractNumId w:val="5"/>
+  <w:num w:numId="15" w16cid:durableId="1806312665">
+    <w:abstractNumId w:val="6"/>
     <w:lvlOverride w:ilvl="0">
       <w:startOverride w:val="1"/>
     </w:lvlOverride>
   </w:num>
-  <w:num w:numId="16" w16cid:durableId="1670059860">
-    <w:abstractNumId w:val="5"/>
+  <w:num w:numId="16" w16cid:durableId="1239750926">
+    <w:abstractNumId w:val="6"/>
     <w:lvlOverride w:ilvl="0">
       <w:startOverride w:val="1"/>
     </w:lvlOverride>
   </w:num>
-  <w:num w:numId="17" w16cid:durableId="1655648229">
-    <w:abstractNumId w:val="5"/>
+  <w:num w:numId="17" w16cid:durableId="1505822719">
+    <w:abstractNumId w:val="6"/>
     <w:lvlOverride w:ilvl="0">
       <w:startOverride w:val="1"/>
     </w:lvlOverride>
   </w:num>
-  <w:num w:numId="18" w16cid:durableId="537087059">
-    <w:abstractNumId w:val="5"/>
+  <w:num w:numId="18" w16cid:durableId="1066031446">
+    <w:abstractNumId w:val="6"/>
     <w:lvlOverride w:ilvl="0">
       <w:startOverride w:val="1"/>
     </w:lvlOverride>
   </w:num>
-  <w:num w:numId="19" w16cid:durableId="1505509083">
-    <w:abstractNumId w:val="5"/>
+  <w:num w:numId="19" w16cid:durableId="1261986739">
+    <w:abstractNumId w:val="6"/>
     <w:lvlOverride w:ilvl="0">
       <w:startOverride w:val="1"/>
     </w:lvlOverride>
   </w:num>
-  <w:num w:numId="20" w16cid:durableId="1032878794">
-    <w:abstractNumId w:val="5"/>
+  <w:num w:numId="20" w16cid:durableId="1294099792">
+    <w:abstractNumId w:val="6"/>
     <w:lvlOverride w:ilvl="0">
       <w:startOverride w:val="1"/>
     </w:lvlOverride>
   </w:num>
-  <w:num w:numId="21" w16cid:durableId="1607467890">
-    <w:abstractNumId w:val="5"/>
+  <w:num w:numId="21" w16cid:durableId="869073706">
+    <w:abstractNumId w:val="6"/>
     <w:lvlOverride w:ilvl="0">
       <w:startOverride w:val="1"/>
     </w:lvlOverride>
   </w:num>
-  <w:num w:numId="22" w16cid:durableId="406340923">
-    <w:abstractNumId w:val="9"/>
+  <w:num w:numId="22" w16cid:durableId="2135784737">
+    <w:abstractNumId w:val="3"/>
     <w:lvlOverride w:ilvl="0">
       <w:startOverride w:val="1"/>
     </w:lvlOverride>
   </w:num>
-  <w:num w:numId="23" w16cid:durableId="1336346742">
-    <w:abstractNumId w:val="5"/>
+  <w:num w:numId="23" w16cid:durableId="310989539">
+    <w:abstractNumId w:val="6"/>
     <w:lvlOverride w:ilvl="0">
       <w:startOverride w:val="1"/>
     </w:lvlOverride>
   </w:num>
-  <w:num w:numId="24" w16cid:durableId="269969756">
-    <w:abstractNumId w:val="5"/>
+  <w:num w:numId="24" w16cid:durableId="1649554014">
+    <w:abstractNumId w:val="6"/>
     <w:lvlOverride w:ilvl="0">
       <w:startOverride w:val="1"/>
     </w:lvlOverride>
   </w:num>
-  <w:num w:numId="25" w16cid:durableId="1979338696">
-    <w:abstractNumId w:val="5"/>
+  <w:num w:numId="25" w16cid:durableId="2111390491">
+    <w:abstractNumId w:val="6"/>
     <w:lvlOverride w:ilvl="0">
       <w:startOverride w:val="1"/>
     </w:lvlOverride>
   </w:num>
-  <w:num w:numId="26" w16cid:durableId="508757071">
-    <w:abstractNumId w:val="5"/>
+  <w:num w:numId="26" w16cid:durableId="331221708">
+    <w:abstractNumId w:val="6"/>
     <w:lvlOverride w:ilvl="0">
       <w:startOverride w:val="1"/>
     </w:lvlOverride>
   </w:num>
-  <w:num w:numId="27" w16cid:durableId="892810697">
-    <w:abstractNumId w:val="5"/>
+  <w:num w:numId="27" w16cid:durableId="200674926">
+    <w:abstractNumId w:val="6"/>
     <w:lvlOverride w:ilvl="0">
       <w:startOverride w:val="1"/>
     </w:lvlOverride>
   </w:num>
-  <w:num w:numId="28" w16cid:durableId="156192884">
-    <w:abstractNumId w:val="5"/>
+  <w:num w:numId="28" w16cid:durableId="1489903696">
+    <w:abstractNumId w:val="6"/>
     <w:lvlOverride w:ilvl="0">
       <w:startOverride w:val="1"/>
     </w:lvlOverride>
   </w:num>
-  <w:num w:numId="29" w16cid:durableId="549539349">
-    <w:abstractNumId w:val="5"/>
+  <w:num w:numId="29" w16cid:durableId="2116512114">
+    <w:abstractNumId w:val="6"/>
     <w:lvlOverride w:ilvl="0">
       <w:startOverride w:val="1"/>
     </w:lvlOverride>
@@ -25170,7 +25222,7 @@
     <w:autoRedefine/>
     <w:uiPriority w:val="39"/>
     <w:unhideWhenUsed/>
-    <w:rsid w:val="0071358F"/>
+    <w:rsid w:val="000730EE"/>
     <w:pPr>
       <w:spacing w:after="100"/>
     </w:pPr>
@@ -25182,7 +25234,7 @@
     <w:autoRedefine/>
     <w:uiPriority w:val="39"/>
     <w:unhideWhenUsed/>
-    <w:rsid w:val="0071358F"/>
+    <w:rsid w:val="000730EE"/>
     <w:pPr>
       <w:spacing w:after="100"/>
       <w:ind w:left="220"/>
@@ -25195,7 +25247,7 @@
     <w:autoRedefine/>
     <w:uiPriority w:val="39"/>
     <w:unhideWhenUsed/>
-    <w:rsid w:val="0071358F"/>
+    <w:rsid w:val="000730EE"/>
     <w:pPr>
       <w:spacing w:after="100"/>
       <w:ind w:left="440"/>
@@ -25206,7 +25258,7 @@
     <w:basedOn w:val="Fuentedeprrafopredeter"/>
     <w:uiPriority w:val="99"/>
     <w:unhideWhenUsed/>
-    <w:rsid w:val="0071358F"/>
+    <w:rsid w:val="000730EE"/>
     <w:rPr>
       <w:color w:val="0563C1" w:themeColor="hyperlink"/>
       <w:u w:val="single"/>
@@ -25218,7 +25270,7 @@
     <w:next w:val="Normal"/>
     <w:uiPriority w:val="99"/>
     <w:unhideWhenUsed/>
-    <w:rsid w:val="0071358F"/>
+    <w:rsid w:val="000730EE"/>
     <w:pPr>
       <w:spacing w:after="0"/>
     </w:pPr>

</xml_diff>

<commit_message>
docs: memoria con la foto del autor en la portada
Co-Authored-By: Claude Opus 5.5 <noreply@anthropic.com>
</commit_message>
<xml_diff>
--- a/entrega/Memoria_Proyecto_Dashboard_RRHH_Ramon_Marquez.docx
+++ b/entrega/Memoria_Proyecto_Dashboard_RRHH_Ramon_Marquez.docx
@@ -498,6 +498,14 @@
       <w:pPr>
         <w:jc w:val="right"/>
         <w:rPr>
+          <w:color w:val="808080" w:themeColor="background1" w:themeShade="80"/>
+        </w:rPr>
+      </w:pPr>
+    </w:p>
+    <w:p>
+      <w:pPr>
+        <w:jc w:val="right"/>
+        <w:rPr>
           <w:color w:val="000F9F"/>
         </w:rPr>
       </w:pPr>
@@ -522,7 +530,7 @@
       <w:pPr>
         <w:jc w:val="right"/>
         <w:rPr>
-          <w:color w:val="808080" w:themeColor="background1" w:themeShade="80"/>
+          <w:color w:val="000F9F"/>
         </w:rPr>
       </w:pPr>
     </w:p>
@@ -533,35 +541,6 @@
           <w:color w:val="000F9F"/>
         </w:rPr>
       </w:pPr>
-      <w:r>
-        <w:rPr>
-          <w:noProof/>
-        </w:rPr>
-        <w:pict w14:anchorId="6571CFE5">
-          <v:shapetype id="_x0000_t75" coordsize="21600,21600" o:spt="75" o:preferrelative="t" path="m@4@5l@4@11@9@11@9@5xe" filled="f" stroked="f">
-            <v:stroke joinstyle="miter"/>
-            <v:formulas>
-              <v:f eqn="if lineDrawn pixelLineWidth 0"/>
-              <v:f eqn="sum @0 1 0"/>
-              <v:f eqn="sum 0 0 @1"/>
-              <v:f eqn="prod @2 1 2"/>
-              <v:f eqn="prod @3 21600 pixelWidth"/>
-              <v:f eqn="prod @3 21600 pixelHeight"/>
-              <v:f eqn="sum @0 0 1"/>
-              <v:f eqn="prod @6 1 2"/>
-              <v:f eqn="prod @7 21600 pixelWidth"/>
-              <v:f eqn="sum @8 21600 0"/>
-              <v:f eqn="prod @7 21600 pixelHeight"/>
-              <v:f eqn="sum @10 21600 0"/>
-            </v:formulas>
-            <v:path o:extrusionok="f" gradientshapeok="t" o:connecttype="rect"/>
-            <o:lock v:ext="edit" aspectratio="t"/>
-          </v:shapetype>
-          <v:shape id="_x0000_s2050" type="#_x0000_t75" style="position:absolute;left:0;text-align:left;margin-left:97.85pt;margin-top:-.75pt;width:348.75pt;height:340.05pt;z-index:251669504;mso-position-horizontal-relative:text;mso-position-vertical-relative:text;mso-width-relative:page;mso-height-relative:page" stroked="t" strokecolor="#000f9f" strokeweight="6pt">
-            <v:imagedata r:id="rId8" o:title="foto"/>
-          </v:shape>
-        </w:pict>
-      </w:r>
     </w:p>
     <w:p>
       <w:pPr>
@@ -578,38 +557,89 @@
           <w:color w:val="000F9F"/>
         </w:rPr>
       </w:pPr>
-    </w:p>
-    <w:p>
-      <w:pPr>
-        <w:jc w:val="right"/>
-        <w:rPr>
-          <w:color w:val="000F9F"/>
-        </w:rPr>
-      </w:pPr>
-    </w:p>
-    <w:p>
-      <w:pPr>
-        <w:jc w:val="right"/>
-        <w:rPr>
-          <w:color w:val="000F9F"/>
-        </w:rPr>
-      </w:pPr>
-    </w:p>
-    <w:p>
-      <w:pPr>
-        <w:jc w:val="right"/>
-        <w:rPr>
-          <w:color w:val="000F9F"/>
-        </w:rPr>
-      </w:pPr>
-    </w:p>
-    <w:p>
-      <w:pPr>
-        <w:jc w:val="right"/>
-        <w:rPr>
-          <w:color w:val="000F9F"/>
-        </w:rPr>
-      </w:pPr>
+      <w:r>
+        <w:rPr>
+          <w:noProof/>
+        </w:rPr>
+        <w:drawing>
+          <wp:anchor distT="0" distB="0" distL="114300" distR="114300" simplePos="0" relativeHeight="251670528" behindDoc="0" locked="0" layoutInCell="1" allowOverlap="1" wp14:anchorId="4CA34318" wp14:editId="3928A6FA">
+            <wp:simplePos x="0" y="0"/>
+            <wp:positionH relativeFrom="margin">
+              <wp:posOffset>3136900</wp:posOffset>
+            </wp:positionH>
+            <wp:positionV relativeFrom="paragraph">
+              <wp:posOffset>90170</wp:posOffset>
+            </wp:positionV>
+            <wp:extent cx="2305050" cy="2305050"/>
+            <wp:effectExtent l="171450" t="171450" r="171450" b="171450"/>
+            <wp:wrapThrough wrapText="bothSides">
+              <wp:wrapPolygon edited="0">
+                <wp:start x="-1071" y="-1607"/>
+                <wp:lineTo x="-1607" y="-1428"/>
+                <wp:lineTo x="-1607" y="21600"/>
+                <wp:lineTo x="-1071" y="23028"/>
+                <wp:lineTo x="22493" y="23028"/>
+                <wp:lineTo x="23028" y="21600"/>
+                <wp:lineTo x="23028" y="1428"/>
+                <wp:lineTo x="22493" y="-1250"/>
+                <wp:lineTo x="22493" y="-1607"/>
+                <wp:lineTo x="-1071" y="-1607"/>
+              </wp:wrapPolygon>
+            </wp:wrapThrough>
+            <wp:docPr id="1134559947" name="Imagen 6"/>
+            <wp:cNvGraphicFramePr>
+              <a:graphicFrameLocks xmlns:a="http://schemas.openxmlformats.org/drawingml/2006/main" noChangeAspect="1"/>
+            </wp:cNvGraphicFramePr>
+            <a:graphic xmlns:a="http://schemas.openxmlformats.org/drawingml/2006/main">
+              <a:graphicData uri="http://schemas.openxmlformats.org/drawingml/2006/picture">
+                <pic:pic xmlns:pic="http://schemas.openxmlformats.org/drawingml/2006/picture">
+                  <pic:nvPicPr>
+                    <pic:cNvPr id="1134559947" name="Imagen 1134559947"/>
+                    <pic:cNvPicPr/>
+                  </pic:nvPicPr>
+                  <pic:blipFill>
+                    <a:blip r:embed="rId8">
+                      <a:extLst>
+                        <a:ext uri="{28A0092B-C50C-407E-A947-70E740481C1C}">
+                          <a14:useLocalDpi xmlns:a14="http://schemas.microsoft.com/office/drawing/2010/main" val="0"/>
+                        </a:ext>
+                      </a:extLst>
+                    </a:blip>
+                    <a:stretch>
+                      <a:fillRect/>
+                    </a:stretch>
+                  </pic:blipFill>
+                  <pic:spPr>
+                    <a:xfrm>
+                      <a:off x="0" y="0"/>
+                      <a:ext cx="2305050" cy="2305050"/>
+                    </a:xfrm>
+                    <a:prstGeom prst="rect">
+                      <a:avLst/>
+                    </a:prstGeom>
+                    <a:ln w="158750">
+                      <a:solidFill>
+                        <a:schemeClr val="accent1">
+                          <a:lumMod val="50000"/>
+                        </a:schemeClr>
+                      </a:solidFill>
+                    </a:ln>
+                    <a:effectLst>
+                      <a:softEdge rad="63500"/>
+                    </a:effectLst>
+                  </pic:spPr>
+                </pic:pic>
+              </a:graphicData>
+            </a:graphic>
+            <wp14:sizeRelH relativeFrom="margin">
+              <wp14:pctWidth>0</wp14:pctWidth>
+            </wp14:sizeRelH>
+            <wp14:sizeRelV relativeFrom="margin">
+              <wp14:pctHeight>0</wp14:pctHeight>
+            </wp14:sizeRelV>
+          </wp:anchor>
+        </w:drawing>
+      </w:r>
     </w:p>
     <w:p>
       <w:pPr>
@@ -767,6 +797,7 @@
         <w:spacing w:after="320"/>
       </w:pPr>
       <w:r>
+        <w:lastRenderedPageBreak/>
         <w:t>ÍNDICE DE CONTENIDOS</w:t>
       </w:r>
     </w:p>
@@ -6048,6 +6079,7 @@
         <w:spacing w:after="320"/>
       </w:pPr>
       <w:r>
+        <w:lastRenderedPageBreak/>
         <w:t>ÍNDICE DE FIGURAS</w:t>
       </w:r>
     </w:p>
@@ -8522,6 +8554,7 @@
       </w:pPr>
       <w:bookmarkStart w:id="0" w:name="_Toc242210632"/>
       <w:r>
+        <w:lastRenderedPageBreak/>
         <w:t>1. DESCRIPCIÓN GENERAL DEL PROYECTO</w:t>
       </w:r>
       <w:bookmarkEnd w:id="0"/>
@@ -8863,6 +8896,7 @@
           <w:b/>
           <w:color w:val="262626"/>
         </w:rPr>
+        <w:lastRenderedPageBreak/>
         <w:t>Formulario de parte de trabajo</w:t>
       </w:r>
       <w:r>
@@ -8879,12 +8913,21 @@
         <w:spacing w:after="160"/>
         <w:jc w:val="both"/>
       </w:pPr>
+      <w:proofErr w:type="gramStart"/>
       <w:r>
         <w:rPr>
           <w:b/>
           <w:color w:val="262626"/>
         </w:rPr>
-        <w:t>API documentada con Swagger</w:t>
+        <w:t>API documentada</w:t>
+      </w:r>
+      <w:proofErr w:type="gramEnd"/>
+      <w:r>
+        <w:rPr>
+          <w:b/>
+          <w:color w:val="262626"/>
+        </w:rPr>
+        <w:t xml:space="preserve"> con Swagger</w:t>
       </w:r>
       <w:r>
         <w:t xml:space="preserve">, instalación con Docker, datos de demostración ficticios y una batería de 191 </w:t>
@@ -9212,6 +9255,7 @@
       </w:pPr>
       <w:bookmarkStart w:id="5" w:name="_Toc242210637"/>
       <w:r>
+        <w:lastRenderedPageBreak/>
         <w:t>1.5 Arquitectura</w:t>
       </w:r>
       <w:bookmarkEnd w:id="5"/>
@@ -9355,6 +9399,7 @@
       </w:pPr>
       <w:bookmarkStart w:id="7" w:name="_Toc242210638"/>
       <w:r>
+        <w:lastRenderedPageBreak/>
         <w:t>2. OBJETIVOS Y ALCANCE DEL PROYECTO</w:t>
       </w:r>
       <w:bookmarkEnd w:id="7"/>
@@ -10300,6 +10345,7 @@
       </w:pPr>
       <w:bookmarkStart w:id="10" w:name="_Toc242210641"/>
       <w:r>
+        <w:lastRenderedPageBreak/>
         <w:t>2.3 Alcance: qué queda fuera</w:t>
       </w:r>
       <w:bookmarkEnd w:id="10"/>
@@ -10324,7 +10370,15 @@
         <w:t>dashboard</w:t>
       </w:r>
       <w:r>
-        <w:t xml:space="preserve"> muestra el estado pero no lo cambia.</w:t>
+        <w:t xml:space="preserve"> muestra el </w:t>
+      </w:r>
+      <w:proofErr w:type="gramStart"/>
+      <w:r>
+        <w:t>estado</w:t>
+      </w:r>
+      <w:proofErr w:type="gramEnd"/>
+      <w:r>
+        <w:t xml:space="preserve"> pero no lo cambia.</w:t>
       </w:r>
     </w:p>
     <w:p>
@@ -10547,7 +10601,21 @@
               <w:rPr>
                 <w:sz w:val="19"/>
               </w:rPr>
-              <w:t>Integración en caliente con la BD de la app Java</w:t>
+              <w:t xml:space="preserve">Integración en caliente con la BD de la </w:t>
+            </w:r>
+            <w:proofErr w:type="gramStart"/>
+            <w:r>
+              <w:rPr>
+                <w:sz w:val="19"/>
+              </w:rPr>
+              <w:t>app</w:t>
+            </w:r>
+            <w:proofErr w:type="gramEnd"/>
+            <w:r>
+              <w:rPr>
+                <w:sz w:val="19"/>
+              </w:rPr>
+              <w:t xml:space="preserve"> Java</w:t>
             </w:r>
           </w:p>
         </w:tc>
@@ -10925,6 +10993,7 @@
       </w:pPr>
       <w:bookmarkStart w:id="12" w:name="_Toc242210643"/>
       <w:r>
+        <w:lastRenderedPageBreak/>
         <w:t>3. STACK TECNOLÓGICO Y ALTERNATIVAS EVALUADAS</w:t>
       </w:r>
       <w:bookmarkEnd w:id="12"/>
@@ -11243,7 +11312,21 @@
               <w:rPr>
                 <w:sz w:val="19"/>
               </w:rPr>
-              <w:t xml:space="preserve"> 2.0 (Flask-SQLAlchemy) + </w:t>
+              <w:t xml:space="preserve"> 2.0 (Flask-</w:t>
+            </w:r>
+            <w:proofErr w:type="spellStart"/>
+            <w:r>
+              <w:rPr>
+                <w:sz w:val="19"/>
+              </w:rPr>
+              <w:t>SQLAlchemy</w:t>
+            </w:r>
+            <w:proofErr w:type="spellEnd"/>
+            <w:r>
+              <w:rPr>
+                <w:sz w:val="19"/>
+              </w:rPr>
+              <w:t xml:space="preserve">) + </w:t>
             </w:r>
             <w:r>
               <w:rPr>
@@ -11959,6 +12042,7 @@
       <w:r>
         <w:t xml:space="preserve"> y sus migraciones están pensados para que la aplicación sea dueña del esquema, y aquí el esquema pertenece a la aplicación Java y no se puede modificar. </w:t>
       </w:r>
+      <w:proofErr w:type="spellStart"/>
       <w:r>
         <w:rPr>
           <w:b/>
@@ -11966,6 +12050,7 @@
         </w:rPr>
         <w:t>FastAPI</w:t>
       </w:r>
+      <w:proofErr w:type="spellEnd"/>
       <w:r>
         <w:t xml:space="preserve"> ofrece validación con tipos y alto rendimiento asíncrono, pero el acceso a MySQL es síncrono y el curso se centra en </w:t>
       </w:r>
@@ -12005,6 +12090,7 @@
       </w:pPr>
       <w:bookmarkStart w:id="16" w:name="_Toc242210647"/>
       <w:r>
+        <w:lastRenderedPageBreak/>
         <w:t xml:space="preserve">Base de datos: </w:t>
       </w:r>
       <w:r>
@@ -12026,12 +12112,21 @@
       <w:r>
         <w:t xml:space="preserve">Producción usa MySQL. Para el entorno local se eligió </w:t>
       </w:r>
+      <w:proofErr w:type="spellStart"/>
       <w:r>
         <w:rPr>
           <w:b/>
           <w:color w:val="262626"/>
         </w:rPr>
-        <w:t>MariaDB 12.3</w:t>
+        <w:t>MariaDB</w:t>
+      </w:r>
+      <w:proofErr w:type="spellEnd"/>
+      <w:r>
+        <w:rPr>
+          <w:b/>
+          <w:color w:val="262626"/>
+        </w:rPr>
+        <w:t xml:space="preserve"> 12.3</w:t>
       </w:r>
       <w:r>
         <w:t xml:space="preserve"> en Docker porque el volcado disponible procede de </w:t>
@@ -12043,14 +12138,24 @@
         <w:t>MariaDB</w:t>
       </w:r>
       <w:r>
-        <w:t>, ambos motores comparten dialecto SQL y el driver es el mismo (</w:t>
-      </w:r>
+        <w:t xml:space="preserve">, ambos motores comparten dialecto SQL y el </w:t>
+      </w:r>
+      <w:proofErr w:type="gramStart"/>
+      <w:r>
+        <w:t>driver</w:t>
+      </w:r>
+      <w:proofErr w:type="gramEnd"/>
+      <w:r>
+        <w:t xml:space="preserve"> es el mismo (</w:t>
+      </w:r>
+      <w:proofErr w:type="spellStart"/>
       <w:r>
         <w:rPr>
           <w:noProof/>
         </w:rPr>
         <w:t>PyMySQL</w:t>
       </w:r>
+      <w:proofErr w:type="spellEnd"/>
       <w:r>
         <w:t>). Para que las mediciones sean representativas se replicó el esquema real: misma codificación (</w:t>
       </w:r>
@@ -12243,6 +12348,7 @@
       </w:pPr>
       <w:bookmarkStart w:id="20" w:name="_Toc242210651"/>
       <w:r>
+        <w:lastRenderedPageBreak/>
         <w:t>4. MODELO DE DATOS</w:t>
       </w:r>
       <w:bookmarkEnd w:id="20"/>
@@ -12350,6 +12456,7 @@
       </w:pPr>
       <w:bookmarkStart w:id="22" w:name="_Toc242210653"/>
       <w:r>
+        <w:lastRenderedPageBreak/>
         <w:t>4.2 Esquema</w:t>
       </w:r>
       <w:bookmarkEnd w:id="22"/>
@@ -12457,12 +12564,14 @@
       <w:r>
         <w:t>/</w:t>
       </w:r>
+      <w:proofErr w:type="spellStart"/>
       <w:r>
         <w:rPr>
           <w:noProof/>
         </w:rPr>
         <w:t>modelo_datos.drawio</w:t>
       </w:r>
+      <w:proofErr w:type="spellEnd"/>
       <w:r>
         <w:t>).</w:t>
       </w:r>
@@ -12474,6 +12583,7 @@
       </w:pPr>
       <w:bookmarkStart w:id="24" w:name="_Toc242210654"/>
       <w:r>
+        <w:lastRenderedPageBreak/>
         <w:t>4.3 Descripción de las tablas</w:t>
       </w:r>
       <w:bookmarkEnd w:id="24"/>
@@ -12948,12 +13058,14 @@
               <w:pStyle w:val="Tokio"/>
               <w:spacing w:after="0" w:line="252" w:lineRule="auto"/>
             </w:pPr>
+            <w:proofErr w:type="gramStart"/>
             <w:r>
               <w:rPr>
                 <w:sz w:val="19"/>
               </w:rPr>
               <w:t>STATUS</w:t>
             </w:r>
+            <w:proofErr w:type="gramEnd"/>
           </w:p>
         </w:tc>
         <w:tc>
@@ -13660,6 +13772,7 @@
               <w:rPr>
                 <w:sz w:val="19"/>
               </w:rPr>
+              <w:lastRenderedPageBreak/>
               <w:t>Motivos</w:t>
             </w:r>
           </w:p>
@@ -14138,13 +14251,7 @@
               <w:rPr>
                 <w:sz w:val="19"/>
               </w:rPr>
-              <w:t>−</w:t>
-            </w:r>
-            <w:r>
-              <w:rPr>
-                <w:sz w:val="19"/>
-              </w:rPr>
-              <w:t>46 % respecto al escenario 1</w:t>
+              <w:t>−46 % respecto al escenario 1</w:t>
             </w:r>
           </w:p>
         </w:tc>
@@ -14201,13 +14308,7 @@
               <w:rPr>
                 <w:sz w:val="19"/>
               </w:rPr>
-              <w:t>−</w:t>
-            </w:r>
-            <w:r>
-              <w:rPr>
-                <w:sz w:val="19"/>
-              </w:rPr>
-              <w:t>25 % respecto a producción</w:t>
+              <w:t>−25 % respecto a producción</w:t>
             </w:r>
           </w:p>
         </w:tc>
@@ -14316,6 +14417,7 @@
         <w:rPr>
           <w:noProof/>
         </w:rPr>
+        <w:lastRenderedPageBreak/>
         <w:drawing>
           <wp:inline distT="0" distB="0" distL="0" distR="0" wp14:anchorId="58D405B9" wp14:editId="58EC8011">
             <wp:extent cx="5670000" cy="1989654"/>
@@ -14399,6 +14501,7 @@
       </w:pPr>
       <w:bookmarkStart w:id="29" w:name="_Toc242210658"/>
       <w:r>
+        <w:lastRenderedPageBreak/>
         <w:t>5. REQUISITOS DE LA APLICACIÓN</w:t>
       </w:r>
       <w:bookmarkEnd w:id="29"/>
@@ -14478,11 +14581,22 @@
           <w:color w:val="0D2F38"/>
           <w:sz w:val="19"/>
         </w:rPr>
-        <w:t>Tirme2026!</w:t>
+        <w:t>Tirme</w:t>
+      </w:r>
+      <w:proofErr w:type="gramStart"/>
+      <w:r>
+        <w:rPr>
+          <w:rFonts w:ascii="Consolas" w:hAnsi="Consolas" w:cs="Consolas"/>
+          <w:noProof/>
+          <w:color w:val="0D2F38"/>
+          <w:sz w:val="19"/>
+        </w:rPr>
+        <w:t>2026!</w:t>
       </w:r>
       <w:r>
         <w:t>.</w:t>
       </w:r>
+      <w:proofErr w:type="gramEnd"/>
     </w:p>
     <w:p>
       <w:pPr>
@@ -14668,6 +14782,7 @@
         <w:rPr>
           <w:noProof/>
         </w:rPr>
+        <w:lastRenderedPageBreak/>
         <w:drawing>
           <wp:inline distT="0" distB="0" distL="0" distR="0" wp14:anchorId="1855BBAC" wp14:editId="2C0D7480">
             <wp:extent cx="3789473" cy="2879999"/>
@@ -14885,6 +15000,7 @@
         <w:jc w:val="both"/>
       </w:pPr>
       <w:r>
+        <w:lastRenderedPageBreak/>
         <w:t xml:space="preserve">El filtrado se aplica </w:t>
       </w:r>
       <w:r>
@@ -14897,6 +15013,7 @@
       <w:r>
         <w:t>: todas las consultas pasan por un filtro de perfil central (</w:t>
       </w:r>
+      <w:proofErr w:type="spellStart"/>
       <w:r>
         <w:rPr>
           <w:rFonts w:ascii="Consolas" w:hAnsi="Consolas" w:cs="Consolas"/>
@@ -14904,7 +15021,17 @@
           <w:color w:val="0D2F38"/>
           <w:sz w:val="19"/>
         </w:rPr>
-        <w:t>services/acceso.py</w:t>
+        <w:t>services</w:t>
+      </w:r>
+      <w:proofErr w:type="spellEnd"/>
+      <w:r>
+        <w:rPr>
+          <w:rFonts w:ascii="Consolas" w:hAnsi="Consolas" w:cs="Consolas"/>
+          <w:noProof/>
+          <w:color w:val="0D2F38"/>
+          <w:sz w:val="19"/>
+        </w:rPr>
+        <w:t>/acceso.py</w:t>
       </w:r>
       <w:r>
         <w:t xml:space="preserve">) y el decorador </w:t>
@@ -15091,6 +15218,7 @@
         <w:rPr>
           <w:noProof/>
         </w:rPr>
+        <w:lastRenderedPageBreak/>
         <w:drawing>
           <wp:inline distT="0" distB="0" distL="0" distR="0" wp14:anchorId="22DBB9BF" wp14:editId="62719426">
             <wp:extent cx="1091368" cy="3239999"/>
@@ -15258,6 +15386,7 @@
         <w:rPr>
           <w:noProof/>
         </w:rPr>
+        <w:lastRenderedPageBreak/>
         <w:drawing>
           <wp:inline distT="0" distB="0" distL="0" distR="0" wp14:anchorId="6893EC2B" wp14:editId="0DD81DA4">
             <wp:extent cx="5600000" cy="3600000"/>
@@ -15411,6 +15540,7 @@
       </w:pPr>
       <w:bookmarkStart w:id="42" w:name="_Toc242210662"/>
       <w:r>
+        <w:lastRenderedPageBreak/>
         <w:t>RF-03. Mantenimiento y cierre de la sesión</w:t>
       </w:r>
       <w:bookmarkEnd w:id="42"/>
@@ -15599,6 +15729,7 @@
         <w:rPr>
           <w:noProof/>
         </w:rPr>
+        <w:lastRenderedPageBreak/>
         <w:drawing>
           <wp:inline distT="0" distB="0" distL="0" distR="0" wp14:anchorId="1246E18E" wp14:editId="4447D07D">
             <wp:extent cx="5600000" cy="3600000"/>
@@ -15752,6 +15883,7 @@
       </w:pPr>
       <w:bookmarkStart w:id="47" w:name="_Toc242210664"/>
       <w:r>
+        <w:lastRenderedPageBreak/>
         <w:t>RF-05. Directorio de personal</w:t>
       </w:r>
       <w:bookmarkEnd w:id="47"/>
@@ -15888,6 +16020,7 @@
         <w:rPr>
           <w:noProof/>
         </w:rPr>
+        <w:lastRenderedPageBreak/>
         <w:drawing>
           <wp:inline distT="0" distB="0" distL="0" distR="0" wp14:anchorId="1C0C0F10" wp14:editId="15AA87F2">
             <wp:extent cx="5600000" cy="3600000"/>
@@ -16041,6 +16174,7 @@
       </w:pPr>
       <w:bookmarkStart w:id="51" w:name="_Toc242210665"/>
       <w:r>
+        <w:lastRenderedPageBreak/>
         <w:t>RF-06. Horas extra por periodos</w:t>
       </w:r>
       <w:bookmarkEnd w:id="51"/>
@@ -16112,6 +16246,7 @@
         <w:rPr>
           <w:noProof/>
         </w:rPr>
+        <w:lastRenderedPageBreak/>
         <w:drawing>
           <wp:inline distT="0" distB="0" distL="0" distR="0" wp14:anchorId="59CF9D49" wp14:editId="0CD1D1B7">
             <wp:extent cx="5670000" cy="5969700"/>
@@ -16191,6 +16326,7 @@
         <w:rPr>
           <w:noProof/>
         </w:rPr>
+        <w:lastRenderedPageBreak/>
         <w:drawing>
           <wp:inline distT="0" distB="0" distL="0" distR="0" wp14:anchorId="686704F0" wp14:editId="53355283">
             <wp:extent cx="5600000" cy="3600000"/>
@@ -16344,6 +16480,7 @@
       </w:pPr>
       <w:bookmarkStart w:id="55" w:name="_Toc242210666"/>
       <w:r>
+        <w:lastRenderedPageBreak/>
         <w:t>RF-07. Horas extra por empleado</w:t>
       </w:r>
       <w:bookmarkEnd w:id="55"/>
@@ -16358,8 +16495,13 @@
         <w:spacing w:after="80"/>
         <w:jc w:val="both"/>
       </w:pPr>
-      <w:r>
-        <w:t>Total de horas extra de cada trabajador en el periodo elegido, con el total general.</w:t>
+      <w:proofErr w:type="gramStart"/>
+      <w:r>
+        <w:t>Total</w:t>
+      </w:r>
+      <w:proofErr w:type="gramEnd"/>
+      <w:r>
+        <w:t xml:space="preserve"> de horas extra de cada trabajador en el periodo elegido, con el total general.</w:t>
       </w:r>
     </w:p>
     <w:p>
@@ -16476,7 +16618,23 @@
         <w:jc w:val="both"/>
       </w:pPr>
       <w:r>
-        <w:t>Por trabajador: horas combo programadas, total de horas extra, horas compensables y su conversión a horas de descanso (diurna laborable × 1,6; diurna festiva y nocturna laborable × 2; nocturna festiva × 2,5).</w:t>
+        <w:t xml:space="preserve">Por trabajador: horas </w:t>
+      </w:r>
+      <w:proofErr w:type="gramStart"/>
+      <w:r>
+        <w:t>combo programadas</w:t>
+      </w:r>
+      <w:proofErr w:type="gramEnd"/>
+      <w:r>
+        <w:t>, total de horas extra, horas compensables y su conversión a horas de descanso (</w:t>
+      </w:r>
+      <w:proofErr w:type="gramStart"/>
+      <w:r>
+        <w:t>diurna laborable</w:t>
+      </w:r>
+      <w:proofErr w:type="gramEnd"/>
+      <w:r>
+        <w:t xml:space="preserve"> × 1,6; diurna festiva y nocturna laborable × 2; nocturna festiva × 2,5).</w:t>
       </w:r>
     </w:p>
     <w:p>
@@ -16504,6 +16662,7 @@
         <w:rPr>
           <w:noProof/>
         </w:rPr>
+        <w:lastRenderedPageBreak/>
         <w:drawing>
           <wp:inline distT="0" distB="0" distL="0" distR="0" wp14:anchorId="1E070BA6" wp14:editId="0F5691E2">
             <wp:extent cx="5600000" cy="3600000"/>
@@ -16578,7 +16737,15 @@
       </w:pPr>
       <w:bookmarkStart w:id="59" w:name="_Toc242210668"/>
       <w:r>
-        <w:t>RF-09. Total de servicios prestados (SP)</w:t>
+        <w:t xml:space="preserve">RF-09. </w:t>
+      </w:r>
+      <w:proofErr w:type="gramStart"/>
+      <w:r>
+        <w:t>Total</w:t>
+      </w:r>
+      <w:proofErr w:type="gramEnd"/>
+      <w:r>
+        <w:t xml:space="preserve"> de servicios prestados (SP)</w:t>
       </w:r>
       <w:bookmarkEnd w:id="59"/>
     </w:p>
@@ -16621,6 +16788,7 @@
         <w:rPr>
           <w:noProof/>
         </w:rPr>
+        <w:lastRenderedPageBreak/>
         <w:drawing>
           <wp:inline distT="0" distB="0" distL="0" distR="0" wp14:anchorId="072755E2" wp14:editId="0B167D38">
             <wp:extent cx="5600000" cy="3600000"/>
@@ -16717,6 +16885,7 @@
       <w:r>
         <w:t xml:space="preserve"> partes. El formulario se construye a partir de una definición que sirve la API, de forma que las etiquetas y los bloques se cambian en un único fichero (</w:t>
       </w:r>
+      <w:proofErr w:type="spellStart"/>
       <w:r>
         <w:rPr>
           <w:rFonts w:ascii="Consolas" w:hAnsi="Consolas" w:cs="Consolas"/>
@@ -16724,7 +16893,17 @@
           <w:color w:val="0D2F38"/>
           <w:sz w:val="19"/>
         </w:rPr>
-        <w:t>services/parte_campos.py</w:t>
+        <w:t>services</w:t>
+      </w:r>
+      <w:proofErr w:type="spellEnd"/>
+      <w:r>
+        <w:rPr>
+          <w:rFonts w:ascii="Consolas" w:hAnsi="Consolas" w:cs="Consolas"/>
+          <w:noProof/>
+          <w:color w:val="0D2F38"/>
+          <w:sz w:val="19"/>
+        </w:rPr>
+        <w:t>/parte_campos.py</w:t>
       </w:r>
       <w:r>
         <w:t>). Se organiza en cinco bloques:</w:t>
@@ -16890,6 +17069,7 @@
                 <w:color w:val="FFFFFF"/>
                 <w:sz w:val="19"/>
               </w:rPr>
+              <w:lastRenderedPageBreak/>
               <w:t>N.º</w:t>
             </w:r>
           </w:p>
@@ -17465,6 +17645,7 @@
         <w:rPr>
           <w:noProof/>
         </w:rPr>
+        <w:lastRenderedPageBreak/>
         <w:drawing>
           <wp:inline distT="0" distB="0" distL="0" distR="0" wp14:anchorId="78CE9712" wp14:editId="2886838E">
             <wp:extent cx="4789140" cy="7560000"/>
@@ -17544,6 +17725,7 @@
         <w:rPr>
           <w:noProof/>
         </w:rPr>
+        <w:lastRenderedPageBreak/>
         <w:drawing>
           <wp:inline distT="0" distB="0" distL="0" distR="0" wp14:anchorId="4B71955C" wp14:editId="5F7BBBCB">
             <wp:extent cx="4789140" cy="7560000"/>
@@ -17623,6 +17805,7 @@
         <w:rPr>
           <w:noProof/>
         </w:rPr>
+        <w:lastRenderedPageBreak/>
         <w:drawing>
           <wp:inline distT="0" distB="0" distL="0" distR="0" wp14:anchorId="28E03EA1" wp14:editId="3DCF5ED6">
             <wp:extent cx="5670000" cy="1213036"/>
@@ -17687,7 +17870,15 @@
         <w:fldChar w:fldCharType="end"/>
       </w:r>
       <w:r>
-        <w:t>. El servidor rechaza el mismo parte aunque se envíe sin pasar por el formulario.</w:t>
+        <w:t xml:space="preserve">. El servidor rechaza el mismo </w:t>
+      </w:r>
+      <w:proofErr w:type="gramStart"/>
+      <w:r>
+        <w:t>parte</w:t>
+      </w:r>
+      <w:proofErr w:type="gramEnd"/>
+      <w:r>
+        <w:t xml:space="preserve"> aunque se envíe sin pasar por el formulario.</w:t>
       </w:r>
       <w:bookmarkEnd w:id="64"/>
     </w:p>
@@ -17842,6 +18033,7 @@
         <w:rPr>
           <w:noProof/>
         </w:rPr>
+        <w:lastRenderedPageBreak/>
         <w:drawing>
           <wp:inline distT="0" distB="0" distL="0" distR="0" wp14:anchorId="1A78529B" wp14:editId="1505D156">
             <wp:extent cx="5040000" cy="3600000"/>
@@ -17938,7 +18130,15 @@
         <w:t>zparte</w:t>
       </w:r>
       <w:r>
-        <w:t xml:space="preserve"> con el mismo formato que usa la aplicación Java, por lo que aparece inmediatamente en el circuito de firmas y en el resto de pantallas del </w:t>
+        <w:t xml:space="preserve"> con el mismo formato que usa la aplicación Java, por lo que aparece inmediatamente en el circuito de firmas y en el resto de </w:t>
+      </w:r>
+      <w:proofErr w:type="gramStart"/>
+      <w:r>
+        <w:t>pantallas</w:t>
+      </w:r>
+      <w:proofErr w:type="gramEnd"/>
+      <w:r>
+        <w:t xml:space="preserve"> del </w:t>
       </w:r>
       <w:r>
         <w:rPr>
@@ -17961,6 +18161,7 @@
         <w:rPr>
           <w:noProof/>
         </w:rPr>
+        <w:lastRenderedPageBreak/>
         <w:drawing>
           <wp:inline distT="0" distB="0" distL="0" distR="0" wp14:anchorId="1B3C9F98" wp14:editId="7FC34B67">
             <wp:extent cx="5670000" cy="4282342"/>
@@ -18068,7 +18269,15 @@
         <w:t>endpoints</w:t>
       </w:r>
       <w:r>
-        <w:t>: autenticación (/api/login, /api/get-roles, /api/me), partes y cuadro de mando (/api/partes/…) y partes del propio empleado (/api/mis-partes/…), 20 en total.</w:t>
+        <w:t>: autenticación (/api/login, /api/</w:t>
+      </w:r>
+      <w:proofErr w:type="spellStart"/>
+      <w:r>
+        <w:t>get</w:t>
+      </w:r>
+      <w:proofErr w:type="spellEnd"/>
+      <w:r>
+        <w:t>-roles, /api/me), partes y cuadro de mando (/api/partes/…) y partes del propio empleado (/api/mis-partes/…), 20 en total.</w:t>
       </w:r>
     </w:p>
     <w:p>
@@ -18082,7 +18291,23 @@
         <w:jc w:val="both"/>
       </w:pPr>
       <w:r>
-        <w:t>Documentación interactiva en /api/doc con el botón «Authorize» para probar con un token.</w:t>
+        <w:t>Documentación interactiva en /api/</w:t>
+      </w:r>
+      <w:proofErr w:type="spellStart"/>
+      <w:r>
+        <w:t>doc</w:t>
+      </w:r>
+      <w:proofErr w:type="spellEnd"/>
+      <w:r>
+        <w:t xml:space="preserve"> con el botón «</w:t>
+      </w:r>
+      <w:proofErr w:type="spellStart"/>
+      <w:r>
+        <w:t>Authorize</w:t>
+      </w:r>
+      <w:proofErr w:type="spellEnd"/>
+      <w:r>
+        <w:t>» para probar con un token.</w:t>
       </w:r>
     </w:p>
     <w:p>
@@ -18096,6 +18321,7 @@
         <w:rPr>
           <w:noProof/>
         </w:rPr>
+        <w:lastRenderedPageBreak/>
         <w:drawing>
           <wp:inline distT="0" distB="0" distL="0" distR="0" wp14:anchorId="0230AFAC" wp14:editId="20D019B3">
             <wp:extent cx="5670000" cy="4050000"/>
@@ -18255,7 +18481,11 @@
         <w:jc w:val="both"/>
       </w:pPr>
       <w:r>
-        <w:t>Secretos fuera del repositorio (</w:t>
+        <w:t xml:space="preserve">Secretos fuera del repositorio </w:t>
+      </w:r>
+      <w:proofErr w:type="gramStart"/>
+      <w:r>
+        <w:t>(</w:t>
       </w:r>
       <w:r>
         <w:rPr>
@@ -18264,11 +18494,9 @@
           <w:color w:val="0D2F38"/>
           <w:sz w:val="19"/>
         </w:rPr>
-        <w:t>.env</w:t>
-      </w:r>
-      <w:r>
-        <w:t xml:space="preserve"> ignorado por Git; solo se versiona </w:t>
-      </w:r>
+        <w:t>.</w:t>
+      </w:r>
+      <w:proofErr w:type="spellStart"/>
       <w:r>
         <w:rPr>
           <w:rFonts w:ascii="Consolas" w:hAnsi="Consolas" w:cs="Consolas"/>
@@ -18276,7 +18504,35 @@
           <w:color w:val="0D2F38"/>
           <w:sz w:val="19"/>
         </w:rPr>
-        <w:t>.env.example</w:t>
+        <w:t>env</w:t>
+      </w:r>
+      <w:proofErr w:type="spellEnd"/>
+      <w:proofErr w:type="gramEnd"/>
+      <w:r>
+        <w:t xml:space="preserve"> ignorado por Git; solo se </w:t>
+      </w:r>
+      <w:proofErr w:type="gramStart"/>
+      <w:r>
+        <w:t xml:space="preserve">versiona </w:t>
+      </w:r>
+      <w:r>
+        <w:rPr>
+          <w:rFonts w:ascii="Consolas" w:hAnsi="Consolas" w:cs="Consolas"/>
+          <w:noProof/>
+          <w:color w:val="0D2F38"/>
+          <w:sz w:val="19"/>
+        </w:rPr>
+        <w:t>.env</w:t>
+      </w:r>
+      <w:proofErr w:type="gramEnd"/>
+      <w:r>
+        <w:rPr>
+          <w:rFonts w:ascii="Consolas" w:hAnsi="Consolas" w:cs="Consolas"/>
+          <w:noProof/>
+          <w:color w:val="0D2F38"/>
+          <w:sz w:val="19"/>
+        </w:rPr>
+        <w:t>.example</w:t>
       </w:r>
       <w:r>
         <w:t>).</w:t>
@@ -18325,6 +18581,7 @@
         <w:rPr>
           <w:noProof/>
         </w:rPr>
+        <w:lastRenderedPageBreak/>
         <w:drawing>
           <wp:inline distT="0" distB="0" distL="0" distR="0" wp14:anchorId="6A76B50E" wp14:editId="670CC070">
             <wp:extent cx="5670000" cy="3639109"/>
@@ -18518,6 +18775,7 @@
       </w:pPr>
       <w:bookmarkStart w:id="77" w:name="_Toc242210676"/>
       <w:r>
+        <w:lastRenderedPageBreak/>
         <w:t>RNF-03. Calidad y mantenibilidad</w:t>
       </w:r>
       <w:bookmarkEnd w:id="77"/>
@@ -18540,7 +18798,71 @@
         <w:t>Programación orientada a objetos</w:t>
       </w:r>
       <w:r>
-        <w:t xml:space="preserve">: servicios como clases con una responsabilidad cada una (RolService, AuthService, HorasExtraService, PlantillaService, SpService, ParteService, ParteValidator, FiltroPartesBuilder…) y modelos </w:t>
+        <w:t>: servicios como clases con una responsabilidad cada una (</w:t>
+      </w:r>
+      <w:proofErr w:type="spellStart"/>
+      <w:r>
+        <w:t>RolService</w:t>
+      </w:r>
+      <w:proofErr w:type="spellEnd"/>
+      <w:r>
+        <w:t xml:space="preserve">, </w:t>
+      </w:r>
+      <w:proofErr w:type="spellStart"/>
+      <w:r>
+        <w:t>AuthService</w:t>
+      </w:r>
+      <w:proofErr w:type="spellEnd"/>
+      <w:r>
+        <w:t xml:space="preserve">, </w:t>
+      </w:r>
+      <w:proofErr w:type="spellStart"/>
+      <w:r>
+        <w:t>HorasExtraService</w:t>
+      </w:r>
+      <w:proofErr w:type="spellEnd"/>
+      <w:r>
+        <w:t xml:space="preserve">, </w:t>
+      </w:r>
+      <w:proofErr w:type="spellStart"/>
+      <w:r>
+        <w:t>PlantillaService</w:t>
+      </w:r>
+      <w:proofErr w:type="spellEnd"/>
+      <w:r>
+        <w:t xml:space="preserve">, </w:t>
+      </w:r>
+      <w:proofErr w:type="spellStart"/>
+      <w:r>
+        <w:t>SpService</w:t>
+      </w:r>
+      <w:proofErr w:type="spellEnd"/>
+      <w:r>
+        <w:t xml:space="preserve">, </w:t>
+      </w:r>
+      <w:proofErr w:type="spellStart"/>
+      <w:r>
+        <w:t>ParteService</w:t>
+      </w:r>
+      <w:proofErr w:type="spellEnd"/>
+      <w:r>
+        <w:t xml:space="preserve">, </w:t>
+      </w:r>
+      <w:proofErr w:type="spellStart"/>
+      <w:r>
+        <w:t>ParteValidator</w:t>
+      </w:r>
+      <w:proofErr w:type="spellEnd"/>
+      <w:r>
+        <w:t xml:space="preserve">, </w:t>
+      </w:r>
+      <w:proofErr w:type="spellStart"/>
+      <w:r>
+        <w:t>FiltroPartesBuilder</w:t>
+      </w:r>
+      <w:proofErr w:type="spellEnd"/>
+      <w:r>
+        <w:t xml:space="preserve">…) y modelos </w:t>
       </w:r>
       <w:r>
         <w:rPr>
@@ -18581,7 +18903,23 @@
           <w:b/>
           <w:color w:val="262626"/>
         </w:rPr>
-        <w:t>191 tests automáticos</w:t>
+        <w:t xml:space="preserve">191 </w:t>
+      </w:r>
+      <w:proofErr w:type="spellStart"/>
+      <w:r>
+        <w:rPr>
+          <w:b/>
+          <w:color w:val="262626"/>
+        </w:rPr>
+        <w:t>tests</w:t>
+      </w:r>
+      <w:proofErr w:type="spellEnd"/>
+      <w:r>
+        <w:rPr>
+          <w:b/>
+          <w:color w:val="262626"/>
+        </w:rPr>
+        <w:t xml:space="preserve"> automáticos</w:t>
       </w:r>
       <w:r>
         <w:t xml:space="preserve">: 159 en el </w:t>
@@ -18875,6 +19213,7 @@
       </w:pPr>
       <w:bookmarkStart w:id="81" w:name="_Toc242210678"/>
       <w:r>
+        <w:lastRenderedPageBreak/>
         <w:t>RNF-05. Usabilidad</w:t>
       </w:r>
       <w:bookmarkEnd w:id="81"/>
@@ -18913,6 +19252,7 @@
       </w:pPr>
       <w:bookmarkStart w:id="83" w:name="_Toc242210680"/>
       <w:r>
+        <w:lastRenderedPageBreak/>
         <w:t>6. MANUAL DE INSTALACIÓN</w:t>
       </w:r>
       <w:bookmarkEnd w:id="83"/>
@@ -18940,7 +19280,23 @@
           <w:b/>
           <w:color w:val="262626"/>
         </w:rPr>
-        <w:t>Linux (bash)</w:t>
+        <w:t>Linux (</w:t>
+      </w:r>
+      <w:proofErr w:type="spellStart"/>
+      <w:r>
+        <w:rPr>
+          <w:b/>
+          <w:color w:val="262626"/>
+        </w:rPr>
+        <w:t>bash</w:t>
+      </w:r>
+      <w:proofErr w:type="spellEnd"/>
+      <w:r>
+        <w:rPr>
+          <w:b/>
+          <w:color w:val="262626"/>
+        </w:rPr>
+        <w:t>)</w:t>
       </w:r>
       <w:r>
         <w:t>.</w:t>
@@ -19095,10 +19451,14 @@
             <w:pPr>
               <w:pStyle w:val="Tokio"/>
               <w:spacing w:after="0" w:line="252" w:lineRule="auto"/>
-            </w:pPr>
-            <w:r>
-              <w:rPr>
-                <w:sz w:val="19"/>
+              <w:rPr>
+                <w:lang w:val="en-GB"/>
+              </w:rPr>
+            </w:pPr>
+            <w:r>
+              <w:rPr>
+                <w:sz w:val="19"/>
+                <w:lang w:val="en-GB"/>
               </w:rPr>
               <w:t>python --version (Linux: python3 --version)</w:t>
             </w:r>
@@ -19156,12 +19516,28 @@
               <w:pStyle w:val="Tokio"/>
               <w:spacing w:after="0" w:line="252" w:lineRule="auto"/>
             </w:pPr>
-            <w:r>
-              <w:rPr>
-                <w:sz w:val="19"/>
-              </w:rPr>
-              <w:t>node --version</w:t>
-            </w:r>
+            <w:proofErr w:type="spellStart"/>
+            <w:r>
+              <w:rPr>
+                <w:sz w:val="19"/>
+              </w:rPr>
+              <w:t>node</w:t>
+            </w:r>
+            <w:proofErr w:type="spellEnd"/>
+            <w:r>
+              <w:rPr>
+                <w:sz w:val="19"/>
+              </w:rPr>
+              <w:t xml:space="preserve"> --</w:t>
+            </w:r>
+            <w:proofErr w:type="spellStart"/>
+            <w:r>
+              <w:rPr>
+                <w:sz w:val="19"/>
+              </w:rPr>
+              <w:t>version</w:t>
+            </w:r>
+            <w:proofErr w:type="spellEnd"/>
           </w:p>
         </w:tc>
       </w:tr>
@@ -19226,11 +19602,19 @@
               <w:pStyle w:val="Tokio"/>
               <w:spacing w:after="0" w:line="252" w:lineRule="auto"/>
             </w:pPr>
-            <w:r>
-              <w:rPr>
-                <w:sz w:val="19"/>
-              </w:rPr>
-              <w:t xml:space="preserve">docker </w:t>
+            <w:proofErr w:type="spellStart"/>
+            <w:r>
+              <w:rPr>
+                <w:sz w:val="19"/>
+              </w:rPr>
+              <w:t>docker</w:t>
+            </w:r>
+            <w:proofErr w:type="spellEnd"/>
+            <w:r>
+              <w:rPr>
+                <w:sz w:val="19"/>
+              </w:rPr>
+              <w:t xml:space="preserve"> </w:t>
             </w:r>
             <w:r>
               <w:rPr>
@@ -19243,8 +19627,16 @@
               <w:rPr>
                 <w:sz w:val="19"/>
               </w:rPr>
-              <w:t xml:space="preserve"> version</w:t>
-            </w:r>
+              <w:t xml:space="preserve"> </w:t>
+            </w:r>
+            <w:proofErr w:type="spellStart"/>
+            <w:r>
+              <w:rPr>
+                <w:sz w:val="19"/>
+              </w:rPr>
+              <w:t>version</w:t>
+            </w:r>
+            <w:proofErr w:type="spellEnd"/>
           </w:p>
         </w:tc>
       </w:tr>
@@ -19299,12 +19691,28 @@
               <w:pStyle w:val="Tokio"/>
               <w:spacing w:after="0" w:line="252" w:lineRule="auto"/>
             </w:pPr>
-            <w:r>
-              <w:rPr>
-                <w:sz w:val="19"/>
-              </w:rPr>
-              <w:t>git --version</w:t>
-            </w:r>
+            <w:proofErr w:type="spellStart"/>
+            <w:r>
+              <w:rPr>
+                <w:sz w:val="19"/>
+              </w:rPr>
+              <w:t>git</w:t>
+            </w:r>
+            <w:proofErr w:type="spellEnd"/>
+            <w:r>
+              <w:rPr>
+                <w:sz w:val="19"/>
+              </w:rPr>
+              <w:t xml:space="preserve"> --</w:t>
+            </w:r>
+            <w:proofErr w:type="spellStart"/>
+            <w:r>
+              <w:rPr>
+                <w:sz w:val="19"/>
+              </w:rPr>
+              <w:t>version</w:t>
+            </w:r>
+            <w:proofErr w:type="spellEnd"/>
           </w:p>
         </w:tc>
       </w:tr>
@@ -19321,7 +19729,15 @@
         <w:jc w:val="both"/>
       </w:pPr>
       <w:r>
-        <w:t xml:space="preserve">En Windows, al instalar Python hay que marcar «Add python.exe to PATH», y Docker Desktop debe estar abierto. En Debian/Ubuntu: </w:t>
+        <w:t xml:space="preserve">En Windows, al instalar Python hay que marcar «Add python.exe </w:t>
+      </w:r>
+      <w:proofErr w:type="spellStart"/>
+      <w:r>
+        <w:t>to</w:t>
+      </w:r>
+      <w:proofErr w:type="spellEnd"/>
+      <w:r>
+        <w:t xml:space="preserve"> PATH», y Docker Desktop debe estar abierto. En Debian/Ubuntu: </w:t>
       </w:r>
       <w:r>
         <w:rPr>
@@ -19333,7 +19749,15 @@
         <w:t>sudo apt install -y python3 python3-venv python3-pip git</w:t>
       </w:r>
       <w:r>
-        <w:t xml:space="preserve">, Docker Engine según la guía oficial y Node.js 22/24. El puerto </w:t>
+        <w:t xml:space="preserve">, Docker </w:t>
+      </w:r>
+      <w:proofErr w:type="spellStart"/>
+      <w:r>
+        <w:t>Engine</w:t>
+      </w:r>
+      <w:proofErr w:type="spellEnd"/>
+      <w:r>
+        <w:t xml:space="preserve"> según la guía oficial y Node.js 22/24. El puerto </w:t>
       </w:r>
       <w:r>
         <w:rPr>
@@ -19352,9 +19776,19 @@
       </w:pPr>
       <w:bookmarkStart w:id="85" w:name="_Toc242210682"/>
       <w:r>
-        <w:t>6.2 Obtener el proyecto y crear los ficheros .env</w:t>
+        <w:t xml:space="preserve">6.2 Obtener el proyecto y crear los </w:t>
+      </w:r>
+      <w:proofErr w:type="gramStart"/>
+      <w:r>
+        <w:t>ficheros .</w:t>
+      </w:r>
+      <w:proofErr w:type="spellStart"/>
+      <w:r>
+        <w:t>env</w:t>
       </w:r>
       <w:bookmarkEnd w:id="85"/>
+      <w:proofErr w:type="spellEnd"/>
+      <w:proofErr w:type="gramEnd"/>
     </w:p>
     <w:p>
       <w:pPr>
@@ -19435,6 +19869,9 @@
             <w:pPr>
               <w:pStyle w:val="Tokio"/>
               <w:spacing w:after="0" w:line="240" w:lineRule="auto"/>
+              <w:rPr>
+                <w:lang w:val="en-GB"/>
+              </w:rPr>
             </w:pPr>
             <w:r>
               <w:rPr>
@@ -19442,6 +19879,7 @@
                 <w:noProof/>
                 <w:color w:val="6B7280"/>
                 <w:sz w:val="18"/>
+                <w:lang w:val="en-GB"/>
               </w:rPr>
               <w:t># Windows (PowerShell)</w:t>
             </w:r>
@@ -19450,6 +19888,9 @@
             <w:pPr>
               <w:pStyle w:val="Tokio"/>
               <w:spacing w:after="0" w:line="240" w:lineRule="auto"/>
+              <w:rPr>
+                <w:lang w:val="en-GB"/>
+              </w:rPr>
             </w:pPr>
             <w:r>
               <w:rPr>
@@ -19457,6 +19898,7 @@
                 <w:noProof/>
                 <w:color w:val="1E293B"/>
                 <w:sz w:val="18"/>
+                <w:lang w:val="en-GB"/>
               </w:rPr>
               <w:t>Copy-Item .env.example .env</w:t>
             </w:r>
@@ -19465,6 +19907,9 @@
             <w:pPr>
               <w:pStyle w:val="Tokio"/>
               <w:spacing w:after="0" w:line="240" w:lineRule="auto"/>
+              <w:rPr>
+                <w:lang w:val="en-GB"/>
+              </w:rPr>
             </w:pPr>
             <w:r>
               <w:rPr>
@@ -19472,6 +19917,7 @@
                 <w:noProof/>
                 <w:color w:val="1E293B"/>
                 <w:sz w:val="18"/>
+                <w:lang w:val="en-GB"/>
               </w:rPr>
               <w:t>Copy-Item dashboard_rrhh\.env.example dashboard_rrhh\.env</w:t>
             </w:r>
@@ -19480,6 +19926,9 @@
             <w:pPr>
               <w:pStyle w:val="Tokio"/>
               <w:spacing w:after="0" w:line="240" w:lineRule="auto"/>
+              <w:rPr>
+                <w:lang w:val="en-GB"/>
+              </w:rPr>
             </w:pPr>
             <w:r>
               <w:rPr>
@@ -19487,6 +19936,7 @@
                 <w:noProof/>
                 <w:color w:val="1E293B"/>
                 <w:sz w:val="18"/>
+                <w:lang w:val="en-GB"/>
               </w:rPr>
               <w:t xml:space="preserve"> </w:t>
             </w:r>
@@ -19495,6 +19945,9 @@
             <w:pPr>
               <w:pStyle w:val="Tokio"/>
               <w:spacing w:after="0" w:line="240" w:lineRule="auto"/>
+              <w:rPr>
+                <w:lang w:val="en-GB"/>
+              </w:rPr>
             </w:pPr>
             <w:r>
               <w:rPr>
@@ -19502,6 +19955,7 @@
                 <w:noProof/>
                 <w:color w:val="6B7280"/>
                 <w:sz w:val="18"/>
+                <w:lang w:val="en-GB"/>
               </w:rPr>
               <w:t># Linux</w:t>
             </w:r>
@@ -19510,6 +19964,9 @@
             <w:pPr>
               <w:pStyle w:val="Tokio"/>
               <w:spacing w:after="0" w:line="240" w:lineRule="auto"/>
+              <w:rPr>
+                <w:lang w:val="en-GB"/>
+              </w:rPr>
             </w:pPr>
             <w:r>
               <w:rPr>
@@ -19517,6 +19974,7 @@
                 <w:noProof/>
                 <w:color w:val="1E293B"/>
                 <w:sz w:val="18"/>
+                <w:lang w:val="en-GB"/>
               </w:rPr>
               <w:t>cp .env.example .env</w:t>
             </w:r>
@@ -19525,6 +19983,9 @@
             <w:pPr>
               <w:pStyle w:val="Tokio"/>
               <w:spacing w:after="0" w:line="240" w:lineRule="auto"/>
+              <w:rPr>
+                <w:lang w:val="en-GB"/>
+              </w:rPr>
             </w:pPr>
             <w:r>
               <w:rPr>
@@ -19532,6 +19993,7 @@
                 <w:noProof/>
                 <w:color w:val="1E293B"/>
                 <w:sz w:val="18"/>
+                <w:lang w:val="en-GB"/>
               </w:rPr>
               <w:t>cp dashboard_rrhh/.env.example dashboard_rrhh/.env</w:t>
             </w:r>
@@ -19543,6 +20005,9 @@
       <w:pPr>
         <w:pStyle w:val="Tokio"/>
         <w:spacing w:after="40"/>
+        <w:rPr>
+          <w:lang w:val="en-GB"/>
+        </w:rPr>
       </w:pPr>
     </w:p>
     <w:p>
@@ -19637,6 +20102,9 @@
             <w:pPr>
               <w:pStyle w:val="Tokio"/>
               <w:spacing w:after="0" w:line="240" w:lineRule="auto"/>
+              <w:rPr>
+                <w:lang w:val="en-GB"/>
+              </w:rPr>
             </w:pPr>
             <w:r>
               <w:rPr>
@@ -19644,6 +20112,7 @@
                 <w:noProof/>
                 <w:color w:val="1E293B"/>
                 <w:sz w:val="18"/>
+                <w:lang w:val="en-GB"/>
               </w:rPr>
               <w:t>python -c "import secrets; print(secrets.token_hex(32))"</w:t>
             </w:r>
@@ -19655,6 +20124,9 @@
       <w:pPr>
         <w:pStyle w:val="Tokio"/>
         <w:spacing w:after="40"/>
+        <w:rPr>
+          <w:lang w:val="en-GB"/>
+        </w:rPr>
       </w:pPr>
     </w:p>
     <w:p>
@@ -19663,6 +20135,7 @@
       </w:pPr>
       <w:bookmarkStart w:id="86" w:name="_Toc242210683"/>
       <w:r>
+        <w:lastRenderedPageBreak/>
         <w:t>6.3 Arrancar la base de datos</w:t>
       </w:r>
       <w:bookmarkEnd w:id="86"/>
@@ -19943,6 +20416,9 @@
             <w:pPr>
               <w:pStyle w:val="Tokio"/>
               <w:spacing w:after="0" w:line="240" w:lineRule="auto"/>
+              <w:rPr>
+                <w:lang w:val="en-GB"/>
+              </w:rPr>
             </w:pPr>
             <w:r>
               <w:rPr>
@@ -19950,6 +20426,7 @@
                 <w:noProof/>
                 <w:color w:val="6B7280"/>
                 <w:sz w:val="18"/>
+                <w:lang w:val="en-GB"/>
               </w:rPr>
               <w:t># Windows (PowerShell)</w:t>
             </w:r>
@@ -19958,6 +20435,9 @@
             <w:pPr>
               <w:pStyle w:val="Tokio"/>
               <w:spacing w:after="0" w:line="240" w:lineRule="auto"/>
+              <w:rPr>
+                <w:lang w:val="en-GB"/>
+              </w:rPr>
             </w:pPr>
             <w:r>
               <w:rPr>
@@ -19965,6 +20445,7 @@
                 <w:noProof/>
                 <w:color w:val="1E293B"/>
                 <w:sz w:val="18"/>
+                <w:lang w:val="en-GB"/>
               </w:rPr>
               <w:t>cd dashboard_rrhh</w:t>
             </w:r>
@@ -19973,6 +20454,9 @@
             <w:pPr>
               <w:pStyle w:val="Tokio"/>
               <w:spacing w:after="0" w:line="240" w:lineRule="auto"/>
+              <w:rPr>
+                <w:lang w:val="en-GB"/>
+              </w:rPr>
             </w:pPr>
             <w:r>
               <w:rPr>
@@ -19980,6 +20464,7 @@
                 <w:noProof/>
                 <w:color w:val="1E293B"/>
                 <w:sz w:val="18"/>
+                <w:lang w:val="en-GB"/>
               </w:rPr>
               <w:t>python -m venv venv</w:t>
             </w:r>
@@ -19988,6 +20473,9 @@
             <w:pPr>
               <w:pStyle w:val="Tokio"/>
               <w:spacing w:after="0" w:line="240" w:lineRule="auto"/>
+              <w:rPr>
+                <w:lang w:val="en-GB"/>
+              </w:rPr>
             </w:pPr>
             <w:r>
               <w:rPr>
@@ -19995,6 +20483,7 @@
                 <w:noProof/>
                 <w:color w:val="1E293B"/>
                 <w:sz w:val="18"/>
+                <w:lang w:val="en-GB"/>
               </w:rPr>
               <w:t>.\venv\Scripts\Activate.ps1</w:t>
             </w:r>
@@ -20003,6 +20492,9 @@
             <w:pPr>
               <w:pStyle w:val="Tokio"/>
               <w:spacing w:after="0" w:line="240" w:lineRule="auto"/>
+              <w:rPr>
+                <w:lang w:val="en-GB"/>
+              </w:rPr>
             </w:pPr>
             <w:r>
               <w:rPr>
@@ -20010,6 +20502,7 @@
                 <w:noProof/>
                 <w:color w:val="1E293B"/>
                 <w:sz w:val="18"/>
+                <w:lang w:val="en-GB"/>
               </w:rPr>
               <w:t>python -m pip install -r requirements.txt</w:t>
             </w:r>
@@ -20048,6 +20541,9 @@
             <w:pPr>
               <w:pStyle w:val="Tokio"/>
               <w:spacing w:after="0" w:line="240" w:lineRule="auto"/>
+              <w:rPr>
+                <w:lang w:val="en-GB"/>
+              </w:rPr>
             </w:pPr>
             <w:r>
               <w:rPr>
@@ -20055,6 +20551,7 @@
                 <w:noProof/>
                 <w:color w:val="1E293B"/>
                 <w:sz w:val="18"/>
+                <w:lang w:val="en-GB"/>
               </w:rPr>
               <w:t>python -m pytest             # 159 passed</w:t>
             </w:r>
@@ -20063,6 +20560,9 @@
             <w:pPr>
               <w:pStyle w:val="Tokio"/>
               <w:spacing w:after="0" w:line="240" w:lineRule="auto"/>
+              <w:rPr>
+                <w:lang w:val="en-GB"/>
+              </w:rPr>
             </w:pPr>
             <w:r>
               <w:rPr>
@@ -20070,6 +20570,7 @@
                 <w:noProof/>
                 <w:color w:val="1E293B"/>
                 <w:sz w:val="18"/>
+                <w:lang w:val="en-GB"/>
               </w:rPr>
               <w:t>python app.py</w:t>
             </w:r>
@@ -20078,6 +20579,9 @@
             <w:pPr>
               <w:pStyle w:val="Tokio"/>
               <w:spacing w:after="0" w:line="240" w:lineRule="auto"/>
+              <w:rPr>
+                <w:lang w:val="en-GB"/>
+              </w:rPr>
             </w:pPr>
             <w:r>
               <w:rPr>
@@ -20085,6 +20589,7 @@
                 <w:noProof/>
                 <w:color w:val="1E293B"/>
                 <w:sz w:val="18"/>
+                <w:lang w:val="en-GB"/>
               </w:rPr>
               <w:t xml:space="preserve"> </w:t>
             </w:r>
@@ -20093,6 +20598,9 @@
             <w:pPr>
               <w:pStyle w:val="Tokio"/>
               <w:spacing w:after="0" w:line="240" w:lineRule="auto"/>
+              <w:rPr>
+                <w:lang w:val="en-GB"/>
+              </w:rPr>
             </w:pPr>
             <w:r>
               <w:rPr>
@@ -20100,6 +20608,7 @@
                 <w:noProof/>
                 <w:color w:val="6B7280"/>
                 <w:sz w:val="18"/>
+                <w:lang w:val="en-GB"/>
               </w:rPr>
               <w:t># Linux</w:t>
             </w:r>
@@ -20108,6 +20617,9 @@
             <w:pPr>
               <w:pStyle w:val="Tokio"/>
               <w:spacing w:after="0" w:line="240" w:lineRule="auto"/>
+              <w:rPr>
+                <w:lang w:val="en-GB"/>
+              </w:rPr>
             </w:pPr>
             <w:r>
               <w:rPr>
@@ -20115,6 +20627,7 @@
                 <w:noProof/>
                 <w:color w:val="1E293B"/>
                 <w:sz w:val="18"/>
+                <w:lang w:val="en-GB"/>
               </w:rPr>
               <w:t>cd dashboard_rrhh</w:t>
             </w:r>
@@ -20123,6 +20636,9 @@
             <w:pPr>
               <w:pStyle w:val="Tokio"/>
               <w:spacing w:after="0" w:line="240" w:lineRule="auto"/>
+              <w:rPr>
+                <w:lang w:val="en-GB"/>
+              </w:rPr>
             </w:pPr>
             <w:r>
               <w:rPr>
@@ -20130,6 +20646,7 @@
                 <w:noProof/>
                 <w:color w:val="1E293B"/>
                 <w:sz w:val="18"/>
+                <w:lang w:val="en-GB"/>
               </w:rPr>
               <w:t>python3 -m venv venv</w:t>
             </w:r>
@@ -20138,6 +20655,9 @@
             <w:pPr>
               <w:pStyle w:val="Tokio"/>
               <w:spacing w:after="0" w:line="240" w:lineRule="auto"/>
+              <w:rPr>
+                <w:lang w:val="en-GB"/>
+              </w:rPr>
             </w:pPr>
             <w:r>
               <w:rPr>
@@ -20145,6 +20665,7 @@
                 <w:noProof/>
                 <w:color w:val="1E293B"/>
                 <w:sz w:val="18"/>
+                <w:lang w:val="en-GB"/>
               </w:rPr>
               <w:t>source venv/bin/activate</w:t>
             </w:r>
@@ -20153,6 +20674,9 @@
             <w:pPr>
               <w:pStyle w:val="Tokio"/>
               <w:spacing w:after="0" w:line="240" w:lineRule="auto"/>
+              <w:rPr>
+                <w:lang w:val="en-GB"/>
+              </w:rPr>
             </w:pPr>
             <w:r>
               <w:rPr>
@@ -20160,6 +20684,7 @@
                 <w:noProof/>
                 <w:color w:val="1E293B"/>
                 <w:sz w:val="18"/>
+                <w:lang w:val="en-GB"/>
               </w:rPr>
               <w:t>python -m pip install -r requirements.txt</w:t>
             </w:r>
@@ -20168,6 +20693,9 @@
             <w:pPr>
               <w:pStyle w:val="Tokio"/>
               <w:spacing w:after="0" w:line="240" w:lineRule="auto"/>
+              <w:rPr>
+                <w:lang w:val="en-GB"/>
+              </w:rPr>
             </w:pPr>
             <w:r>
               <w:rPr>
@@ -20175,6 +20703,7 @@
                 <w:noProof/>
                 <w:color w:val="1E293B"/>
                 <w:sz w:val="18"/>
+                <w:lang w:val="en-GB"/>
               </w:rPr>
               <w:t>python seed.py</w:t>
             </w:r>
@@ -20183,6 +20712,9 @@
             <w:pPr>
               <w:pStyle w:val="Tokio"/>
               <w:spacing w:after="0" w:line="240" w:lineRule="auto"/>
+              <w:rPr>
+                <w:lang w:val="en-GB"/>
+              </w:rPr>
             </w:pPr>
             <w:r>
               <w:rPr>
@@ -20190,6 +20722,7 @@
                 <w:noProof/>
                 <w:color w:val="1E293B"/>
                 <w:sz w:val="18"/>
+                <w:lang w:val="en-GB"/>
               </w:rPr>
               <w:t>python generar_datos.py</w:t>
             </w:r>
@@ -20198,6 +20731,9 @@
             <w:pPr>
               <w:pStyle w:val="Tokio"/>
               <w:spacing w:after="0" w:line="240" w:lineRule="auto"/>
+              <w:rPr>
+                <w:lang w:val="en-GB"/>
+              </w:rPr>
             </w:pPr>
             <w:r>
               <w:rPr>
@@ -20205,6 +20741,7 @@
                 <w:noProof/>
                 <w:color w:val="1E293B"/>
                 <w:sz w:val="18"/>
+                <w:lang w:val="en-GB"/>
               </w:rPr>
               <w:t>python -m pytest</w:t>
             </w:r>
@@ -20272,6 +20809,7 @@
       <w:r>
         <w:t>, que usan su propia base de datos (</w:t>
       </w:r>
+      <w:proofErr w:type="spellStart"/>
       <w:r>
         <w:rPr>
           <w:rFonts w:ascii="Consolas" w:hAnsi="Consolas" w:cs="Consolas"/>
@@ -20281,6 +20819,7 @@
         </w:rPr>
         <w:t>epartes_test</w:t>
       </w:r>
+      <w:proofErr w:type="spellEnd"/>
       <w:r>
         <w:t>).</w:t>
       </w:r>
@@ -20291,6 +20830,7 @@
         <w:jc w:val="both"/>
       </w:pPr>
       <w:r>
+        <w:lastRenderedPageBreak/>
         <w:t xml:space="preserve">Si PowerShell bloquea </w:t>
       </w:r>
       <w:r>
@@ -20374,6 +20914,9 @@
             <w:pPr>
               <w:pStyle w:val="Tokio"/>
               <w:spacing w:after="0" w:line="240" w:lineRule="auto"/>
+              <w:rPr>
+                <w:lang w:val="en-GB"/>
+              </w:rPr>
             </w:pPr>
             <w:r>
               <w:rPr>
@@ -20381,6 +20924,7 @@
                 <w:noProof/>
                 <w:color w:val="1E293B"/>
                 <w:sz w:val="18"/>
+                <w:lang w:val="en-GB"/>
               </w:rPr>
               <w:t>cd frontend</w:t>
             </w:r>
@@ -20389,6 +20933,9 @@
             <w:pPr>
               <w:pStyle w:val="Tokio"/>
               <w:spacing w:after="0" w:line="240" w:lineRule="auto"/>
+              <w:rPr>
+                <w:lang w:val="en-GB"/>
+              </w:rPr>
             </w:pPr>
             <w:r>
               <w:rPr>
@@ -20396,6 +20943,7 @@
                 <w:noProof/>
                 <w:color w:val="1E293B"/>
                 <w:sz w:val="18"/>
+                <w:lang w:val="en-GB"/>
               </w:rPr>
               <w:t>npm ci</w:t>
             </w:r>
@@ -20404,6 +20952,9 @@
             <w:pPr>
               <w:pStyle w:val="Tokio"/>
               <w:spacing w:after="0" w:line="240" w:lineRule="auto"/>
+              <w:rPr>
+                <w:lang w:val="en-GB"/>
+              </w:rPr>
             </w:pPr>
             <w:r>
               <w:rPr>
@@ -20411,6 +20962,7 @@
                 <w:noProof/>
                 <w:color w:val="1E293B"/>
                 <w:sz w:val="18"/>
+                <w:lang w:val="en-GB"/>
               </w:rPr>
               <w:t>npm start</w:t>
             </w:r>
@@ -20422,6 +20974,9 @@
       <w:pPr>
         <w:pStyle w:val="Tokio"/>
         <w:spacing w:after="40"/>
+        <w:rPr>
+          <w:lang w:val="en-GB"/>
+        </w:rPr>
       </w:pPr>
     </w:p>
     <w:p>
@@ -20430,7 +20985,11 @@
         <w:jc w:val="both"/>
       </w:pPr>
       <w:r>
-        <w:t xml:space="preserve">Se abre http://localhost:4200 y se entra con uno de los usuarios de prueba (contraseña </w:t>
+        <w:t>Se abre http://localhost:4200 y se entra con uno de los usuarios de prueba (</w:t>
+      </w:r>
+      <w:proofErr w:type="gramStart"/>
+      <w:r>
+        <w:t xml:space="preserve">contraseña </w:t>
       </w:r>
       <w:r>
         <w:rPr>
@@ -20441,6 +21000,7 @@
         </w:rPr>
         <w:t>Tirme2026!</w:t>
       </w:r>
+      <w:proofErr w:type="gramEnd"/>
       <w:r>
         <w:t xml:space="preserve">), por ejemplo </w:t>
       </w:r>
@@ -20580,36 +21140,69 @@
             <w:pPr>
               <w:pStyle w:val="Tokio"/>
               <w:spacing w:after="0" w:line="252" w:lineRule="auto"/>
-            </w:pPr>
-            <w:r>
-              <w:rPr>
-                <w:sz w:val="19"/>
-              </w:rPr>
-              <w:t xml:space="preserve">docker </w:t>
+              <w:rPr>
+                <w:lang w:val="en-GB"/>
+              </w:rPr>
+            </w:pPr>
+            <w:proofErr w:type="gramStart"/>
+            <w:r>
+              <w:rPr>
+                <w:sz w:val="19"/>
+                <w:lang w:val="en-GB"/>
+              </w:rPr>
+              <w:t>docker</w:t>
+            </w:r>
+            <w:proofErr w:type="gramEnd"/>
+            <w:r>
+              <w:rPr>
+                <w:sz w:val="19"/>
+                <w:lang w:val="en-GB"/>
+              </w:rPr>
+              <w:t xml:space="preserve"> </w:t>
             </w:r>
             <w:r>
               <w:rPr>
                 <w:noProof/>
                 <w:sz w:val="19"/>
+                <w:lang w:val="en-GB"/>
               </w:rPr>
               <w:t>compose</w:t>
             </w:r>
             <w:r>
               <w:rPr>
                 <w:sz w:val="19"/>
-              </w:rPr>
-              <w:t xml:space="preserve"> down -v, después docker </w:t>
+                <w:lang w:val="en-GB"/>
+              </w:rPr>
+              <w:t xml:space="preserve"> down -v, </w:t>
+            </w:r>
+            <w:proofErr w:type="spellStart"/>
+            <w:r>
+              <w:rPr>
+                <w:sz w:val="19"/>
+                <w:lang w:val="en-GB"/>
+              </w:rPr>
+              <w:t>después</w:t>
+            </w:r>
+            <w:proofErr w:type="spellEnd"/>
+            <w:r>
+              <w:rPr>
+                <w:sz w:val="19"/>
+                <w:lang w:val="en-GB"/>
+              </w:rPr>
+              <w:t xml:space="preserve"> docker </w:t>
             </w:r>
             <w:r>
               <w:rPr>
                 <w:noProof/>
                 <w:sz w:val="19"/>
+                <w:lang w:val="en-GB"/>
               </w:rPr>
               <w:t>compose</w:t>
             </w:r>
             <w:r>
               <w:rPr>
                 <w:sz w:val="19"/>
+                <w:lang w:val="en-GB"/>
               </w:rPr>
               <w:t xml:space="preserve"> up -d y python seed.py</w:t>
             </w:r>
@@ -20630,12 +21223,48 @@
             <w:pPr>
               <w:pStyle w:val="Tokio"/>
               <w:spacing w:after="0" w:line="252" w:lineRule="auto"/>
-            </w:pPr>
-            <w:r>
-              <w:rPr>
-                <w:sz w:val="19"/>
-              </w:rPr>
-              <w:t>«port is already allocated» al arrancar Docker</w:t>
+              <w:rPr>
+                <w:lang w:val="en-GB"/>
+              </w:rPr>
+            </w:pPr>
+            <w:r>
+              <w:rPr>
+                <w:sz w:val="19"/>
+                <w:lang w:val="en-GB"/>
+              </w:rPr>
+              <w:t>«</w:t>
+            </w:r>
+            <w:proofErr w:type="gramStart"/>
+            <w:r>
+              <w:rPr>
+                <w:sz w:val="19"/>
+                <w:lang w:val="en-GB"/>
+              </w:rPr>
+              <w:t>port</w:t>
+            </w:r>
+            <w:proofErr w:type="gramEnd"/>
+            <w:r>
+              <w:rPr>
+                <w:sz w:val="19"/>
+                <w:lang w:val="en-GB"/>
+              </w:rPr>
+              <w:t xml:space="preserve"> is already allocated» al </w:t>
+            </w:r>
+            <w:proofErr w:type="spellStart"/>
+            <w:r>
+              <w:rPr>
+                <w:sz w:val="19"/>
+                <w:lang w:val="en-GB"/>
+              </w:rPr>
+              <w:t>arrancar</w:t>
+            </w:r>
+            <w:proofErr w:type="spellEnd"/>
+            <w:r>
+              <w:rPr>
+                <w:sz w:val="19"/>
+                <w:lang w:val="en-GB"/>
+              </w:rPr>
+              <w:t xml:space="preserve"> Docker</w:t>
             </w:r>
           </w:p>
         </w:tc>
@@ -20666,7 +21295,29 @@
               <w:rPr>
                 <w:sz w:val="19"/>
               </w:rPr>
-              <w:t xml:space="preserve"> en los dos .env.</w:t>
+              <w:t xml:space="preserve"> en los </w:t>
+            </w:r>
+            <w:proofErr w:type="gramStart"/>
+            <w:r>
+              <w:rPr>
+                <w:sz w:val="19"/>
+              </w:rPr>
+              <w:t>dos .</w:t>
+            </w:r>
+            <w:proofErr w:type="spellStart"/>
+            <w:r>
+              <w:rPr>
+                <w:sz w:val="19"/>
+              </w:rPr>
+              <w:t>env</w:t>
+            </w:r>
+            <w:proofErr w:type="spellEnd"/>
+            <w:proofErr w:type="gramEnd"/>
+            <w:r>
+              <w:rPr>
+                <w:sz w:val="19"/>
+              </w:rPr>
+              <w:t>.</w:t>
             </w:r>
           </w:p>
         </w:tc>
@@ -20684,17 +21335,22 @@
             <w:pPr>
               <w:pStyle w:val="Tokio"/>
               <w:spacing w:after="0" w:line="252" w:lineRule="auto"/>
+              <w:rPr>
+                <w:lang w:val="en-GB"/>
+              </w:rPr>
             </w:pPr>
             <w:r>
               <w:rPr>
                 <w:noProof/>
                 <w:sz w:val="19"/>
+                <w:lang w:val="en-GB"/>
               </w:rPr>
               <w:t>Flask</w:t>
             </w:r>
             <w:r>
               <w:rPr>
                 <w:sz w:val="19"/>
+                <w:lang w:val="en-GB"/>
               </w:rPr>
               <w:t>: «Access denied for user»</w:t>
             </w:r>
@@ -20713,7 +21369,29 @@
               <w:rPr>
                 <w:sz w:val="19"/>
               </w:rPr>
-              <w:t>Las credenciales de los dos .env no coinciden (o se cambiaron tras crear el volumen: recrearlo).</w:t>
+              <w:t xml:space="preserve">Las credenciales de los </w:t>
+            </w:r>
+            <w:proofErr w:type="gramStart"/>
+            <w:r>
+              <w:rPr>
+                <w:sz w:val="19"/>
+              </w:rPr>
+              <w:t>dos .</w:t>
+            </w:r>
+            <w:proofErr w:type="spellStart"/>
+            <w:r>
+              <w:rPr>
+                <w:sz w:val="19"/>
+              </w:rPr>
+              <w:t>env</w:t>
+            </w:r>
+            <w:proofErr w:type="spellEnd"/>
+            <w:proofErr w:type="gramEnd"/>
+            <w:r>
+              <w:rPr>
+                <w:sz w:val="19"/>
+              </w:rPr>
+              <w:t xml:space="preserve"> no coinciden (o se cambiaron tras crear el volumen: recrearlo).</w:t>
             </w:r>
           </w:p>
         </w:tc>
@@ -20755,7 +21433,21 @@
               <w:rPr>
                 <w:sz w:val="19"/>
               </w:rPr>
-              <w:t>Falta ejecutar python seed.py.</w:t>
+              <w:t xml:space="preserve">Falta ejecutar </w:t>
+            </w:r>
+            <w:proofErr w:type="spellStart"/>
+            <w:r>
+              <w:rPr>
+                <w:sz w:val="19"/>
+              </w:rPr>
+              <w:t>python</w:t>
+            </w:r>
+            <w:proofErr w:type="spellEnd"/>
+            <w:r>
+              <w:rPr>
+                <w:sz w:val="19"/>
+              </w:rPr>
+              <w:t xml:space="preserve"> seed.py.</w:t>
             </w:r>
           </w:p>
         </w:tc>
@@ -20798,7 +21490,21 @@
               <w:rPr>
                 <w:sz w:val="19"/>
               </w:rPr>
-              <w:t xml:space="preserve"> «skipped»</w:t>
+              <w:t xml:space="preserve"> «</w:t>
+            </w:r>
+            <w:proofErr w:type="spellStart"/>
+            <w:r>
+              <w:rPr>
+                <w:sz w:val="19"/>
+              </w:rPr>
+              <w:t>skipped</w:t>
+            </w:r>
+            <w:proofErr w:type="spellEnd"/>
+            <w:r>
+              <w:rPr>
+                <w:sz w:val="19"/>
+              </w:rPr>
+              <w:t>»</w:t>
             </w:r>
           </w:p>
         </w:tc>
@@ -20877,7 +21583,21 @@
               <w:rPr>
                 <w:sz w:val="19"/>
               </w:rPr>
-              <w:t>Recargar sin caché (Ctrl + F5).</w:t>
+              <w:t>Recargar sin caché (</w:t>
+            </w:r>
+            <w:proofErr w:type="spellStart"/>
+            <w:r>
+              <w:rPr>
+                <w:sz w:val="19"/>
+              </w:rPr>
+              <w:t>Ctrl</w:t>
+            </w:r>
+            <w:proofErr w:type="spellEnd"/>
+            <w:r>
+              <w:rPr>
+                <w:sz w:val="19"/>
+              </w:rPr>
+              <w:t xml:space="preserve"> + F5).</w:t>
             </w:r>
           </w:p>
         </w:tc>
@@ -20913,11 +21633,19 @@
               <w:pStyle w:val="Tokio"/>
               <w:spacing w:after="0" w:line="252" w:lineRule="auto"/>
             </w:pPr>
-            <w:r>
-              <w:rPr>
-                <w:sz w:val="19"/>
-              </w:rPr>
-              <w:t xml:space="preserve">python </w:t>
+            <w:proofErr w:type="spellStart"/>
+            <w:r>
+              <w:rPr>
+                <w:sz w:val="19"/>
+              </w:rPr>
+              <w:t>python</w:t>
+            </w:r>
+            <w:proofErr w:type="spellEnd"/>
+            <w:r>
+              <w:rPr>
+                <w:sz w:val="19"/>
+              </w:rPr>
+              <w:t xml:space="preserve"> </w:t>
             </w:r>
             <w:r>
               <w:rPr>
@@ -20961,6 +21689,7 @@
       </w:pPr>
       <w:bookmarkStart w:id="91" w:name="_Toc242210687"/>
       <w:r>
+        <w:lastRenderedPageBreak/>
         <w:t>7. METODOLOGÍA Y HERRAMIENTAS</w:t>
       </w:r>
       <w:bookmarkEnd w:id="91"/>
@@ -21008,7 +21737,15 @@
         <w:t>tests</w:t>
       </w:r>
       <w:r>
-        <w:t xml:space="preserve"> en verde, una prueba de la aplicación en el navegador y un commit en Git.</w:t>
+        <w:t xml:space="preserve"> en verde, una prueba de la aplicación en el navegador y un </w:t>
+      </w:r>
+      <w:proofErr w:type="spellStart"/>
+      <w:r>
+        <w:t>commit</w:t>
+      </w:r>
+      <w:proofErr w:type="spellEnd"/>
+      <w:r>
+        <w:t xml:space="preserve"> en Git.</w:t>
       </w:r>
     </w:p>
     <w:p>
@@ -21046,7 +21783,15 @@
         <w:t>tests</w:t>
       </w:r>
       <w:r>
-        <w:t>, ejecutar comprobaciones y redactar documentación. Lo declaro aquí de forma expresa, igual que se declararía cualquier otra herramienta del stack.</w:t>
+        <w:t xml:space="preserve">, ejecutar comprobaciones y redactar documentación. Lo declaro aquí de forma expresa, igual que se declararía cualquier otra herramienta del </w:t>
+      </w:r>
+      <w:proofErr w:type="spellStart"/>
+      <w:r>
+        <w:t>stack</w:t>
+      </w:r>
+      <w:proofErr w:type="spellEnd"/>
+      <w:r>
+        <w:t>.</w:t>
       </w:r>
     </w:p>
     <w:p>
@@ -21175,6 +21920,7 @@
       </w:pPr>
       <w:bookmarkStart w:id="94" w:name="_Toc242210690"/>
       <w:r>
+        <w:lastRenderedPageBreak/>
         <w:t>7.3 Herramientas</w:t>
       </w:r>
       <w:bookmarkEnd w:id="94"/>
@@ -21527,6 +22273,7 @@
               </w:rPr>
               <w:t>Diagrama del modelo de datos (</w:t>
             </w:r>
+            <w:proofErr w:type="spellStart"/>
             <w:r>
               <w:rPr>
                 <w:noProof/>
@@ -21534,12 +22281,14 @@
               </w:rPr>
               <w:t>docs</w:t>
             </w:r>
+            <w:proofErr w:type="spellEnd"/>
             <w:r>
               <w:rPr>
                 <w:sz w:val="19"/>
               </w:rPr>
               <w:t>/</w:t>
             </w:r>
+            <w:proofErr w:type="spellStart"/>
             <w:r>
               <w:rPr>
                 <w:noProof/>
@@ -21547,6 +22296,7 @@
               </w:rPr>
               <w:t>modelo_datos.drawio</w:t>
             </w:r>
+            <w:proofErr w:type="spellEnd"/>
             <w:r>
               <w:rPr>
                 <w:sz w:val="19"/>
@@ -21609,6 +22359,7 @@
       </w:pPr>
       <w:bookmarkStart w:id="95" w:name="_Toc242210691"/>
       <w:r>
+        <w:lastRenderedPageBreak/>
         <w:t>8. CONCLUSIONES</w:t>
       </w:r>
       <w:bookmarkEnd w:id="95"/>
@@ -21629,7 +22380,15 @@
         <w:jc w:val="both"/>
       </w:pPr>
       <w:r>
-        <w:t>El proyecto cumple los requisitos mínimos del curso (base de datos, programación orientada a objetos, uso de un framework, login y control de accesos, y documentación) y la mayor parte de la propuesta aprobada. El resultado es una aplicación que funciona sobre el esquema real de la empresa sin modificarlo, que separa lo que ve cada perfil en el servidor y que permite a cualquier empleado registrar su parte con controles que antes no existían.</w:t>
+        <w:t xml:space="preserve">El proyecto cumple los requisitos mínimos del curso (base de datos, programación orientada a objetos, uso de un </w:t>
+      </w:r>
+      <w:proofErr w:type="spellStart"/>
+      <w:r>
+        <w:t>framework</w:t>
+      </w:r>
+      <w:proofErr w:type="spellEnd"/>
+      <w:r>
+        <w:t>, login y control de accesos, y documentación) y la mayor parte de la propuesta aprobada. El resultado es una aplicación que funciona sobre el esquema real de la empresa sin modificarlo, que separa lo que ve cada perfil en el servidor y que permite a cualquier empleado registrar su parte con controles que antes no existían.</w:t>
       </w:r>
     </w:p>
     <w:p>
@@ -21882,6 +22641,7 @@
         <w:jc w:val="both"/>
       </w:pPr>
       <w:r>
+        <w:lastRenderedPageBreak/>
         <w:t>Diferencias entre entornos (puerto ocupado por un contenedor antiguo, finales de línea de Windows en scripts de Linux), resueltas y documentadas en el manual.</w:t>
       </w:r>
     </w:p>
@@ -21891,6 +22651,7 @@
       </w:pPr>
       <w:bookmarkStart w:id="99" w:name="_Toc242210695"/>
       <w:r>
+        <w:lastRenderedPageBreak/>
         <w:t>9. EVOLUTIVOS DEL PROYECTO</w:t>
       </w:r>
       <w:bookmarkEnd w:id="99"/>
@@ -21901,7 +22662,15 @@
         <w:jc w:val="both"/>
       </w:pPr>
       <w:r>
-        <w:t>La versión entregada cubre la consulta del cuadro de mando y el registro del parte. A continuación se describen las mejoras previstas para futuras versiones, agrupadas por tipo y con la prioridad que les asignaría en una siguiente iteración.</w:t>
+        <w:t xml:space="preserve">La versión entregada cubre la consulta del cuadro de mando y el registro del parte. A </w:t>
+      </w:r>
+      <w:proofErr w:type="gramStart"/>
+      <w:r>
+        <w:t>continuación</w:t>
+      </w:r>
+      <w:proofErr w:type="gramEnd"/>
+      <w:r>
+        <w:t xml:space="preserve"> se describen las mejoras previstas para futuras versiones, agrupadas por tipo y con la prioridad que les asignaría en una siguiente iteración.</w:t>
       </w:r>
     </w:p>
     <w:p>
@@ -22240,6 +23009,7 @@
               <w:rPr>
                 <w:sz w:val="19"/>
               </w:rPr>
+              <w:lastRenderedPageBreak/>
               <w:t>Despliegue en producción</w:t>
             </w:r>
           </w:p>
@@ -22260,6 +23030,7 @@
               </w:rPr>
               <w:t>Servidor WSGI (</w:t>
             </w:r>
+            <w:proofErr w:type="spellStart"/>
             <w:r>
               <w:rPr>
                 <w:noProof/>
@@ -22267,6 +23038,7 @@
               </w:rPr>
               <w:t>waitress</w:t>
             </w:r>
+            <w:proofErr w:type="spellEnd"/>
             <w:r>
               <w:rPr>
                 <w:sz w:val="19"/>
@@ -22368,7 +23140,35 @@
               <w:rPr>
                 <w:sz w:val="19"/>
               </w:rPr>
-              <w:t xml:space="preserve"> en cada commit (por ejemplo, con GitHub Actions y un servicio de </w:t>
+              <w:t xml:space="preserve"> en cada </w:t>
+            </w:r>
+            <w:proofErr w:type="spellStart"/>
+            <w:r>
+              <w:rPr>
+                <w:sz w:val="19"/>
+              </w:rPr>
+              <w:t>commit</w:t>
+            </w:r>
+            <w:proofErr w:type="spellEnd"/>
+            <w:r>
+              <w:rPr>
+                <w:sz w:val="19"/>
+              </w:rPr>
+              <w:t xml:space="preserve"> (por ejemplo, con GitHub </w:t>
+            </w:r>
+            <w:proofErr w:type="spellStart"/>
+            <w:r>
+              <w:rPr>
+                <w:sz w:val="19"/>
+              </w:rPr>
+              <w:t>Actions</w:t>
+            </w:r>
+            <w:proofErr w:type="spellEnd"/>
+            <w:r>
+              <w:rPr>
+                <w:sz w:val="19"/>
+              </w:rPr>
+              <w:t xml:space="preserve"> y un servicio de </w:t>
             </w:r>
             <w:r>
               <w:rPr>

</xml_diff>